<commit_message>
fix(report): color week 2 charts and use full student labels
</commit_message>
<xml_diff>
--- a/tuan_2/docs/Bao_cao_tuan_2_Dien_toan_dam_may_Nhom_05.docx
+++ b/tuan_2/docs/Bao_cao_tuan_2_Dien_toan_dam_may_Nhom_05.docx
@@ -553,7 +553,7 @@
         </w:rPr>
         <w:fldChar w:fldCharType="separate"/>
       </w:r>
-      <w:hyperlink w:anchor="_Toc242867452" w:history="1">
+      <w:hyperlink w:anchor="_Toc242869423" w:history="1">
         <w:r>
           <w:rPr>
             <w:rStyle w:val="Hyperlink"/>
@@ -580,7 +580,7 @@
             <w:noProof/>
             <w:webHidden/>
           </w:rPr>
-          <w:instrText xml:space="preserve"> PAGEREF _Toc242867452 \h </w:instrText>
+          <w:instrText xml:space="preserve"> PAGEREF _Toc242869423 \h </w:instrText>
         </w:r>
         <w:r>
           <w:rPr>
@@ -627,7 +627,7 @@
           <w14:ligatures w14:val="standardContextual"/>
         </w:rPr>
       </w:pPr>
-      <w:hyperlink w:anchor="_Toc242867453" w:history="1">
+      <w:hyperlink w:anchor="_Toc242869424" w:history="1">
         <w:r>
           <w:rPr>
             <w:rStyle w:val="Hyperlink"/>
@@ -654,7 +654,7 @@
             <w:noProof/>
             <w:webHidden/>
           </w:rPr>
-          <w:instrText xml:space="preserve"> PAGEREF _Toc242867453 \h </w:instrText>
+          <w:instrText xml:space="preserve"> PAGEREF _Toc242869424 \h </w:instrText>
         </w:r>
         <w:r>
           <w:rPr>
@@ -701,7 +701,7 @@
           <w14:ligatures w14:val="standardContextual"/>
         </w:rPr>
       </w:pPr>
-      <w:hyperlink w:anchor="_Toc242867454" w:history="1">
+      <w:hyperlink w:anchor="_Toc242869425" w:history="1">
         <w:r>
           <w:rPr>
             <w:rStyle w:val="Hyperlink"/>
@@ -728,7 +728,7 @@
             <w:noProof/>
             <w:webHidden/>
           </w:rPr>
-          <w:instrText xml:space="preserve"> PAGEREF _Toc242867454 \h </w:instrText>
+          <w:instrText xml:space="preserve"> PAGEREF _Toc242869425 \h </w:instrText>
         </w:r>
         <w:r>
           <w:rPr>
@@ -775,7 +775,7 @@
           <w14:ligatures w14:val="standardContextual"/>
         </w:rPr>
       </w:pPr>
-      <w:hyperlink w:anchor="_Toc242867455" w:history="1">
+      <w:hyperlink w:anchor="_Toc242869426" w:history="1">
         <w:r>
           <w:rPr>
             <w:rStyle w:val="Hyperlink"/>
@@ -802,7 +802,7 @@
             <w:noProof/>
             <w:webHidden/>
           </w:rPr>
-          <w:instrText xml:space="preserve"> PAGEREF _Toc242867455 \h </w:instrText>
+          <w:instrText xml:space="preserve"> PAGEREF _Toc242869426 \h </w:instrText>
         </w:r>
         <w:r>
           <w:rPr>
@@ -849,7 +849,7 @@
           <w14:ligatures w14:val="standardContextual"/>
         </w:rPr>
       </w:pPr>
-      <w:hyperlink w:anchor="_Toc242867456" w:history="1">
+      <w:hyperlink w:anchor="_Toc242869427" w:history="1">
         <w:r>
           <w:rPr>
             <w:rStyle w:val="Hyperlink"/>
@@ -876,7 +876,7 @@
             <w:noProof/>
             <w:webHidden/>
           </w:rPr>
-          <w:instrText xml:space="preserve"> PAGEREF _Toc242867456 \h </w:instrText>
+          <w:instrText xml:space="preserve"> PAGEREF _Toc242869427 \h </w:instrText>
         </w:r>
         <w:r>
           <w:rPr>
@@ -924,7 +924,7 @@
           <w14:ligatures w14:val="standardContextual"/>
         </w:rPr>
       </w:pPr>
-      <w:hyperlink w:anchor="_Toc242867457" w:history="1">
+      <w:hyperlink w:anchor="_Toc242869428" w:history="1">
         <w:r>
           <w:rPr>
             <w:rStyle w:val="Hyperlink"/>
@@ -951,7 +951,7 @@
             <w:noProof/>
             <w:webHidden/>
           </w:rPr>
-          <w:instrText xml:space="preserve"> PAGEREF _Toc242867457 \h </w:instrText>
+          <w:instrText xml:space="preserve"> PAGEREF _Toc242869428 \h </w:instrText>
         </w:r>
         <w:r>
           <w:rPr>
@@ -998,7 +998,7 @@
           <w14:ligatures w14:val="standardContextual"/>
         </w:rPr>
       </w:pPr>
-      <w:hyperlink w:anchor="_Toc242867458" w:history="1">
+      <w:hyperlink w:anchor="_Toc242869429" w:history="1">
         <w:r>
           <w:rPr>
             <w:rStyle w:val="Hyperlink"/>
@@ -1025,7 +1025,7 @@
             <w:noProof/>
             <w:webHidden/>
           </w:rPr>
-          <w:instrText xml:space="preserve"> PAGEREF _Toc242867458 \h </w:instrText>
+          <w:instrText xml:space="preserve"> PAGEREF _Toc242869429 \h </w:instrText>
         </w:r>
         <w:r>
           <w:rPr>
@@ -1072,7 +1072,7 @@
           <w14:ligatures w14:val="standardContextual"/>
         </w:rPr>
       </w:pPr>
-      <w:hyperlink w:anchor="_Toc242867459" w:history="1">
+      <w:hyperlink w:anchor="_Toc242869430" w:history="1">
         <w:r>
           <w:rPr>
             <w:rStyle w:val="Hyperlink"/>
@@ -1099,7 +1099,7 @@
             <w:noProof/>
             <w:webHidden/>
           </w:rPr>
-          <w:instrText xml:space="preserve"> PAGEREF _Toc242867459 \h </w:instrText>
+          <w:instrText xml:space="preserve"> PAGEREF _Toc242869430 \h </w:instrText>
         </w:r>
         <w:r>
           <w:rPr>
@@ -1146,7 +1146,7 @@
           <w14:ligatures w14:val="standardContextual"/>
         </w:rPr>
       </w:pPr>
-      <w:hyperlink w:anchor="_Toc242867460" w:history="1">
+      <w:hyperlink w:anchor="_Toc242869431" w:history="1">
         <w:r>
           <w:rPr>
             <w:rStyle w:val="Hyperlink"/>
@@ -1173,7 +1173,7 @@
             <w:noProof/>
             <w:webHidden/>
           </w:rPr>
-          <w:instrText xml:space="preserve"> PAGEREF _Toc242867460 \h </w:instrText>
+          <w:instrText xml:space="preserve"> PAGEREF _Toc242869431 \h </w:instrText>
         </w:r>
         <w:r>
           <w:rPr>
@@ -1220,7 +1220,7 @@
           <w14:ligatures w14:val="standardContextual"/>
         </w:rPr>
       </w:pPr>
-      <w:hyperlink w:anchor="_Toc242867461" w:history="1">
+      <w:hyperlink w:anchor="_Toc242869432" w:history="1">
         <w:r>
           <w:rPr>
             <w:rStyle w:val="Hyperlink"/>
@@ -1247,7 +1247,7 @@
             <w:noProof/>
             <w:webHidden/>
           </w:rPr>
-          <w:instrText xml:space="preserve"> PAGEREF _Toc242867461 \h </w:instrText>
+          <w:instrText xml:space="preserve"> PAGEREF _Toc242869432 \h </w:instrText>
         </w:r>
         <w:r>
           <w:rPr>
@@ -1294,7 +1294,7 @@
           <w14:ligatures w14:val="standardContextual"/>
         </w:rPr>
       </w:pPr>
-      <w:hyperlink w:anchor="_Toc242867462" w:history="1">
+      <w:hyperlink w:anchor="_Toc242869433" w:history="1">
         <w:r>
           <w:rPr>
             <w:rStyle w:val="Hyperlink"/>
@@ -1321,7 +1321,7 @@
             <w:noProof/>
             <w:webHidden/>
           </w:rPr>
-          <w:instrText xml:space="preserve"> PAGEREF _Toc242867462 \h </w:instrText>
+          <w:instrText xml:space="preserve"> PAGEREF _Toc242869433 \h </w:instrText>
         </w:r>
         <w:r>
           <w:rPr>
@@ -1368,7 +1368,7 @@
           <w14:ligatures w14:val="standardContextual"/>
         </w:rPr>
       </w:pPr>
-      <w:hyperlink w:anchor="_Toc242867463" w:history="1">
+      <w:hyperlink w:anchor="_Toc242869434" w:history="1">
         <w:r>
           <w:rPr>
             <w:rStyle w:val="Hyperlink"/>
@@ -1395,7 +1395,7 @@
             <w:noProof/>
             <w:webHidden/>
           </w:rPr>
-          <w:instrText xml:space="preserve"> PAGEREF _Toc242867463 \h </w:instrText>
+          <w:instrText xml:space="preserve"> PAGEREF _Toc242869434 \h </w:instrText>
         </w:r>
         <w:r>
           <w:rPr>
@@ -1442,7 +1442,7 @@
           <w14:ligatures w14:val="standardContextual"/>
         </w:rPr>
       </w:pPr>
-      <w:hyperlink w:anchor="_Toc242867464" w:history="1">
+      <w:hyperlink w:anchor="_Toc242869435" w:history="1">
         <w:r>
           <w:rPr>
             <w:rStyle w:val="Hyperlink"/>
@@ -1469,7 +1469,7 @@
             <w:noProof/>
             <w:webHidden/>
           </w:rPr>
-          <w:instrText xml:space="preserve"> PAGEREF _Toc242867464 \h </w:instrText>
+          <w:instrText xml:space="preserve"> PAGEREF _Toc242869435 \h </w:instrText>
         </w:r>
         <w:r>
           <w:rPr>
@@ -1517,7 +1517,7 @@
           <w14:ligatures w14:val="standardContextual"/>
         </w:rPr>
       </w:pPr>
-      <w:hyperlink w:anchor="_Toc242867465" w:history="1">
+      <w:hyperlink w:anchor="_Toc242869436" w:history="1">
         <w:r>
           <w:rPr>
             <w:rStyle w:val="Hyperlink"/>
@@ -1544,7 +1544,7 @@
             <w:noProof/>
             <w:webHidden/>
           </w:rPr>
-          <w:instrText xml:space="preserve"> PAGEREF _Toc242867465 \h </w:instrText>
+          <w:instrText xml:space="preserve"> PAGEREF _Toc242869436 \h </w:instrText>
         </w:r>
         <w:r>
           <w:rPr>
@@ -1591,7 +1591,7 @@
           <w14:ligatures w14:val="standardContextual"/>
         </w:rPr>
       </w:pPr>
-      <w:hyperlink w:anchor="_Toc242867466" w:history="1">
+      <w:hyperlink w:anchor="_Toc242869437" w:history="1">
         <w:r>
           <w:rPr>
             <w:rStyle w:val="Hyperlink"/>
@@ -1618,7 +1618,7 @@
             <w:noProof/>
             <w:webHidden/>
           </w:rPr>
-          <w:instrText xml:space="preserve"> PAGEREF _Toc242867466 \h </w:instrText>
+          <w:instrText xml:space="preserve"> PAGEREF _Toc242869437 \h </w:instrText>
         </w:r>
         <w:r>
           <w:rPr>
@@ -1665,7 +1665,7 @@
           <w14:ligatures w14:val="standardContextual"/>
         </w:rPr>
       </w:pPr>
-      <w:hyperlink w:anchor="_Toc242867467" w:history="1">
+      <w:hyperlink w:anchor="_Toc242869438" w:history="1">
         <w:r>
           <w:rPr>
             <w:rStyle w:val="Hyperlink"/>
@@ -1692,7 +1692,7 @@
             <w:noProof/>
             <w:webHidden/>
           </w:rPr>
-          <w:instrText xml:space="preserve"> PAGEREF _Toc242867467 \h </w:instrText>
+          <w:instrText xml:space="preserve"> PAGEREF _Toc242869438 \h </w:instrText>
         </w:r>
         <w:r>
           <w:rPr>
@@ -1739,7 +1739,7 @@
           <w14:ligatures w14:val="standardContextual"/>
         </w:rPr>
       </w:pPr>
-      <w:hyperlink w:anchor="_Toc242867468" w:history="1">
+      <w:hyperlink w:anchor="_Toc242869439" w:history="1">
         <w:r>
           <w:rPr>
             <w:rStyle w:val="Hyperlink"/>
@@ -1766,7 +1766,7 @@
             <w:noProof/>
             <w:webHidden/>
           </w:rPr>
-          <w:instrText xml:space="preserve"> PAGEREF _Toc242867468 \h </w:instrText>
+          <w:instrText xml:space="preserve"> PAGEREF _Toc242869439 \h </w:instrText>
         </w:r>
         <w:r>
           <w:rPr>
@@ -1813,7 +1813,7 @@
           <w14:ligatures w14:val="standardContextual"/>
         </w:rPr>
       </w:pPr>
-      <w:hyperlink w:anchor="_Toc242867469" w:history="1">
+      <w:hyperlink w:anchor="_Toc242869440" w:history="1">
         <w:r>
           <w:rPr>
             <w:rStyle w:val="Hyperlink"/>
@@ -1840,7 +1840,7 @@
             <w:noProof/>
             <w:webHidden/>
           </w:rPr>
-          <w:instrText xml:space="preserve"> PAGEREF _Toc242867469 \h </w:instrText>
+          <w:instrText xml:space="preserve"> PAGEREF _Toc242869440 \h </w:instrText>
         </w:r>
         <w:r>
           <w:rPr>
@@ -1887,7 +1887,7 @@
           <w14:ligatures w14:val="standardContextual"/>
         </w:rPr>
       </w:pPr>
-      <w:hyperlink w:anchor="_Toc242867470" w:history="1">
+      <w:hyperlink w:anchor="_Toc242869441" w:history="1">
         <w:r>
           <w:rPr>
             <w:rStyle w:val="Hyperlink"/>
@@ -1914,7 +1914,7 @@
             <w:noProof/>
             <w:webHidden/>
           </w:rPr>
-          <w:instrText xml:space="preserve"> PAGEREF _Toc242867470 \h </w:instrText>
+          <w:instrText xml:space="preserve"> PAGEREF _Toc242869441 \h </w:instrText>
         </w:r>
         <w:r>
           <w:rPr>
@@ -1961,7 +1961,7 @@
           <w14:ligatures w14:val="standardContextual"/>
         </w:rPr>
       </w:pPr>
-      <w:hyperlink w:anchor="_Toc242867471" w:history="1">
+      <w:hyperlink w:anchor="_Toc242869442" w:history="1">
         <w:r>
           <w:rPr>
             <w:rStyle w:val="Hyperlink"/>
@@ -1988,7 +1988,7 @@
             <w:noProof/>
             <w:webHidden/>
           </w:rPr>
-          <w:instrText xml:space="preserve"> PAGEREF _Toc242867471 \h </w:instrText>
+          <w:instrText xml:space="preserve"> PAGEREF _Toc242869442 \h </w:instrText>
         </w:r>
         <w:r>
           <w:rPr>
@@ -2035,7 +2035,7 @@
           <w14:ligatures w14:val="standardContextual"/>
         </w:rPr>
       </w:pPr>
-      <w:hyperlink w:anchor="_Toc242867472" w:history="1">
+      <w:hyperlink w:anchor="_Toc242869443" w:history="1">
         <w:r>
           <w:rPr>
             <w:rStyle w:val="Hyperlink"/>
@@ -2062,7 +2062,7 @@
             <w:noProof/>
             <w:webHidden/>
           </w:rPr>
-          <w:instrText xml:space="preserve"> PAGEREF _Toc242867472 \h </w:instrText>
+          <w:instrText xml:space="preserve"> PAGEREF _Toc242869443 \h </w:instrText>
         </w:r>
         <w:r>
           <w:rPr>
@@ -2109,7 +2109,7 @@
           <w14:ligatures w14:val="standardContextual"/>
         </w:rPr>
       </w:pPr>
-      <w:hyperlink w:anchor="_Toc242867473" w:history="1">
+      <w:hyperlink w:anchor="_Toc242869444" w:history="1">
         <w:r>
           <w:rPr>
             <w:rStyle w:val="Hyperlink"/>
@@ -2136,7 +2136,7 @@
             <w:noProof/>
             <w:webHidden/>
           </w:rPr>
-          <w:instrText xml:space="preserve"> PAGEREF _Toc242867473 \h </w:instrText>
+          <w:instrText xml:space="preserve"> PAGEREF _Toc242869444 \h </w:instrText>
         </w:r>
         <w:r>
           <w:rPr>
@@ -2183,7 +2183,7 @@
           <w14:ligatures w14:val="standardContextual"/>
         </w:rPr>
       </w:pPr>
-      <w:hyperlink w:anchor="_Toc242867474" w:history="1">
+      <w:hyperlink w:anchor="_Toc242869445" w:history="1">
         <w:r>
           <w:rPr>
             <w:rStyle w:val="Hyperlink"/>
@@ -2210,7 +2210,7 @@
             <w:noProof/>
             <w:webHidden/>
           </w:rPr>
-          <w:instrText xml:space="preserve"> PAGEREF _Toc242867474 \h </w:instrText>
+          <w:instrText xml:space="preserve"> PAGEREF _Toc242869445 \h </w:instrText>
         </w:r>
         <w:r>
           <w:rPr>
@@ -2257,7 +2257,7 @@
           <w14:ligatures w14:val="standardContextual"/>
         </w:rPr>
       </w:pPr>
-      <w:hyperlink w:anchor="_Toc242867475" w:history="1">
+      <w:hyperlink w:anchor="_Toc242869446" w:history="1">
         <w:r>
           <w:rPr>
             <w:rStyle w:val="Hyperlink"/>
@@ -2284,7 +2284,7 @@
             <w:noProof/>
             <w:webHidden/>
           </w:rPr>
-          <w:instrText xml:space="preserve"> PAGEREF _Toc242867475 \h </w:instrText>
+          <w:instrText xml:space="preserve"> PAGEREF _Toc242869446 \h </w:instrText>
         </w:r>
         <w:r>
           <w:rPr>
@@ -2331,7 +2331,7 @@
           <w14:ligatures w14:val="standardContextual"/>
         </w:rPr>
       </w:pPr>
-      <w:hyperlink w:anchor="_Toc242867476" w:history="1">
+      <w:hyperlink w:anchor="_Toc242869447" w:history="1">
         <w:r>
           <w:rPr>
             <w:rStyle w:val="Hyperlink"/>
@@ -2358,7 +2358,7 @@
             <w:noProof/>
             <w:webHidden/>
           </w:rPr>
-          <w:instrText xml:space="preserve"> PAGEREF _Toc242867476 \h </w:instrText>
+          <w:instrText xml:space="preserve"> PAGEREF _Toc242869447 \h </w:instrText>
         </w:r>
         <w:r>
           <w:rPr>
@@ -2405,7 +2405,7 @@
           <w14:ligatures w14:val="standardContextual"/>
         </w:rPr>
       </w:pPr>
-      <w:hyperlink w:anchor="_Toc242867477" w:history="1">
+      <w:hyperlink w:anchor="_Toc242869448" w:history="1">
         <w:r>
           <w:rPr>
             <w:rStyle w:val="Hyperlink"/>
@@ -2432,7 +2432,7 @@
             <w:noProof/>
             <w:webHidden/>
           </w:rPr>
-          <w:instrText xml:space="preserve"> PAGEREF _Toc242867477 \h </w:instrText>
+          <w:instrText xml:space="preserve"> PAGEREF _Toc242869448 \h </w:instrText>
         </w:r>
         <w:r>
           <w:rPr>
@@ -2480,7 +2480,7 @@
           <w14:ligatures w14:val="standardContextual"/>
         </w:rPr>
       </w:pPr>
-      <w:hyperlink w:anchor="_Toc242867478" w:history="1">
+      <w:hyperlink w:anchor="_Toc242869449" w:history="1">
         <w:r>
           <w:rPr>
             <w:rStyle w:val="Hyperlink"/>
@@ -2507,7 +2507,7 @@
             <w:noProof/>
             <w:webHidden/>
           </w:rPr>
-          <w:instrText xml:space="preserve"> PAGEREF _Toc242867478 \h </w:instrText>
+          <w:instrText xml:space="preserve"> PAGEREF _Toc242869449 \h </w:instrText>
         </w:r>
         <w:r>
           <w:rPr>
@@ -2554,7 +2554,7 @@
           <w14:ligatures w14:val="standardContextual"/>
         </w:rPr>
       </w:pPr>
-      <w:hyperlink w:anchor="_Toc242867479" w:history="1">
+      <w:hyperlink w:anchor="_Toc242869450" w:history="1">
         <w:r>
           <w:rPr>
             <w:rStyle w:val="Hyperlink"/>
@@ -2581,7 +2581,7 @@
             <w:noProof/>
             <w:webHidden/>
           </w:rPr>
-          <w:instrText xml:space="preserve"> PAGEREF _Toc242867479 \h </w:instrText>
+          <w:instrText xml:space="preserve"> PAGEREF _Toc242869450 \h </w:instrText>
         </w:r>
         <w:r>
           <w:rPr>
@@ -2628,7 +2628,7 @@
           <w14:ligatures w14:val="standardContextual"/>
         </w:rPr>
       </w:pPr>
-      <w:hyperlink w:anchor="_Toc242867480" w:history="1">
+      <w:hyperlink w:anchor="_Toc242869451" w:history="1">
         <w:r>
           <w:rPr>
             <w:rStyle w:val="Hyperlink"/>
@@ -2655,7 +2655,7 @@
             <w:noProof/>
             <w:webHidden/>
           </w:rPr>
-          <w:instrText xml:space="preserve"> PAGEREF _Toc242867480 \h </w:instrText>
+          <w:instrText xml:space="preserve"> PAGEREF _Toc242869451 \h </w:instrText>
         </w:r>
         <w:r>
           <w:rPr>
@@ -2702,7 +2702,7 @@
           <w14:ligatures w14:val="standardContextual"/>
         </w:rPr>
       </w:pPr>
-      <w:hyperlink w:anchor="_Toc242867481" w:history="1">
+      <w:hyperlink w:anchor="_Toc242869452" w:history="1">
         <w:r>
           <w:rPr>
             <w:rStyle w:val="Hyperlink"/>
@@ -2729,7 +2729,7 @@
             <w:noProof/>
             <w:webHidden/>
           </w:rPr>
-          <w:instrText xml:space="preserve"> PAGEREF _Toc242867481 \h </w:instrText>
+          <w:instrText xml:space="preserve"> PAGEREF _Toc242869452 \h </w:instrText>
         </w:r>
         <w:r>
           <w:rPr>
@@ -2777,7 +2777,7 @@
           <w14:ligatures w14:val="standardContextual"/>
         </w:rPr>
       </w:pPr>
-      <w:hyperlink w:anchor="_Toc242867482" w:history="1">
+      <w:hyperlink w:anchor="_Toc242869453" w:history="1">
         <w:r>
           <w:rPr>
             <w:rStyle w:val="Hyperlink"/>
@@ -2804,7 +2804,7 @@
             <w:noProof/>
             <w:webHidden/>
           </w:rPr>
-          <w:instrText xml:space="preserve"> PAGEREF _Toc242867482 \h </w:instrText>
+          <w:instrText xml:space="preserve"> PAGEREF _Toc242869453 \h </w:instrText>
         </w:r>
         <w:r>
           <w:rPr>
@@ -2851,7 +2851,7 @@
           <w14:ligatures w14:val="standardContextual"/>
         </w:rPr>
       </w:pPr>
-      <w:hyperlink w:anchor="_Toc242867483" w:history="1">
+      <w:hyperlink w:anchor="_Toc242869454" w:history="1">
         <w:r>
           <w:rPr>
             <w:rStyle w:val="Hyperlink"/>
@@ -2878,7 +2878,7 @@
             <w:noProof/>
             <w:webHidden/>
           </w:rPr>
-          <w:instrText xml:space="preserve"> PAGEREF _Toc242867483 \h </w:instrText>
+          <w:instrText xml:space="preserve"> PAGEREF _Toc242869454 \h </w:instrText>
         </w:r>
         <w:r>
           <w:rPr>
@@ -2925,7 +2925,7 @@
           <w14:ligatures w14:val="standardContextual"/>
         </w:rPr>
       </w:pPr>
-      <w:hyperlink w:anchor="_Toc242867484" w:history="1">
+      <w:hyperlink w:anchor="_Toc242869455" w:history="1">
         <w:r>
           <w:rPr>
             <w:rStyle w:val="Hyperlink"/>
@@ -2952,7 +2952,7 @@
             <w:noProof/>
             <w:webHidden/>
           </w:rPr>
-          <w:instrText xml:space="preserve"> PAGEREF _Toc242867484 \h </w:instrText>
+          <w:instrText xml:space="preserve"> PAGEREF _Toc242869455 \h </w:instrText>
         </w:r>
         <w:r>
           <w:rPr>
@@ -2999,7 +2999,7 @@
           <w14:ligatures w14:val="standardContextual"/>
         </w:rPr>
       </w:pPr>
-      <w:hyperlink w:anchor="_Toc242867485" w:history="1">
+      <w:hyperlink w:anchor="_Toc242869456" w:history="1">
         <w:r>
           <w:rPr>
             <w:rStyle w:val="Hyperlink"/>
@@ -3026,7 +3026,7 @@
             <w:noProof/>
             <w:webHidden/>
           </w:rPr>
-          <w:instrText xml:space="preserve"> PAGEREF _Toc242867485 \h </w:instrText>
+          <w:instrText xml:space="preserve"> PAGEREF _Toc242869456 \h </w:instrText>
         </w:r>
         <w:r>
           <w:rPr>
@@ -3073,7 +3073,7 @@
           <w14:ligatures w14:val="standardContextual"/>
         </w:rPr>
       </w:pPr>
-      <w:hyperlink w:anchor="_Toc242867486" w:history="1">
+      <w:hyperlink w:anchor="_Toc242869457" w:history="1">
         <w:r>
           <w:rPr>
             <w:rStyle w:val="Hyperlink"/>
@@ -3100,7 +3100,7 @@
             <w:noProof/>
             <w:webHidden/>
           </w:rPr>
-          <w:instrText xml:space="preserve"> PAGEREF _Toc242867486 \h </w:instrText>
+          <w:instrText xml:space="preserve"> PAGEREF _Toc242869457 \h </w:instrText>
         </w:r>
         <w:r>
           <w:rPr>
@@ -3148,7 +3148,7 @@
           <w14:ligatures w14:val="standardContextual"/>
         </w:rPr>
       </w:pPr>
-      <w:hyperlink w:anchor="_Toc242867487" w:history="1">
+      <w:hyperlink w:anchor="_Toc242869458" w:history="1">
         <w:r>
           <w:rPr>
             <w:rStyle w:val="Hyperlink"/>
@@ -3175,7 +3175,7 @@
             <w:noProof/>
             <w:webHidden/>
           </w:rPr>
-          <w:instrText xml:space="preserve"> PAGEREF _Toc242867487 \h </w:instrText>
+          <w:instrText xml:space="preserve"> PAGEREF _Toc242869458 \h </w:instrText>
         </w:r>
         <w:r>
           <w:rPr>
@@ -3222,7 +3222,7 @@
           <w14:ligatures w14:val="standardContextual"/>
         </w:rPr>
       </w:pPr>
-      <w:hyperlink w:anchor="_Toc242867488" w:history="1">
+      <w:hyperlink w:anchor="_Toc242869459" w:history="1">
         <w:r>
           <w:rPr>
             <w:rStyle w:val="Hyperlink"/>
@@ -3249,7 +3249,7 @@
             <w:noProof/>
             <w:webHidden/>
           </w:rPr>
-          <w:instrText xml:space="preserve"> PAGEREF _Toc242867488 \h </w:instrText>
+          <w:instrText xml:space="preserve"> PAGEREF _Toc242869459 \h </w:instrText>
         </w:r>
         <w:r>
           <w:rPr>
@@ -3296,7 +3296,7 @@
           <w14:ligatures w14:val="standardContextual"/>
         </w:rPr>
       </w:pPr>
-      <w:hyperlink w:anchor="_Toc242867489" w:history="1">
+      <w:hyperlink w:anchor="_Toc242869460" w:history="1">
         <w:r>
           <w:rPr>
             <w:rStyle w:val="Hyperlink"/>
@@ -3323,7 +3323,7 @@
             <w:noProof/>
             <w:webHidden/>
           </w:rPr>
-          <w:instrText xml:space="preserve"> PAGEREF _Toc242867489 \h </w:instrText>
+          <w:instrText xml:space="preserve"> PAGEREF _Toc242869460 \h </w:instrText>
         </w:r>
         <w:r>
           <w:rPr>
@@ -3382,21 +3382,29 @@
         <w:jc w:val="left"/>
       </w:pPr>
       <w:bookmarkStart w:id="0" w:name="_Toc242867452"/>
+      <w:bookmarkStart w:id="1" w:name="_Toc242869263"/>
+      <w:bookmarkStart w:id="2" w:name="_Toc242869423"/>
       <w:r>
         <w:lastRenderedPageBreak/>
         <w:t>Chương 1 Phạm vi và hệ thống thực hành Tuần 2</w:t>
       </w:r>
       <w:bookmarkEnd w:id="0"/>
+      <w:bookmarkEnd w:id="1"/>
+      <w:bookmarkEnd w:id="2"/>
     </w:p>
     <w:p>
       <w:pPr>
         <w:pStyle w:val="Heading2"/>
       </w:pPr>
-      <w:bookmarkStart w:id="1" w:name="_Toc242867453"/>
+      <w:bookmarkStart w:id="3" w:name="_Toc242867453"/>
+      <w:bookmarkStart w:id="4" w:name="_Toc242869264"/>
+      <w:bookmarkStart w:id="5" w:name="_Toc242869424"/>
       <w:r>
         <w:t>1.1 Mục tiêu và phạm vi số liệu</w:t>
       </w:r>
-      <w:bookmarkEnd w:id="1"/>
+      <w:bookmarkEnd w:id="3"/>
+      <w:bookmarkEnd w:id="4"/>
+      <w:bookmarkEnd w:id="5"/>
     </w:p>
     <w:p>
       <w:pPr>
@@ -3420,11 +3428,15 @@
       <w:pPr>
         <w:pStyle w:val="Heading2"/>
       </w:pPr>
-      <w:bookmarkStart w:id="2" w:name="_Toc242867454"/>
+      <w:bookmarkStart w:id="6" w:name="_Toc242867454"/>
+      <w:bookmarkStart w:id="7" w:name="_Toc242869265"/>
+      <w:bookmarkStart w:id="8" w:name="_Toc242869425"/>
       <w:r>
         <w:t>1.2 Phân công và thời gian thực hiện</w:t>
       </w:r>
-      <w:bookmarkEnd w:id="2"/>
+      <w:bookmarkEnd w:id="6"/>
+      <w:bookmarkEnd w:id="7"/>
+      <w:bookmarkEnd w:id="8"/>
     </w:p>
     <w:p>
       <w:pPr>
@@ -3732,12 +3744,16 @@
         <w:pStyle w:val="Heading2"/>
         <w:pageBreakBefore/>
       </w:pPr>
-      <w:bookmarkStart w:id="3" w:name="_Toc242867455"/>
+      <w:bookmarkStart w:id="9" w:name="_Toc242867455"/>
+      <w:bookmarkStart w:id="10" w:name="_Toc242869266"/>
+      <w:bookmarkStart w:id="11" w:name="_Toc242869426"/>
       <w:r>
         <w:lastRenderedPageBreak/>
         <w:t>1.3 Kiến trúc và luồng xử lý</w:t>
       </w:r>
-      <w:bookmarkEnd w:id="3"/>
+      <w:bookmarkEnd w:id="9"/>
+      <w:bookmarkEnd w:id="10"/>
+      <w:bookmarkEnd w:id="11"/>
     </w:p>
     <w:p>
       <w:pPr>
@@ -3810,12 +3826,16 @@
         <w:pStyle w:val="Heading2"/>
         <w:pageBreakBefore/>
       </w:pPr>
-      <w:bookmarkStart w:id="4" w:name="_Toc242867456"/>
+      <w:bookmarkStart w:id="12" w:name="_Toc242867456"/>
+      <w:bookmarkStart w:id="13" w:name="_Toc242869267"/>
+      <w:bookmarkStart w:id="14" w:name="_Toc242869427"/>
       <w:r>
         <w:lastRenderedPageBreak/>
         <w:t>1.4 Trạng thái dịch vụ tại lần đọc hiện tại</w:t>
       </w:r>
-      <w:bookmarkEnd w:id="4"/>
+      <w:bookmarkEnd w:id="12"/>
+      <w:bookmarkEnd w:id="13"/>
+      <w:bookmarkEnd w:id="14"/>
     </w:p>
     <w:p>
       <w:pPr>
@@ -4312,22 +4332,30 @@
         <w:pageBreakBefore/>
         <w:jc w:val="left"/>
       </w:pPr>
-      <w:bookmarkStart w:id="5" w:name="_Toc242867457"/>
+      <w:bookmarkStart w:id="15" w:name="_Toc242867457"/>
+      <w:bookmarkStart w:id="16" w:name="_Toc242869268"/>
+      <w:bookmarkStart w:id="17" w:name="_Toc242869428"/>
       <w:r>
         <w:lastRenderedPageBreak/>
         <w:t>Chương 2 Nguồn dữ liệu và phương pháp phân tích</w:t>
       </w:r>
-      <w:bookmarkEnd w:id="5"/>
+      <w:bookmarkEnd w:id="15"/>
+      <w:bookmarkEnd w:id="16"/>
+      <w:bookmarkEnd w:id="17"/>
     </w:p>
     <w:p>
       <w:pPr>
         <w:pStyle w:val="Heading2"/>
       </w:pPr>
-      <w:bookmarkStart w:id="6" w:name="_Toc242867458"/>
+      <w:bookmarkStart w:id="18" w:name="_Toc242867458"/>
+      <w:bookmarkStart w:id="19" w:name="_Toc242869269"/>
+      <w:bookmarkStart w:id="20" w:name="_Toc242869429"/>
       <w:r>
         <w:t>2.1 Toàn bộ dữ liệu và mẫu thuộc Tuần 2</w:t>
       </w:r>
-      <w:bookmarkEnd w:id="6"/>
+      <w:bookmarkEnd w:id="18"/>
+      <w:bookmarkEnd w:id="19"/>
+      <w:bookmarkEnd w:id="20"/>
     </w:p>
     <w:p>
       <w:pPr>
@@ -4804,12 +4832,16 @@
         <w:pStyle w:val="Heading2"/>
         <w:pageBreakBefore/>
       </w:pPr>
-      <w:bookmarkStart w:id="7" w:name="_Toc242867459"/>
+      <w:bookmarkStart w:id="21" w:name="_Toc242867459"/>
+      <w:bookmarkStart w:id="22" w:name="_Toc242869270"/>
+      <w:bookmarkStart w:id="23" w:name="_Toc242869430"/>
       <w:r>
         <w:lastRenderedPageBreak/>
         <w:t>2.2 Cấu trúc và chất lượng bản ghi</w:t>
       </w:r>
-      <w:bookmarkEnd w:id="7"/>
+      <w:bookmarkEnd w:id="21"/>
+      <w:bookmarkEnd w:id="22"/>
+      <w:bookmarkEnd w:id="23"/>
     </w:p>
     <w:p>
       <w:pPr>
@@ -5229,11 +5261,15 @@
       <w:pPr>
         <w:pStyle w:val="Heading2"/>
       </w:pPr>
-      <w:bookmarkStart w:id="8" w:name="_Toc242867460"/>
+      <w:bookmarkStart w:id="24" w:name="_Toc242867460"/>
+      <w:bookmarkStart w:id="25" w:name="_Toc242869271"/>
+      <w:bookmarkStart w:id="26" w:name="_Toc242869431"/>
       <w:r>
         <w:t>2.3 Trùng dữ liệu và cách so sánh hai tài khoản</w:t>
       </w:r>
-      <w:bookmarkEnd w:id="8"/>
+      <w:bookmarkEnd w:id="24"/>
+      <w:bookmarkEnd w:id="25"/>
+      <w:bookmarkEnd w:id="26"/>
     </w:p>
     <w:p>
       <w:pPr>
@@ -5257,12 +5293,16 @@
       <w:pPr>
         <w:pStyle w:val="Heading2"/>
       </w:pPr>
-      <w:bookmarkStart w:id="9" w:name="_Toc242867461"/>
+      <w:bookmarkStart w:id="27" w:name="_Toc242867461"/>
+      <w:bookmarkStart w:id="28" w:name="_Toc242869272"/>
+      <w:bookmarkStart w:id="29" w:name="_Toc242869432"/>
       <w:r>
         <w:lastRenderedPageBreak/>
         <w:t>2.4 Các đại lượng và cách diễn giải</w:t>
       </w:r>
-      <w:bookmarkEnd w:id="9"/>
+      <w:bookmarkEnd w:id="27"/>
+      <w:bookmarkEnd w:id="28"/>
+      <w:bookmarkEnd w:id="29"/>
     </w:p>
     <w:p>
       <w:pPr>
@@ -5604,12 +5644,16 @@
         <w:pStyle w:val="Heading2"/>
         <w:pageBreakBefore/>
       </w:pPr>
-      <w:bookmarkStart w:id="10" w:name="_Toc242867462"/>
+      <w:bookmarkStart w:id="30" w:name="_Toc242867462"/>
+      <w:bookmarkStart w:id="31" w:name="_Toc242869273"/>
+      <w:bookmarkStart w:id="32" w:name="_Toc242869433"/>
       <w:r>
         <w:lastRenderedPageBreak/>
         <w:t>2.5 Thiết kế chức năng thu thập bằng Lambda</w:t>
       </w:r>
-      <w:bookmarkEnd w:id="10"/>
+      <w:bookmarkEnd w:id="30"/>
+      <w:bookmarkEnd w:id="31"/>
+      <w:bookmarkEnd w:id="32"/>
     </w:p>
     <w:p>
       <w:pPr>
@@ -6050,12 +6094,16 @@
         <w:pStyle w:val="Heading2"/>
         <w:pageBreakBefore/>
       </w:pPr>
-      <w:bookmarkStart w:id="11" w:name="_Toc242867463"/>
+      <w:bookmarkStart w:id="33" w:name="_Toc242867463"/>
+      <w:bookmarkStart w:id="34" w:name="_Toc242869274"/>
+      <w:bookmarkStart w:id="35" w:name="_Toc242869434"/>
       <w:r>
         <w:lastRenderedPageBreak/>
         <w:t>2.6 Lược đồ bản ghi và truy vấn dữ liệu</w:t>
       </w:r>
-      <w:bookmarkEnd w:id="11"/>
+      <w:bookmarkEnd w:id="33"/>
+      <w:bookmarkEnd w:id="34"/>
+      <w:bookmarkEnd w:id="35"/>
     </w:p>
     <w:p>
       <w:pPr>
@@ -7983,12 +8031,16 @@
         <w:pStyle w:val="Heading2"/>
         <w:pageBreakBefore/>
       </w:pPr>
-      <w:bookmarkStart w:id="12" w:name="_Toc242867464"/>
+      <w:bookmarkStart w:id="36" w:name="_Toc242867464"/>
+      <w:bookmarkStart w:id="37" w:name="_Toc242869275"/>
+      <w:bookmarkStart w:id="38" w:name="_Toc242869435"/>
       <w:r>
         <w:lastRenderedPageBreak/>
         <w:t>2.7 Quyền kích hoạt và điều kiện gửi thông báo</w:t>
       </w:r>
-      <w:bookmarkEnd w:id="12"/>
+      <w:bookmarkEnd w:id="36"/>
+      <w:bookmarkEnd w:id="37"/>
+      <w:bookmarkEnd w:id="38"/>
     </w:p>
     <w:p>
       <w:pPr>
@@ -8014,22 +8066,30 @@
         <w:pageBreakBefore/>
         <w:jc w:val="left"/>
       </w:pPr>
-      <w:bookmarkStart w:id="13" w:name="_Toc242867465"/>
+      <w:bookmarkStart w:id="39" w:name="_Toc242867465"/>
+      <w:bookmarkStart w:id="40" w:name="_Toc242869276"/>
+      <w:bookmarkStart w:id="41" w:name="_Toc242869436"/>
       <w:r>
         <w:lastRenderedPageBreak/>
         <w:t>Chương 3 Phân tích dữ liệu môi trường Tuần 2</w:t>
       </w:r>
-      <w:bookmarkEnd w:id="13"/>
+      <w:bookmarkEnd w:id="39"/>
+      <w:bookmarkEnd w:id="40"/>
+      <w:bookmarkEnd w:id="41"/>
     </w:p>
     <w:p>
       <w:pPr>
         <w:pStyle w:val="Heading2"/>
       </w:pPr>
-      <w:bookmarkStart w:id="14" w:name="_Toc242867466"/>
+      <w:bookmarkStart w:id="42" w:name="_Toc242867466"/>
+      <w:bookmarkStart w:id="43" w:name="_Toc242869277"/>
+      <w:bookmarkStart w:id="44" w:name="_Toc242869437"/>
       <w:r>
         <w:t>3.1 So sánh AQI theo đô thị</w:t>
       </w:r>
-      <w:bookmarkEnd w:id="14"/>
+      <w:bookmarkEnd w:id="42"/>
+      <w:bookmarkEnd w:id="43"/>
+      <w:bookmarkEnd w:id="44"/>
     </w:p>
     <w:p>
       <w:pPr>
@@ -9112,12 +9172,16 @@
         <w:pStyle w:val="Heading2"/>
         <w:pageBreakBefore/>
       </w:pPr>
-      <w:bookmarkStart w:id="15" w:name="_Toc242867467"/>
+      <w:bookmarkStart w:id="45" w:name="_Toc242867467"/>
+      <w:bookmarkStart w:id="46" w:name="_Toc242869278"/>
+      <w:bookmarkStart w:id="47" w:name="_Toc242869438"/>
       <w:r>
         <w:lastRenderedPageBreak/>
         <w:t>3.2 Nồng độ PM2.5 và PM10</w:t>
       </w:r>
-      <w:bookmarkEnd w:id="15"/>
+      <w:bookmarkEnd w:id="45"/>
+      <w:bookmarkEnd w:id="46"/>
+      <w:bookmarkEnd w:id="47"/>
     </w:p>
     <w:p>
       <w:pPr>
@@ -10065,12 +10129,16 @@
         <w:pStyle w:val="Heading2"/>
         <w:pageBreakBefore/>
       </w:pPr>
-      <w:bookmarkStart w:id="16" w:name="_Toc242867468"/>
+      <w:bookmarkStart w:id="48" w:name="_Toc242867468"/>
+      <w:bookmarkStart w:id="49" w:name="_Toc242869279"/>
+      <w:bookmarkStart w:id="50" w:name="_Toc242869439"/>
       <w:r>
         <w:lastRenderedPageBreak/>
         <w:t>3.3 Trung vị tứ phân vị và P95</w:t>
       </w:r>
-      <w:bookmarkEnd w:id="16"/>
+      <w:bookmarkEnd w:id="48"/>
+      <w:bookmarkEnd w:id="49"/>
+      <w:bookmarkEnd w:id="50"/>
     </w:p>
     <w:p>
       <w:pPr>
@@ -11094,7 +11162,7 @@
         </w:rPr>
         <w:drawing>
           <wp:inline distT="0" distB="0" distL="0" distR="0" wp14:anchorId="38139C7E" wp14:editId="63675B06">
-            <wp:extent cx="6126480" cy="3370365"/>
+            <wp:extent cx="6126480" cy="3377727"/>
             <wp:effectExtent l="0" t="0" r="0" b="0"/>
             <wp:docPr id="6" name="Picture 6"/>
             <wp:cNvGraphicFramePr>
@@ -11116,7 +11184,7 @@
                   <pic:spPr>
                     <a:xfrm>
                       <a:off x="0" y="0"/>
-                      <a:ext cx="6126480" cy="3370365"/>
+                      <a:ext cx="6126480" cy="3377727"/>
                     </a:xfrm>
                     <a:prstGeom prst="rect">
                       <a:avLst/>
@@ -11153,12 +11221,16 @@
         <w:pStyle w:val="Heading2"/>
         <w:pageBreakBefore/>
       </w:pPr>
-      <w:bookmarkStart w:id="17" w:name="_Toc242867469"/>
+      <w:bookmarkStart w:id="51" w:name="_Toc242867469"/>
+      <w:bookmarkStart w:id="52" w:name="_Toc242869280"/>
+      <w:bookmarkStart w:id="53" w:name="_Toc242869440"/>
       <w:r>
         <w:lastRenderedPageBreak/>
         <w:t>3.4 Diễn biến tại các giờ có quan trắc</w:t>
       </w:r>
-      <w:bookmarkEnd w:id="17"/>
+      <w:bookmarkEnd w:id="51"/>
+      <w:bookmarkEnd w:id="52"/>
+      <w:bookmarkEnd w:id="53"/>
     </w:p>
     <w:p>
       <w:pPr>
@@ -11172,7 +11244,7 @@
         </w:rPr>
         <w:drawing>
           <wp:inline distT="0" distB="0" distL="0" distR="0" wp14:anchorId="0F1BD970" wp14:editId="3A715283">
-            <wp:extent cx="6126480" cy="5250098"/>
+            <wp:extent cx="6126480" cy="5250099"/>
             <wp:effectExtent l="0" t="0" r="0" b="0"/>
             <wp:docPr id="7" name="Picture 7"/>
             <wp:cNvGraphicFramePr>
@@ -11194,7 +11266,7 @@
                   <pic:spPr>
                     <a:xfrm>
                       <a:off x="0" y="0"/>
-                      <a:ext cx="6126480" cy="5250098"/>
+                      <a:ext cx="6126480" cy="5250099"/>
                     </a:xfrm>
                     <a:prstGeom prst="rect">
                       <a:avLst/>
@@ -11982,12 +12054,16 @@
         <w:pStyle w:val="Heading2"/>
         <w:pageBreakBefore/>
       </w:pPr>
-      <w:bookmarkStart w:id="18" w:name="_Toc242867470"/>
+      <w:bookmarkStart w:id="54" w:name="_Toc242867470"/>
+      <w:bookmarkStart w:id="55" w:name="_Toc242869281"/>
+      <w:bookmarkStart w:id="56" w:name="_Toc242869441"/>
       <w:r>
         <w:lastRenderedPageBreak/>
         <w:t>3.5 Độ phủ và mật độ lấy mẫu</w:t>
       </w:r>
-      <w:bookmarkEnd w:id="18"/>
+      <w:bookmarkEnd w:id="54"/>
+      <w:bookmarkEnd w:id="55"/>
+      <w:bookmarkEnd w:id="56"/>
     </w:p>
     <w:p>
       <w:pPr>
@@ -12001,7 +12077,7 @@
         </w:rPr>
         <w:drawing>
           <wp:inline distT="0" distB="0" distL="0" distR="0" wp14:anchorId="2877479B" wp14:editId="0302BAE3">
-            <wp:extent cx="6126480" cy="2955553"/>
+            <wp:extent cx="6126480" cy="3023423"/>
             <wp:effectExtent l="0" t="0" r="0" b="0"/>
             <wp:docPr id="8" name="Picture 8"/>
             <wp:cNvGraphicFramePr>
@@ -12023,7 +12099,7 @@
                   <pic:spPr>
                     <a:xfrm>
                       <a:off x="0" y="0"/>
-                      <a:ext cx="6126480" cy="2955553"/>
+                      <a:ext cx="6126480" cy="3023423"/>
                     </a:xfrm>
                     <a:prstGeom prst="rect">
                       <a:avLst/>
@@ -12069,12 +12145,16 @@
         <w:pStyle w:val="Heading2"/>
         <w:pageBreakBefore/>
       </w:pPr>
-      <w:bookmarkStart w:id="19" w:name="_Toc242867471"/>
+      <w:bookmarkStart w:id="57" w:name="_Toc242867471"/>
+      <w:bookmarkStart w:id="58" w:name="_Toc242869282"/>
+      <w:bookmarkStart w:id="59" w:name="_Toc242869442"/>
       <w:r>
         <w:lastRenderedPageBreak/>
         <w:t>3.6 Phân bố các cấp chất lượng không khí</w:t>
       </w:r>
-      <w:bookmarkEnd w:id="19"/>
+      <w:bookmarkEnd w:id="57"/>
+      <w:bookmarkEnd w:id="58"/>
+      <w:bookmarkEnd w:id="59"/>
     </w:p>
     <w:p>
       <w:pPr>
@@ -12828,7 +12908,7 @@
         </w:rPr>
         <w:drawing>
           <wp:inline distT="0" distB="0" distL="0" distR="0" wp14:anchorId="1AC84513" wp14:editId="100E9CA2">
-            <wp:extent cx="6126480" cy="3407500"/>
+            <wp:extent cx="6126480" cy="3163510"/>
             <wp:effectExtent l="0" t="0" r="0" b="0"/>
             <wp:docPr id="9" name="Picture 9"/>
             <wp:cNvGraphicFramePr>
@@ -12850,7 +12930,7 @@
                   <pic:spPr>
                     <a:xfrm>
                       <a:off x="0" y="0"/>
-                      <a:ext cx="6126480" cy="3407500"/>
+                      <a:ext cx="6126480" cy="3163510"/>
                     </a:xfrm>
                     <a:prstGeom prst="rect">
                       <a:avLst/>
@@ -12887,12 +12967,16 @@
         <w:pStyle w:val="Heading2"/>
         <w:pageBreakBefore/>
       </w:pPr>
-      <w:bookmarkStart w:id="20" w:name="_Toc242867472"/>
+      <w:bookmarkStart w:id="60" w:name="_Toc242867472"/>
+      <w:bookmarkStart w:id="61" w:name="_Toc242869283"/>
+      <w:bookmarkStart w:id="62" w:name="_Toc242869443"/>
       <w:r>
         <w:lastRenderedPageBreak/>
         <w:t>3.7 Tần suất vượt ngưỡng cấu hình cảnh báo</w:t>
       </w:r>
-      <w:bookmarkEnd w:id="20"/>
+      <w:bookmarkEnd w:id="60"/>
+      <w:bookmarkEnd w:id="61"/>
+      <w:bookmarkEnd w:id="62"/>
     </w:p>
     <w:p>
       <w:pPr>
@@ -12906,7 +12990,7 @@
         </w:rPr>
         <w:drawing>
           <wp:inline distT="0" distB="0" distL="0" distR="0" wp14:anchorId="1B9BBC35" wp14:editId="4090106D">
-            <wp:extent cx="6126480" cy="3241985"/>
+            <wp:extent cx="6126480" cy="3241986"/>
             <wp:effectExtent l="0" t="0" r="0" b="0"/>
             <wp:docPr id="10" name="Picture 10"/>
             <wp:cNvGraphicFramePr>
@@ -12928,7 +13012,7 @@
                   <pic:spPr>
                     <a:xfrm>
                       <a:off x="0" y="0"/>
-                      <a:ext cx="6126480" cy="3241985"/>
+                      <a:ext cx="6126480" cy="3241986"/>
                     </a:xfrm>
                     <a:prstGeom prst="rect">
                       <a:avLst/>
@@ -13715,12 +13799,16 @@
         <w:pStyle w:val="Heading2"/>
         <w:pageBreakBefore/>
       </w:pPr>
-      <w:bookmarkStart w:id="21" w:name="_Toc242867473"/>
+      <w:bookmarkStart w:id="63" w:name="_Toc242867473"/>
+      <w:bookmarkStart w:id="64" w:name="_Toc242869284"/>
+      <w:bookmarkStart w:id="65" w:name="_Toc242869444"/>
       <w:r>
         <w:lastRenderedPageBreak/>
         <w:t>3.8 So sánh hai tài khoản tại cùng đô thị và giờ</w:t>
       </w:r>
-      <w:bookmarkEnd w:id="21"/>
+      <w:bookmarkEnd w:id="63"/>
+      <w:bookmarkEnd w:id="64"/>
+      <w:bookmarkEnd w:id="65"/>
     </w:p>
     <w:p>
       <w:pPr>
@@ -13776,7 +13864,7 @@
         <w:jc w:val="center"/>
       </w:pPr>
       <w:r>
-        <w:t>Hình 3.8 Chênh lệch Quyên trừ Sơn sau khi ghép cùng đô thị và giờ</w:t>
+        <w:t>Hình 3.8 Chênh lệch Sinh viên Ngọc Quyên trừ Sinh viên Tiến Sơn</w:t>
       </w:r>
     </w:p>
     <w:p>
@@ -14231,12 +14319,16 @@
         <w:pStyle w:val="Heading2"/>
         <w:pageBreakBefore/>
       </w:pPr>
-      <w:bookmarkStart w:id="22" w:name="_Toc242867474"/>
+      <w:bookmarkStart w:id="66" w:name="_Toc242867474"/>
+      <w:bookmarkStart w:id="67" w:name="_Toc242869285"/>
+      <w:bookmarkStart w:id="68" w:name="_Toc242869445"/>
       <w:r>
         <w:lastRenderedPageBreak/>
         <w:t>3.9 Tương quan Pearson và Spearman</w:t>
       </w:r>
-      <w:bookmarkEnd w:id="22"/>
+      <w:bookmarkEnd w:id="66"/>
+      <w:bookmarkEnd w:id="67"/>
+      <w:bookmarkEnd w:id="68"/>
     </w:p>
     <w:p>
       <w:pPr>
@@ -15125,7 +15217,7 @@
         </w:rPr>
         <w:drawing>
           <wp:inline distT="0" distB="0" distL="0" distR="0" wp14:anchorId="2E488D06" wp14:editId="3056F174">
-            <wp:extent cx="6126480" cy="3493315"/>
+            <wp:extent cx="6126480" cy="3493316"/>
             <wp:effectExtent l="0" t="0" r="0" b="0"/>
             <wp:docPr id="12" name="Picture 12"/>
             <wp:cNvGraphicFramePr>
@@ -15147,7 +15239,7 @@
                   <pic:spPr>
                     <a:xfrm>
                       <a:off x="0" y="0"/>
-                      <a:ext cx="6126480" cy="3493315"/>
+                      <a:ext cx="6126480" cy="3493316"/>
                     </a:xfrm>
                     <a:prstGeom prst="rect">
                       <a:avLst/>
@@ -15193,12 +15285,16 @@
         <w:pStyle w:val="Heading2"/>
         <w:pageBreakBefore/>
       </w:pPr>
-      <w:bookmarkStart w:id="23" w:name="_Toc242867475"/>
+      <w:bookmarkStart w:id="69" w:name="_Toc242867475"/>
+      <w:bookmarkStart w:id="70" w:name="_Toc242869286"/>
+      <w:bookmarkStart w:id="71" w:name="_Toc242869446"/>
       <w:r>
         <w:lastRenderedPageBreak/>
         <w:t>3.10 Quan sát trực tiếp quan hệ nhiệt độ và PM2.5</w:t>
       </w:r>
-      <w:bookmarkEnd w:id="23"/>
+      <w:bookmarkEnd w:id="69"/>
+      <w:bookmarkEnd w:id="70"/>
+      <w:bookmarkEnd w:id="71"/>
     </w:p>
     <w:p>
       <w:pPr>
@@ -15212,7 +15308,7 @@
         </w:rPr>
         <w:drawing>
           <wp:inline distT="0" distB="0" distL="0" distR="0" wp14:anchorId="1279B38E" wp14:editId="61E9FBD7">
-            <wp:extent cx="6126480" cy="2721840"/>
+            <wp:extent cx="6126480" cy="2721841"/>
             <wp:effectExtent l="0" t="0" r="0" b="0"/>
             <wp:docPr id="13" name="Picture 13"/>
             <wp:cNvGraphicFramePr>
@@ -15234,7 +15330,7 @@
                   <pic:spPr>
                     <a:xfrm>
                       <a:off x="0" y="0"/>
-                      <a:ext cx="6126480" cy="2721840"/>
+                      <a:ext cx="6126480" cy="2721841"/>
                     </a:xfrm>
                     <a:prstGeom prst="rect">
                       <a:avLst/>
@@ -15280,12 +15376,16 @@
         <w:pStyle w:val="Heading2"/>
         <w:pageBreakBefore/>
       </w:pPr>
-      <w:bookmarkStart w:id="24" w:name="_Toc242867476"/>
+      <w:bookmarkStart w:id="72" w:name="_Toc242867476"/>
+      <w:bookmarkStart w:id="73" w:name="_Toc242869287"/>
+      <w:bookmarkStart w:id="74" w:name="_Toc242869447"/>
       <w:r>
         <w:lastRenderedPageBreak/>
         <w:t>3.11 Các khí ô nhiễm còn lại</w:t>
       </w:r>
-      <w:bookmarkEnd w:id="24"/>
+      <w:bookmarkEnd w:id="72"/>
+      <w:bookmarkEnd w:id="73"/>
+      <w:bookmarkEnd w:id="74"/>
     </w:p>
     <w:p>
       <w:pPr>
@@ -16174,7 +16274,7 @@
         </w:rPr>
         <w:drawing>
           <wp:inline distT="0" distB="0" distL="0" distR="0" wp14:anchorId="686F5C37" wp14:editId="1331A684">
-            <wp:extent cx="6126480" cy="2779021"/>
+            <wp:extent cx="6126480" cy="2779022"/>
             <wp:effectExtent l="0" t="0" r="0" b="0"/>
             <wp:docPr id="14" name="Picture 14"/>
             <wp:cNvGraphicFramePr>
@@ -16196,7 +16296,7 @@
                   <pic:spPr>
                     <a:xfrm>
                       <a:off x="0" y="0"/>
-                      <a:ext cx="6126480" cy="2779021"/>
+                      <a:ext cx="6126480" cy="2779022"/>
                     </a:xfrm>
                     <a:prstGeom prst="rect">
                       <a:avLst/>
@@ -16233,12 +16333,16 @@
         <w:pStyle w:val="Heading2"/>
         <w:pageBreakBefore/>
       </w:pPr>
-      <w:bookmarkStart w:id="25" w:name="_Toc242867477"/>
+      <w:bookmarkStart w:id="75" w:name="_Toc242867477"/>
+      <w:bookmarkStart w:id="76" w:name="_Toc242869288"/>
+      <w:bookmarkStart w:id="77" w:name="_Toc242869448"/>
       <w:r>
         <w:lastRenderedPageBreak/>
         <w:t>3.12 So sánh mẫu hai tuần trong lần tải mới</w:t>
       </w:r>
-      <w:bookmarkEnd w:id="25"/>
+      <w:bookmarkEnd w:id="75"/>
+      <w:bookmarkEnd w:id="76"/>
+      <w:bookmarkEnd w:id="77"/>
     </w:p>
     <w:p>
       <w:pPr>
@@ -17196,22 +17300,30 @@
         <w:pageBreakBefore/>
         <w:jc w:val="left"/>
       </w:pPr>
-      <w:bookmarkStart w:id="26" w:name="_Toc242867478"/>
+      <w:bookmarkStart w:id="78" w:name="_Toc242867478"/>
+      <w:bookmarkStart w:id="79" w:name="_Toc242869289"/>
+      <w:bookmarkStart w:id="80" w:name="_Toc242869449"/>
       <w:r>
         <w:lastRenderedPageBreak/>
         <w:t>Chương 4 Phân tích vận hành Lambda và SNS</w:t>
       </w:r>
-      <w:bookmarkEnd w:id="26"/>
+      <w:bookmarkEnd w:id="78"/>
+      <w:bookmarkEnd w:id="79"/>
+      <w:bookmarkEnd w:id="80"/>
     </w:p>
     <w:p>
       <w:pPr>
         <w:pStyle w:val="Heading2"/>
       </w:pPr>
-      <w:bookmarkStart w:id="27" w:name="_Toc242867479"/>
+      <w:bookmarkStart w:id="81" w:name="_Toc242867479"/>
+      <w:bookmarkStart w:id="82" w:name="_Toc242869290"/>
+      <w:bookmarkStart w:id="83" w:name="_Toc242869450"/>
       <w:r>
         <w:t>4.1 Thời gian thực thi và bộ nhớ Lambda</w:t>
       </w:r>
-      <w:bookmarkEnd w:id="27"/>
+      <w:bookmarkEnd w:id="81"/>
+      <w:bookmarkEnd w:id="82"/>
+      <w:bookmarkEnd w:id="83"/>
     </w:p>
     <w:p>
       <w:pPr>
@@ -17688,12 +17800,16 @@
         <w:pStyle w:val="Heading2"/>
         <w:pageBreakBefore/>
       </w:pPr>
-      <w:bookmarkStart w:id="28" w:name="_Toc242867480"/>
+      <w:bookmarkStart w:id="84" w:name="_Toc242867480"/>
+      <w:bookmarkStart w:id="85" w:name="_Toc242869291"/>
+      <w:bookmarkStart w:id="86" w:name="_Toc242869451"/>
       <w:r>
         <w:lastRenderedPageBreak/>
         <w:t>4.2 Lịch thu thập và thông báo SNS</w:t>
       </w:r>
-      <w:bookmarkEnd w:id="28"/>
+      <w:bookmarkEnd w:id="84"/>
+      <w:bookmarkEnd w:id="85"/>
+      <w:bookmarkEnd w:id="86"/>
     </w:p>
     <w:p>
       <w:pPr>
@@ -18054,11 +18170,15 @@
       <w:pPr>
         <w:pStyle w:val="Heading2"/>
       </w:pPr>
-      <w:bookmarkStart w:id="29" w:name="_Toc242867481"/>
+      <w:bookmarkStart w:id="87" w:name="_Toc242867481"/>
+      <w:bookmarkStart w:id="88" w:name="_Toc242869292"/>
+      <w:bookmarkStart w:id="89" w:name="_Toc242869452"/>
       <w:r>
         <w:t>4.3 Đối chiếu sự nhất quán của chỉ số vận hành</w:t>
       </w:r>
-      <w:bookmarkEnd w:id="29"/>
+      <w:bookmarkEnd w:id="87"/>
+      <w:bookmarkEnd w:id="88"/>
+      <w:bookmarkEnd w:id="89"/>
     </w:p>
     <w:p>
       <w:pPr>
@@ -18421,22 +18541,30 @@
         <w:pageBreakBefore/>
         <w:jc w:val="left"/>
       </w:pPr>
-      <w:bookmarkStart w:id="30" w:name="_Toc242867482"/>
+      <w:bookmarkStart w:id="90" w:name="_Toc242867482"/>
+      <w:bookmarkStart w:id="91" w:name="_Toc242869293"/>
+      <w:bookmarkStart w:id="92" w:name="_Toc242869453"/>
       <w:r>
         <w:lastRenderedPageBreak/>
         <w:t>Chương 5 Phân tích truy vấn và sử dụng tài nguyên</w:t>
       </w:r>
-      <w:bookmarkEnd w:id="30"/>
+      <w:bookmarkEnd w:id="90"/>
+      <w:bookmarkEnd w:id="91"/>
+      <w:bookmarkEnd w:id="92"/>
     </w:p>
     <w:p>
       <w:pPr>
         <w:pStyle w:val="Heading2"/>
       </w:pPr>
-      <w:bookmarkStart w:id="31" w:name="_Toc242867483"/>
+      <w:bookmarkStart w:id="93" w:name="_Toc242867483"/>
+      <w:bookmarkStart w:id="94" w:name="_Toc242869294"/>
+      <w:bookmarkStart w:id="95" w:name="_Toc242869454"/>
       <w:r>
         <w:t>5.1 Đối chứng hiệu quả lọc phân vùng</w:t>
       </w:r>
-      <w:bookmarkEnd w:id="31"/>
+      <w:bookmarkEnd w:id="93"/>
+      <w:bookmarkEnd w:id="94"/>
+      <w:bookmarkEnd w:id="95"/>
     </w:p>
     <w:p>
       <w:pPr>
@@ -18854,12 +18982,16 @@
         <w:pStyle w:val="Heading2"/>
         <w:pageBreakBefore/>
       </w:pPr>
-      <w:bookmarkStart w:id="32" w:name="_Toc242867484"/>
+      <w:bookmarkStart w:id="96" w:name="_Toc242867484"/>
+      <w:bookmarkStart w:id="97" w:name="_Toc242869295"/>
+      <w:bookmarkStart w:id="98" w:name="_Toc242869455"/>
       <w:r>
         <w:lastRenderedPageBreak/>
         <w:t>5.2 Hai mươi bốn truy vấn phân tích mới</w:t>
       </w:r>
-      <w:bookmarkEnd w:id="32"/>
+      <w:bookmarkEnd w:id="96"/>
+      <w:bookmarkEnd w:id="97"/>
+      <w:bookmarkEnd w:id="98"/>
     </w:p>
     <w:p>
       <w:pPr>
@@ -20223,11 +20355,15 @@
       <w:pPr>
         <w:pStyle w:val="Heading2"/>
       </w:pPr>
-      <w:bookmarkStart w:id="33" w:name="_Toc242867485"/>
+      <w:bookmarkStart w:id="99" w:name="_Toc242867485"/>
+      <w:bookmarkStart w:id="100" w:name="_Toc242869296"/>
+      <w:bookmarkStart w:id="101" w:name="_Toc242869456"/>
       <w:r>
         <w:t>5.3 Lịch sử truy vấn và phạm vi lỗi</w:t>
       </w:r>
-      <w:bookmarkEnd w:id="33"/>
+      <w:bookmarkEnd w:id="99"/>
+      <w:bookmarkEnd w:id="100"/>
+      <w:bookmarkEnd w:id="101"/>
     </w:p>
     <w:p>
       <w:pPr>
@@ -20521,12 +20657,16 @@
         <w:pStyle w:val="Heading2"/>
         <w:pageBreakBefore/>
       </w:pPr>
-      <w:bookmarkStart w:id="34" w:name="_Toc242867486"/>
+      <w:bookmarkStart w:id="102" w:name="_Toc242867486"/>
+      <w:bookmarkStart w:id="103" w:name="_Toc242869297"/>
+      <w:bookmarkStart w:id="104" w:name="_Toc242869457"/>
       <w:r>
         <w:lastRenderedPageBreak/>
         <w:t>5.4 Chi phí từ Cost Explorer</w:t>
       </w:r>
-      <w:bookmarkEnd w:id="34"/>
+      <w:bookmarkEnd w:id="102"/>
+      <w:bookmarkEnd w:id="103"/>
+      <w:bookmarkEnd w:id="104"/>
     </w:p>
     <w:p>
       <w:pPr>
@@ -20830,22 +20970,30 @@
         <w:pageBreakBefore/>
         <w:jc w:val="left"/>
       </w:pPr>
-      <w:bookmarkStart w:id="35" w:name="_Toc242867487"/>
+      <w:bookmarkStart w:id="105" w:name="_Toc242867487"/>
+      <w:bookmarkStart w:id="106" w:name="_Toc242869298"/>
+      <w:bookmarkStart w:id="107" w:name="_Toc242869458"/>
       <w:r>
         <w:lastRenderedPageBreak/>
         <w:t>Chương 6 Tổng hợp kết quả Tuần 2</w:t>
       </w:r>
-      <w:bookmarkEnd w:id="35"/>
+      <w:bookmarkEnd w:id="105"/>
+      <w:bookmarkEnd w:id="106"/>
+      <w:bookmarkEnd w:id="107"/>
     </w:p>
     <w:p>
       <w:pPr>
         <w:pStyle w:val="Heading2"/>
       </w:pPr>
-      <w:bookmarkStart w:id="36" w:name="_Toc242867488"/>
+      <w:bookmarkStart w:id="108" w:name="_Toc242867488"/>
+      <w:bookmarkStart w:id="109" w:name="_Toc242869299"/>
+      <w:bookmarkStart w:id="110" w:name="_Toc242869459"/>
       <w:r>
         <w:t>6.1 Sản phẩm dữ liệu và phân tích</w:t>
       </w:r>
-      <w:bookmarkEnd w:id="36"/>
+      <w:bookmarkEnd w:id="108"/>
+      <w:bookmarkEnd w:id="109"/>
+      <w:bookmarkEnd w:id="110"/>
     </w:p>
     <w:p>
       <w:pPr>
@@ -21186,11 +21334,15 @@
       <w:pPr>
         <w:pStyle w:val="Heading2"/>
       </w:pPr>
-      <w:bookmarkStart w:id="37" w:name="_Toc242867489"/>
+      <w:bookmarkStart w:id="111" w:name="_Toc242867489"/>
+      <w:bookmarkStart w:id="112" w:name="_Toc242869300"/>
+      <w:bookmarkStart w:id="113" w:name="_Toc242869460"/>
       <w:r>
         <w:t>6.2 Kết luận trong phạm vi mẫu đã thu thập</w:t>
       </w:r>
-      <w:bookmarkEnd w:id="37"/>
+      <w:bookmarkEnd w:id="111"/>
+      <w:bookmarkEnd w:id="112"/>
+      <w:bookmarkEnd w:id="113"/>
     </w:p>
     <w:p>
       <w:pPr>

</xml_diff>

<commit_message>
feat(reports): add weekly comparisons and repair data handling
</commit_message>
<xml_diff>
--- a/tuan_2/docs/Bao_cao_tuan_2_Dien_toan_dam_may_Nhom_05.docx
+++ b/tuan_2/docs/Bao_cao_tuan_2_Dien_toan_dam_may_Nhom_05.docx
@@ -425,7 +425,7 @@
         <w:ind w:firstLine="504"/>
       </w:pPr>
       <w:r>
-        <w:t>Hà Nội có AQI trung bình Tuần 2 đạt 163,56 và 163,05; TP. Hồ Chí Minh đạt 78,00 và 79,05; Đà Nẵng đạt 35,44 và 35,37. Báo cáo trình bày 16 biểu đồ từ dữ liệu thực tế, 24 truy vấn Athena mới thành công, phân bố mẫu, biến thiên theo giờ, ngưỡng cảnh báo, tương quan khí tượng và mức sử dụng tài nguyên. Các kết luận giới hạn trong mẫu đã thu thập.</w:t>
+        <w:t>Hà Nội có AQI trung bình Tuần 2 đạt 163,56 và 163,05; TP. Hồ Chí Minh đạt 78,00 và 79,05; Đà Nẵng đạt 35,44 và 35,37. Báo cáo trình bày 18 biểu đồ từ dữ liệu thực tế, 24 truy vấn Athena mới thành công, phân bố mẫu, biến thiên theo giờ, ngưỡng cảnh báo, tương quan khí tượng và mức sử dụng tài nguyên. Các kết luận giới hạn trong mẫu đã thu thập.</w:t>
       </w:r>
     </w:p>
     <w:p>
@@ -545,7 +545,7 @@
         </w:rPr>
         <w:fldChar w:fldCharType="separate"/>
       </w:r>
-      <w:hyperlink w:anchor="_Toc242874440" w:history="1">
+      <w:hyperlink w:anchor="_Toc242876903" w:history="1">
         <w:r>
           <w:rPr>
             <w:rStyle w:val="Hyperlink"/>
@@ -572,7 +572,7 @@
             <w:noProof/>
             <w:webHidden/>
           </w:rPr>
-          <w:instrText xml:space="preserve"> PAGEREF _Toc242874440 \h </w:instrText>
+          <w:instrText xml:space="preserve"> PAGEREF _Toc242876903 \h </w:instrText>
         </w:r>
         <w:r>
           <w:rPr>
@@ -619,7 +619,7 @@
           <w14:ligatures w14:val="standardContextual"/>
         </w:rPr>
       </w:pPr>
-      <w:hyperlink w:anchor="_Toc242874441" w:history="1">
+      <w:hyperlink w:anchor="_Toc242876904" w:history="1">
         <w:r>
           <w:rPr>
             <w:rStyle w:val="Hyperlink"/>
@@ -646,7 +646,7 @@
             <w:noProof/>
             <w:webHidden/>
           </w:rPr>
-          <w:instrText xml:space="preserve"> PAGEREF _Toc242874441 \h </w:instrText>
+          <w:instrText xml:space="preserve"> PAGEREF _Toc242876904 \h </w:instrText>
         </w:r>
         <w:r>
           <w:rPr>
@@ -693,7 +693,7 @@
           <w14:ligatures w14:val="standardContextual"/>
         </w:rPr>
       </w:pPr>
-      <w:hyperlink w:anchor="_Toc242874442" w:history="1">
+      <w:hyperlink w:anchor="_Toc242876905" w:history="1">
         <w:r>
           <w:rPr>
             <w:rStyle w:val="Hyperlink"/>
@@ -720,7 +720,7 @@
             <w:noProof/>
             <w:webHidden/>
           </w:rPr>
-          <w:instrText xml:space="preserve"> PAGEREF _Toc242874442 \h </w:instrText>
+          <w:instrText xml:space="preserve"> PAGEREF _Toc242876905 \h </w:instrText>
         </w:r>
         <w:r>
           <w:rPr>
@@ -767,7 +767,7 @@
           <w14:ligatures w14:val="standardContextual"/>
         </w:rPr>
       </w:pPr>
-      <w:hyperlink w:anchor="_Toc242874443" w:history="1">
+      <w:hyperlink w:anchor="_Toc242876906" w:history="1">
         <w:r>
           <w:rPr>
             <w:rStyle w:val="Hyperlink"/>
@@ -794,7 +794,7 @@
             <w:noProof/>
             <w:webHidden/>
           </w:rPr>
-          <w:instrText xml:space="preserve"> PAGEREF _Toc242874443 \h </w:instrText>
+          <w:instrText xml:space="preserve"> PAGEREF _Toc242876906 \h </w:instrText>
         </w:r>
         <w:r>
           <w:rPr>
@@ -841,7 +841,7 @@
           <w14:ligatures w14:val="standardContextual"/>
         </w:rPr>
       </w:pPr>
-      <w:hyperlink w:anchor="_Toc242874444" w:history="1">
+      <w:hyperlink w:anchor="_Toc242876907" w:history="1">
         <w:r>
           <w:rPr>
             <w:rStyle w:val="Hyperlink"/>
@@ -868,7 +868,7 @@
             <w:noProof/>
             <w:webHidden/>
           </w:rPr>
-          <w:instrText xml:space="preserve"> PAGEREF _Toc242874444 \h </w:instrText>
+          <w:instrText xml:space="preserve"> PAGEREF _Toc242876907 \h </w:instrText>
         </w:r>
         <w:r>
           <w:rPr>
@@ -916,7 +916,7 @@
           <w14:ligatures w14:val="standardContextual"/>
         </w:rPr>
       </w:pPr>
-      <w:hyperlink w:anchor="_Toc242874445" w:history="1">
+      <w:hyperlink w:anchor="_Toc242876908" w:history="1">
         <w:r>
           <w:rPr>
             <w:rStyle w:val="Hyperlink"/>
@@ -943,7 +943,7 @@
             <w:noProof/>
             <w:webHidden/>
           </w:rPr>
-          <w:instrText xml:space="preserve"> PAGEREF _Toc242874445 \h </w:instrText>
+          <w:instrText xml:space="preserve"> PAGEREF _Toc242876908 \h </w:instrText>
         </w:r>
         <w:r>
           <w:rPr>
@@ -990,7 +990,7 @@
           <w14:ligatures w14:val="standardContextual"/>
         </w:rPr>
       </w:pPr>
-      <w:hyperlink w:anchor="_Toc242874446" w:history="1">
+      <w:hyperlink w:anchor="_Toc242876909" w:history="1">
         <w:r>
           <w:rPr>
             <w:rStyle w:val="Hyperlink"/>
@@ -1017,7 +1017,7 @@
             <w:noProof/>
             <w:webHidden/>
           </w:rPr>
-          <w:instrText xml:space="preserve"> PAGEREF _Toc242874446 \h </w:instrText>
+          <w:instrText xml:space="preserve"> PAGEREF _Toc242876909 \h </w:instrText>
         </w:r>
         <w:r>
           <w:rPr>
@@ -1064,7 +1064,7 @@
           <w14:ligatures w14:val="standardContextual"/>
         </w:rPr>
       </w:pPr>
-      <w:hyperlink w:anchor="_Toc242874447" w:history="1">
+      <w:hyperlink w:anchor="_Toc242876910" w:history="1">
         <w:r>
           <w:rPr>
             <w:rStyle w:val="Hyperlink"/>
@@ -1091,7 +1091,7 @@
             <w:noProof/>
             <w:webHidden/>
           </w:rPr>
-          <w:instrText xml:space="preserve"> PAGEREF _Toc242874447 \h </w:instrText>
+          <w:instrText xml:space="preserve"> PAGEREF _Toc242876910 \h </w:instrText>
         </w:r>
         <w:r>
           <w:rPr>
@@ -1138,7 +1138,7 @@
           <w14:ligatures w14:val="standardContextual"/>
         </w:rPr>
       </w:pPr>
-      <w:hyperlink w:anchor="_Toc242874448" w:history="1">
+      <w:hyperlink w:anchor="_Toc242876911" w:history="1">
         <w:r>
           <w:rPr>
             <w:rStyle w:val="Hyperlink"/>
@@ -1165,7 +1165,7 @@
             <w:noProof/>
             <w:webHidden/>
           </w:rPr>
-          <w:instrText xml:space="preserve"> PAGEREF _Toc242874448 \h </w:instrText>
+          <w:instrText xml:space="preserve"> PAGEREF _Toc242876911 \h </w:instrText>
         </w:r>
         <w:r>
           <w:rPr>
@@ -1212,7 +1212,7 @@
           <w14:ligatures w14:val="standardContextual"/>
         </w:rPr>
       </w:pPr>
-      <w:hyperlink w:anchor="_Toc242874449" w:history="1">
+      <w:hyperlink w:anchor="_Toc242876912" w:history="1">
         <w:r>
           <w:rPr>
             <w:rStyle w:val="Hyperlink"/>
@@ -1239,7 +1239,7 @@
             <w:noProof/>
             <w:webHidden/>
           </w:rPr>
-          <w:instrText xml:space="preserve"> PAGEREF _Toc242874449 \h </w:instrText>
+          <w:instrText xml:space="preserve"> PAGEREF _Toc242876912 \h </w:instrText>
         </w:r>
         <w:r>
           <w:rPr>
@@ -1286,7 +1286,7 @@
           <w14:ligatures w14:val="standardContextual"/>
         </w:rPr>
       </w:pPr>
-      <w:hyperlink w:anchor="_Toc242874450" w:history="1">
+      <w:hyperlink w:anchor="_Toc242876913" w:history="1">
         <w:r>
           <w:rPr>
             <w:rStyle w:val="Hyperlink"/>
@@ -1313,7 +1313,7 @@
             <w:noProof/>
             <w:webHidden/>
           </w:rPr>
-          <w:instrText xml:space="preserve"> PAGEREF _Toc242874450 \h </w:instrText>
+          <w:instrText xml:space="preserve"> PAGEREF _Toc242876913 \h </w:instrText>
         </w:r>
         <w:r>
           <w:rPr>
@@ -1360,7 +1360,7 @@
           <w14:ligatures w14:val="standardContextual"/>
         </w:rPr>
       </w:pPr>
-      <w:hyperlink w:anchor="_Toc242874451" w:history="1">
+      <w:hyperlink w:anchor="_Toc242876914" w:history="1">
         <w:r>
           <w:rPr>
             <w:rStyle w:val="Hyperlink"/>
@@ -1387,7 +1387,7 @@
             <w:noProof/>
             <w:webHidden/>
           </w:rPr>
-          <w:instrText xml:space="preserve"> PAGEREF _Toc242874451 \h </w:instrText>
+          <w:instrText xml:space="preserve"> PAGEREF _Toc242876914 \h </w:instrText>
         </w:r>
         <w:r>
           <w:rPr>
@@ -1434,7 +1434,7 @@
           <w14:ligatures w14:val="standardContextual"/>
         </w:rPr>
       </w:pPr>
-      <w:hyperlink w:anchor="_Toc242874452" w:history="1">
+      <w:hyperlink w:anchor="_Toc242876915" w:history="1">
         <w:r>
           <w:rPr>
             <w:rStyle w:val="Hyperlink"/>
@@ -1461,7 +1461,7 @@
             <w:noProof/>
             <w:webHidden/>
           </w:rPr>
-          <w:instrText xml:space="preserve"> PAGEREF _Toc242874452 \h </w:instrText>
+          <w:instrText xml:space="preserve"> PAGEREF _Toc242876915 \h </w:instrText>
         </w:r>
         <w:r>
           <w:rPr>
@@ -1509,7 +1509,7 @@
           <w14:ligatures w14:val="standardContextual"/>
         </w:rPr>
       </w:pPr>
-      <w:hyperlink w:anchor="_Toc242874453" w:history="1">
+      <w:hyperlink w:anchor="_Toc242876916" w:history="1">
         <w:r>
           <w:rPr>
             <w:rStyle w:val="Hyperlink"/>
@@ -1536,7 +1536,7 @@
             <w:noProof/>
             <w:webHidden/>
           </w:rPr>
-          <w:instrText xml:space="preserve"> PAGEREF _Toc242874453 \h </w:instrText>
+          <w:instrText xml:space="preserve"> PAGEREF _Toc242876916 \h </w:instrText>
         </w:r>
         <w:r>
           <w:rPr>
@@ -1583,7 +1583,7 @@
           <w14:ligatures w14:val="standardContextual"/>
         </w:rPr>
       </w:pPr>
-      <w:hyperlink w:anchor="_Toc242874454" w:history="1">
+      <w:hyperlink w:anchor="_Toc242876917" w:history="1">
         <w:r>
           <w:rPr>
             <w:rStyle w:val="Hyperlink"/>
@@ -1610,7 +1610,7 @@
             <w:noProof/>
             <w:webHidden/>
           </w:rPr>
-          <w:instrText xml:space="preserve"> PAGEREF _Toc242874454 \h </w:instrText>
+          <w:instrText xml:space="preserve"> PAGEREF _Toc242876917 \h </w:instrText>
         </w:r>
         <w:r>
           <w:rPr>
@@ -1657,7 +1657,7 @@
           <w14:ligatures w14:val="standardContextual"/>
         </w:rPr>
       </w:pPr>
-      <w:hyperlink w:anchor="_Toc242874455" w:history="1">
+      <w:hyperlink w:anchor="_Toc242876918" w:history="1">
         <w:r>
           <w:rPr>
             <w:rStyle w:val="Hyperlink"/>
@@ -1684,7 +1684,7 @@
             <w:noProof/>
             <w:webHidden/>
           </w:rPr>
-          <w:instrText xml:space="preserve"> PAGEREF _Toc242874455 \h </w:instrText>
+          <w:instrText xml:space="preserve"> PAGEREF _Toc242876918 \h </w:instrText>
         </w:r>
         <w:r>
           <w:rPr>
@@ -1731,7 +1731,7 @@
           <w14:ligatures w14:val="standardContextual"/>
         </w:rPr>
       </w:pPr>
-      <w:hyperlink w:anchor="_Toc242874456" w:history="1">
+      <w:hyperlink w:anchor="_Toc242876919" w:history="1">
         <w:r>
           <w:rPr>
             <w:rStyle w:val="Hyperlink"/>
@@ -1758,7 +1758,7 @@
             <w:noProof/>
             <w:webHidden/>
           </w:rPr>
-          <w:instrText xml:space="preserve"> PAGEREF _Toc242874456 \h </w:instrText>
+          <w:instrText xml:space="preserve"> PAGEREF _Toc242876919 \h </w:instrText>
         </w:r>
         <w:r>
           <w:rPr>
@@ -1805,7 +1805,7 @@
           <w14:ligatures w14:val="standardContextual"/>
         </w:rPr>
       </w:pPr>
-      <w:hyperlink w:anchor="_Toc242874457" w:history="1">
+      <w:hyperlink w:anchor="_Toc242876920" w:history="1">
         <w:r>
           <w:rPr>
             <w:rStyle w:val="Hyperlink"/>
@@ -1832,7 +1832,7 @@
             <w:noProof/>
             <w:webHidden/>
           </w:rPr>
-          <w:instrText xml:space="preserve"> PAGEREF _Toc242874457 \h </w:instrText>
+          <w:instrText xml:space="preserve"> PAGEREF _Toc242876920 \h </w:instrText>
         </w:r>
         <w:r>
           <w:rPr>
@@ -1879,7 +1879,7 @@
           <w14:ligatures w14:val="standardContextual"/>
         </w:rPr>
       </w:pPr>
-      <w:hyperlink w:anchor="_Toc242874458" w:history="1">
+      <w:hyperlink w:anchor="_Toc242876921" w:history="1">
         <w:r>
           <w:rPr>
             <w:rStyle w:val="Hyperlink"/>
@@ -1906,7 +1906,7 @@
             <w:noProof/>
             <w:webHidden/>
           </w:rPr>
-          <w:instrText xml:space="preserve"> PAGEREF _Toc242874458 \h </w:instrText>
+          <w:instrText xml:space="preserve"> PAGEREF _Toc242876921 \h </w:instrText>
         </w:r>
         <w:r>
           <w:rPr>
@@ -1953,7 +1953,7 @@
           <w14:ligatures w14:val="standardContextual"/>
         </w:rPr>
       </w:pPr>
-      <w:hyperlink w:anchor="_Toc242874459" w:history="1">
+      <w:hyperlink w:anchor="_Toc242876922" w:history="1">
         <w:r>
           <w:rPr>
             <w:rStyle w:val="Hyperlink"/>
@@ -1980,7 +1980,7 @@
             <w:noProof/>
             <w:webHidden/>
           </w:rPr>
-          <w:instrText xml:space="preserve"> PAGEREF _Toc242874459 \h </w:instrText>
+          <w:instrText xml:space="preserve"> PAGEREF _Toc242876922 \h </w:instrText>
         </w:r>
         <w:r>
           <w:rPr>
@@ -2027,7 +2027,7 @@
           <w14:ligatures w14:val="standardContextual"/>
         </w:rPr>
       </w:pPr>
-      <w:hyperlink w:anchor="_Toc242874460" w:history="1">
+      <w:hyperlink w:anchor="_Toc242876923" w:history="1">
         <w:r>
           <w:rPr>
             <w:rStyle w:val="Hyperlink"/>
@@ -2054,7 +2054,7 @@
             <w:noProof/>
             <w:webHidden/>
           </w:rPr>
-          <w:instrText xml:space="preserve"> PAGEREF _Toc242874460 \h </w:instrText>
+          <w:instrText xml:space="preserve"> PAGEREF _Toc242876923 \h </w:instrText>
         </w:r>
         <w:r>
           <w:rPr>
@@ -2101,7 +2101,7 @@
           <w14:ligatures w14:val="standardContextual"/>
         </w:rPr>
       </w:pPr>
-      <w:hyperlink w:anchor="_Toc242874461" w:history="1">
+      <w:hyperlink w:anchor="_Toc242876924" w:history="1">
         <w:r>
           <w:rPr>
             <w:rStyle w:val="Hyperlink"/>
@@ -2128,7 +2128,7 @@
             <w:noProof/>
             <w:webHidden/>
           </w:rPr>
-          <w:instrText xml:space="preserve"> PAGEREF _Toc242874461 \h </w:instrText>
+          <w:instrText xml:space="preserve"> PAGEREF _Toc242876924 \h </w:instrText>
         </w:r>
         <w:r>
           <w:rPr>
@@ -2175,7 +2175,7 @@
           <w14:ligatures w14:val="standardContextual"/>
         </w:rPr>
       </w:pPr>
-      <w:hyperlink w:anchor="_Toc242874462" w:history="1">
+      <w:hyperlink w:anchor="_Toc242876925" w:history="1">
         <w:r>
           <w:rPr>
             <w:rStyle w:val="Hyperlink"/>
@@ -2202,7 +2202,7 @@
             <w:noProof/>
             <w:webHidden/>
           </w:rPr>
-          <w:instrText xml:space="preserve"> PAGEREF _Toc242874462 \h </w:instrText>
+          <w:instrText xml:space="preserve"> PAGEREF _Toc242876925 \h </w:instrText>
         </w:r>
         <w:r>
           <w:rPr>
@@ -2249,7 +2249,7 @@
           <w14:ligatures w14:val="standardContextual"/>
         </w:rPr>
       </w:pPr>
-      <w:hyperlink w:anchor="_Toc242874463" w:history="1">
+      <w:hyperlink w:anchor="_Toc242876926" w:history="1">
         <w:r>
           <w:rPr>
             <w:rStyle w:val="Hyperlink"/>
@@ -2276,7 +2276,7 @@
             <w:noProof/>
             <w:webHidden/>
           </w:rPr>
-          <w:instrText xml:space="preserve"> PAGEREF _Toc242874463 \h </w:instrText>
+          <w:instrText xml:space="preserve"> PAGEREF _Toc242876926 \h </w:instrText>
         </w:r>
         <w:r>
           <w:rPr>
@@ -2323,7 +2323,7 @@
           <w14:ligatures w14:val="standardContextual"/>
         </w:rPr>
       </w:pPr>
-      <w:hyperlink w:anchor="_Toc242874464" w:history="1">
+      <w:hyperlink w:anchor="_Toc242876927" w:history="1">
         <w:r>
           <w:rPr>
             <w:rStyle w:val="Hyperlink"/>
@@ -2350,7 +2350,7 @@
             <w:noProof/>
             <w:webHidden/>
           </w:rPr>
-          <w:instrText xml:space="preserve"> PAGEREF _Toc242874464 \h </w:instrText>
+          <w:instrText xml:space="preserve"> PAGEREF _Toc242876927 \h </w:instrText>
         </w:r>
         <w:r>
           <w:rPr>
@@ -2397,7 +2397,7 @@
           <w14:ligatures w14:val="standardContextual"/>
         </w:rPr>
       </w:pPr>
-      <w:hyperlink w:anchor="_Toc242874465" w:history="1">
+      <w:hyperlink w:anchor="_Toc242876928" w:history="1">
         <w:r>
           <w:rPr>
             <w:rStyle w:val="Hyperlink"/>
@@ -2424,7 +2424,7 @@
             <w:noProof/>
             <w:webHidden/>
           </w:rPr>
-          <w:instrText xml:space="preserve"> PAGEREF _Toc242874465 \h </w:instrText>
+          <w:instrText xml:space="preserve"> PAGEREF _Toc242876928 \h </w:instrText>
         </w:r>
         <w:r>
           <w:rPr>
@@ -2472,7 +2472,7 @@
           <w14:ligatures w14:val="standardContextual"/>
         </w:rPr>
       </w:pPr>
-      <w:hyperlink w:anchor="_Toc242874466" w:history="1">
+      <w:hyperlink w:anchor="_Toc242876929" w:history="1">
         <w:r>
           <w:rPr>
             <w:rStyle w:val="Hyperlink"/>
@@ -2499,304 +2499,7 @@
             <w:noProof/>
             <w:webHidden/>
           </w:rPr>
-          <w:instrText xml:space="preserve"> PAGEREF _Toc242874466 \h </w:instrText>
-        </w:r>
-        <w:r>
-          <w:rPr>
-            <w:noProof/>
-            <w:webHidden/>
-          </w:rPr>
-        </w:r>
-        <w:r>
-          <w:rPr>
-            <w:noProof/>
-            <w:webHidden/>
-          </w:rPr>
-          <w:fldChar w:fldCharType="separate"/>
-        </w:r>
-        <w:r>
-          <w:rPr>
-            <w:noProof/>
-            <w:webHidden/>
-          </w:rPr>
-          <w:t>24</w:t>
-        </w:r>
-        <w:r>
-          <w:rPr>
-            <w:noProof/>
-            <w:webHidden/>
-          </w:rPr>
-          <w:fldChar w:fldCharType="end"/>
-        </w:r>
-      </w:hyperlink>
-    </w:p>
-    <w:p>
-      <w:pPr>
-        <w:pStyle w:val="TOC2"/>
-        <w:tabs>
-          <w:tab w:val="right" w:leader="dot" w:pos="9926"/>
-        </w:tabs>
-        <w:rPr>
-          <w:rFonts w:asciiTheme="minorHAnsi" w:eastAsiaTheme="minorEastAsia" w:hAnsiTheme="minorHAnsi" w:cstheme="minorBidi"/>
-          <w:noProof/>
-          <w:color w:val="auto"/>
-          <w:kern w:val="2"/>
-          <w:szCs w:val="24"/>
-          <w:lang w:val="en-US" w:eastAsia="ja-JP"/>
-          <w14:ligatures w14:val="standardContextual"/>
-        </w:rPr>
-      </w:pPr>
-      <w:hyperlink w:anchor="_Toc242874467" w:history="1">
-        <w:r>
-          <w:rPr>
-            <w:rStyle w:val="Hyperlink"/>
-            <w:noProof/>
-          </w:rPr>
-          <w:t>4.1 Thời gian thực thi và bộ nhớ Lambda</w:t>
-        </w:r>
-        <w:r>
-          <w:rPr>
-            <w:noProof/>
-            <w:webHidden/>
-          </w:rPr>
-          <w:tab/>
-        </w:r>
-        <w:r>
-          <w:rPr>
-            <w:noProof/>
-            <w:webHidden/>
-          </w:rPr>
-          <w:fldChar w:fldCharType="begin"/>
-        </w:r>
-        <w:r>
-          <w:rPr>
-            <w:noProof/>
-            <w:webHidden/>
-          </w:rPr>
-          <w:instrText xml:space="preserve"> PAGEREF _Toc242874467 \h </w:instrText>
-        </w:r>
-        <w:r>
-          <w:rPr>
-            <w:noProof/>
-            <w:webHidden/>
-          </w:rPr>
-        </w:r>
-        <w:r>
-          <w:rPr>
-            <w:noProof/>
-            <w:webHidden/>
-          </w:rPr>
-          <w:fldChar w:fldCharType="separate"/>
-        </w:r>
-        <w:r>
-          <w:rPr>
-            <w:noProof/>
-            <w:webHidden/>
-          </w:rPr>
-          <w:t>24</w:t>
-        </w:r>
-        <w:r>
-          <w:rPr>
-            <w:noProof/>
-            <w:webHidden/>
-          </w:rPr>
-          <w:fldChar w:fldCharType="end"/>
-        </w:r>
-      </w:hyperlink>
-    </w:p>
-    <w:p>
-      <w:pPr>
-        <w:pStyle w:val="TOC2"/>
-        <w:tabs>
-          <w:tab w:val="right" w:leader="dot" w:pos="9926"/>
-        </w:tabs>
-        <w:rPr>
-          <w:rFonts w:asciiTheme="minorHAnsi" w:eastAsiaTheme="minorEastAsia" w:hAnsiTheme="minorHAnsi" w:cstheme="minorBidi"/>
-          <w:noProof/>
-          <w:color w:val="auto"/>
-          <w:kern w:val="2"/>
-          <w:szCs w:val="24"/>
-          <w:lang w:val="en-US" w:eastAsia="ja-JP"/>
-          <w14:ligatures w14:val="standardContextual"/>
-        </w:rPr>
-      </w:pPr>
-      <w:hyperlink w:anchor="_Toc242874468" w:history="1">
-        <w:r>
-          <w:rPr>
-            <w:rStyle w:val="Hyperlink"/>
-            <w:noProof/>
-          </w:rPr>
-          <w:t>4.2 Lịch thu thập và thông báo SNS</w:t>
-        </w:r>
-        <w:r>
-          <w:rPr>
-            <w:noProof/>
-            <w:webHidden/>
-          </w:rPr>
-          <w:tab/>
-        </w:r>
-        <w:r>
-          <w:rPr>
-            <w:noProof/>
-            <w:webHidden/>
-          </w:rPr>
-          <w:fldChar w:fldCharType="begin"/>
-        </w:r>
-        <w:r>
-          <w:rPr>
-            <w:noProof/>
-            <w:webHidden/>
-          </w:rPr>
-          <w:instrText xml:space="preserve"> PAGEREF _Toc242874468 \h </w:instrText>
-        </w:r>
-        <w:r>
-          <w:rPr>
-            <w:noProof/>
-            <w:webHidden/>
-          </w:rPr>
-        </w:r>
-        <w:r>
-          <w:rPr>
-            <w:noProof/>
-            <w:webHidden/>
-          </w:rPr>
-          <w:fldChar w:fldCharType="separate"/>
-        </w:r>
-        <w:r>
-          <w:rPr>
-            <w:noProof/>
-            <w:webHidden/>
-          </w:rPr>
-          <w:t>25</w:t>
-        </w:r>
-        <w:r>
-          <w:rPr>
-            <w:noProof/>
-            <w:webHidden/>
-          </w:rPr>
-          <w:fldChar w:fldCharType="end"/>
-        </w:r>
-      </w:hyperlink>
-    </w:p>
-    <w:p>
-      <w:pPr>
-        <w:pStyle w:val="TOC2"/>
-        <w:tabs>
-          <w:tab w:val="right" w:leader="dot" w:pos="9926"/>
-        </w:tabs>
-        <w:rPr>
-          <w:rFonts w:asciiTheme="minorHAnsi" w:eastAsiaTheme="minorEastAsia" w:hAnsiTheme="minorHAnsi" w:cstheme="minorBidi"/>
-          <w:noProof/>
-          <w:color w:val="auto"/>
-          <w:kern w:val="2"/>
-          <w:szCs w:val="24"/>
-          <w:lang w:val="en-US" w:eastAsia="ja-JP"/>
-          <w14:ligatures w14:val="standardContextual"/>
-        </w:rPr>
-      </w:pPr>
-      <w:hyperlink w:anchor="_Toc242874469" w:history="1">
-        <w:r>
-          <w:rPr>
-            <w:rStyle w:val="Hyperlink"/>
-            <w:noProof/>
-          </w:rPr>
-          <w:t>4.3 Đối chiếu sự nhất quán của chỉ số vận hành</w:t>
-        </w:r>
-        <w:r>
-          <w:rPr>
-            <w:noProof/>
-            <w:webHidden/>
-          </w:rPr>
-          <w:tab/>
-        </w:r>
-        <w:r>
-          <w:rPr>
-            <w:noProof/>
-            <w:webHidden/>
-          </w:rPr>
-          <w:fldChar w:fldCharType="begin"/>
-        </w:r>
-        <w:r>
-          <w:rPr>
-            <w:noProof/>
-            <w:webHidden/>
-          </w:rPr>
-          <w:instrText xml:space="preserve"> PAGEREF _Toc242874469 \h </w:instrText>
-        </w:r>
-        <w:r>
-          <w:rPr>
-            <w:noProof/>
-            <w:webHidden/>
-          </w:rPr>
-        </w:r>
-        <w:r>
-          <w:rPr>
-            <w:noProof/>
-            <w:webHidden/>
-          </w:rPr>
-          <w:fldChar w:fldCharType="separate"/>
-        </w:r>
-        <w:r>
-          <w:rPr>
-            <w:noProof/>
-            <w:webHidden/>
-          </w:rPr>
-          <w:t>25</w:t>
-        </w:r>
-        <w:r>
-          <w:rPr>
-            <w:noProof/>
-            <w:webHidden/>
-          </w:rPr>
-          <w:fldChar w:fldCharType="end"/>
-        </w:r>
-      </w:hyperlink>
-    </w:p>
-    <w:p>
-      <w:pPr>
-        <w:pStyle w:val="TOC1"/>
-        <w:tabs>
-          <w:tab w:val="right" w:leader="dot" w:pos="9926"/>
-        </w:tabs>
-        <w:rPr>
-          <w:rFonts w:asciiTheme="minorHAnsi" w:eastAsiaTheme="minorEastAsia" w:hAnsiTheme="minorHAnsi" w:cstheme="minorBidi"/>
-          <w:b w:val="0"/>
-          <w:noProof/>
-          <w:color w:val="auto"/>
-          <w:kern w:val="2"/>
-          <w:szCs w:val="24"/>
-          <w:lang w:val="en-US" w:eastAsia="ja-JP"/>
-          <w14:ligatures w14:val="standardContextual"/>
-        </w:rPr>
-      </w:pPr>
-      <w:hyperlink w:anchor="_Toc242874470" w:history="1">
-        <w:r>
-          <w:rPr>
-            <w:rStyle w:val="Hyperlink"/>
-            <w:noProof/>
-          </w:rPr>
-          <w:t>Chương 5 Phân tích truy vấn và sử dụng tài nguyên</w:t>
-        </w:r>
-        <w:r>
-          <w:rPr>
-            <w:noProof/>
-            <w:webHidden/>
-          </w:rPr>
-          <w:tab/>
-        </w:r>
-        <w:r>
-          <w:rPr>
-            <w:noProof/>
-            <w:webHidden/>
-          </w:rPr>
-          <w:fldChar w:fldCharType="begin"/>
-        </w:r>
-        <w:r>
-          <w:rPr>
-            <w:noProof/>
-            <w:webHidden/>
-          </w:rPr>
-          <w:instrText xml:space="preserve"> PAGEREF _Toc242874470 \h </w:instrText>
+          <w:instrText xml:space="preserve"> PAGEREF _Toc242876929 \h </w:instrText>
         </w:r>
         <w:r>
           <w:rPr>
@@ -2843,13 +2546,13 @@
           <w14:ligatures w14:val="standardContextual"/>
         </w:rPr>
       </w:pPr>
-      <w:hyperlink w:anchor="_Toc242874471" w:history="1">
+      <w:hyperlink w:anchor="_Toc242876930" w:history="1">
         <w:r>
           <w:rPr>
             <w:rStyle w:val="Hyperlink"/>
             <w:noProof/>
           </w:rPr>
-          <w:t>5.1 Đối chứng hiệu quả lọc phân vùng</w:t>
+          <w:t>4.1 Thời gian thực thi và bộ nhớ Lambda</w:t>
         </w:r>
         <w:r>
           <w:rPr>
@@ -2870,7 +2573,7 @@
             <w:noProof/>
             <w:webHidden/>
           </w:rPr>
-          <w:instrText xml:space="preserve"> PAGEREF _Toc242874471 \h </w:instrText>
+          <w:instrText xml:space="preserve"> PAGEREF _Toc242876930 \h </w:instrText>
         </w:r>
         <w:r>
           <w:rPr>
@@ -2917,13 +2620,13 @@
           <w14:ligatures w14:val="standardContextual"/>
         </w:rPr>
       </w:pPr>
-      <w:hyperlink w:anchor="_Toc242874472" w:history="1">
+      <w:hyperlink w:anchor="_Toc242876931" w:history="1">
         <w:r>
           <w:rPr>
             <w:rStyle w:val="Hyperlink"/>
             <w:noProof/>
           </w:rPr>
-          <w:t>5.2 Hai mươi bốn truy vấn phân tích mới</w:t>
+          <w:t>4.2 Lịch thu thập và thông báo SNS</w:t>
         </w:r>
         <w:r>
           <w:rPr>
@@ -2944,7 +2647,7 @@
             <w:noProof/>
             <w:webHidden/>
           </w:rPr>
-          <w:instrText xml:space="preserve"> PAGEREF _Toc242874472 \h </w:instrText>
+          <w:instrText xml:space="preserve"> PAGEREF _Toc242876931 \h </w:instrText>
         </w:r>
         <w:r>
           <w:rPr>
@@ -2991,13 +2694,13 @@
           <w14:ligatures w14:val="standardContextual"/>
         </w:rPr>
       </w:pPr>
-      <w:hyperlink w:anchor="_Toc242874473" w:history="1">
+      <w:hyperlink w:anchor="_Toc242876932" w:history="1">
         <w:r>
           <w:rPr>
             <w:rStyle w:val="Hyperlink"/>
             <w:noProof/>
           </w:rPr>
-          <w:t>5.3 Lịch sử truy vấn và phạm vi lỗi</w:t>
+          <w:t>4.3 Đối chiếu sự nhất quán của chỉ số vận hành</w:t>
         </w:r>
         <w:r>
           <w:rPr>
@@ -3018,7 +2721,82 @@
             <w:noProof/>
             <w:webHidden/>
           </w:rPr>
-          <w:instrText xml:space="preserve"> PAGEREF _Toc242874473 \h </w:instrText>
+          <w:instrText xml:space="preserve"> PAGEREF _Toc242876932 \h </w:instrText>
+        </w:r>
+        <w:r>
+          <w:rPr>
+            <w:noProof/>
+            <w:webHidden/>
+          </w:rPr>
+        </w:r>
+        <w:r>
+          <w:rPr>
+            <w:noProof/>
+            <w:webHidden/>
+          </w:rPr>
+          <w:fldChar w:fldCharType="separate"/>
+        </w:r>
+        <w:r>
+          <w:rPr>
+            <w:noProof/>
+            <w:webHidden/>
+          </w:rPr>
+          <w:t>27</w:t>
+        </w:r>
+        <w:r>
+          <w:rPr>
+            <w:noProof/>
+            <w:webHidden/>
+          </w:rPr>
+          <w:fldChar w:fldCharType="end"/>
+        </w:r>
+      </w:hyperlink>
+    </w:p>
+    <w:p>
+      <w:pPr>
+        <w:pStyle w:val="TOC1"/>
+        <w:tabs>
+          <w:tab w:val="right" w:leader="dot" w:pos="9926"/>
+        </w:tabs>
+        <w:rPr>
+          <w:rFonts w:asciiTheme="minorHAnsi" w:eastAsiaTheme="minorEastAsia" w:hAnsiTheme="minorHAnsi" w:cstheme="minorBidi"/>
+          <w:b w:val="0"/>
+          <w:noProof/>
+          <w:color w:val="auto"/>
+          <w:kern w:val="2"/>
+          <w:szCs w:val="24"/>
+          <w:lang w:val="en-US" w:eastAsia="ja-JP"/>
+          <w14:ligatures w14:val="standardContextual"/>
+        </w:rPr>
+      </w:pPr>
+      <w:hyperlink w:anchor="_Toc242876933" w:history="1">
+        <w:r>
+          <w:rPr>
+            <w:rStyle w:val="Hyperlink"/>
+            <w:noProof/>
+          </w:rPr>
+          <w:t>Chương 5 Phân tích truy vấn và sử dụng tài nguyên</w:t>
+        </w:r>
+        <w:r>
+          <w:rPr>
+            <w:noProof/>
+            <w:webHidden/>
+          </w:rPr>
+          <w:tab/>
+        </w:r>
+        <w:r>
+          <w:rPr>
+            <w:noProof/>
+            <w:webHidden/>
+          </w:rPr>
+          <w:fldChar w:fldCharType="begin"/>
+        </w:r>
+        <w:r>
+          <w:rPr>
+            <w:noProof/>
+            <w:webHidden/>
+          </w:rPr>
+          <w:instrText xml:space="preserve"> PAGEREF _Toc242876933 \h </w:instrText>
         </w:r>
         <w:r>
           <w:rPr>
@@ -3065,13 +2843,13 @@
           <w14:ligatures w14:val="standardContextual"/>
         </w:rPr>
       </w:pPr>
-      <w:hyperlink w:anchor="_Toc242874474" w:history="1">
+      <w:hyperlink w:anchor="_Toc242876934" w:history="1">
         <w:r>
           <w:rPr>
             <w:rStyle w:val="Hyperlink"/>
             <w:noProof/>
           </w:rPr>
-          <w:t>5.4 Chi phí từ Cost Explorer</w:t>
+          <w:t>5.1 Đối chứng hiệu quả lọc phân vùng</w:t>
         </w:r>
         <w:r>
           <w:rPr>
@@ -3092,7 +2870,81 @@
             <w:noProof/>
             <w:webHidden/>
           </w:rPr>
-          <w:instrText xml:space="preserve"> PAGEREF _Toc242874474 \h </w:instrText>
+          <w:instrText xml:space="preserve"> PAGEREF _Toc242876934 \h </w:instrText>
+        </w:r>
+        <w:r>
+          <w:rPr>
+            <w:noProof/>
+            <w:webHidden/>
+          </w:rPr>
+        </w:r>
+        <w:r>
+          <w:rPr>
+            <w:noProof/>
+            <w:webHidden/>
+          </w:rPr>
+          <w:fldChar w:fldCharType="separate"/>
+        </w:r>
+        <w:r>
+          <w:rPr>
+            <w:noProof/>
+            <w:webHidden/>
+          </w:rPr>
+          <w:t>28</w:t>
+        </w:r>
+        <w:r>
+          <w:rPr>
+            <w:noProof/>
+            <w:webHidden/>
+          </w:rPr>
+          <w:fldChar w:fldCharType="end"/>
+        </w:r>
+      </w:hyperlink>
+    </w:p>
+    <w:p>
+      <w:pPr>
+        <w:pStyle w:val="TOC2"/>
+        <w:tabs>
+          <w:tab w:val="right" w:leader="dot" w:pos="9926"/>
+        </w:tabs>
+        <w:rPr>
+          <w:rFonts w:asciiTheme="minorHAnsi" w:eastAsiaTheme="minorEastAsia" w:hAnsiTheme="minorHAnsi" w:cstheme="minorBidi"/>
+          <w:noProof/>
+          <w:color w:val="auto"/>
+          <w:kern w:val="2"/>
+          <w:szCs w:val="24"/>
+          <w:lang w:val="en-US" w:eastAsia="ja-JP"/>
+          <w14:ligatures w14:val="standardContextual"/>
+        </w:rPr>
+      </w:pPr>
+      <w:hyperlink w:anchor="_Toc242876935" w:history="1">
+        <w:r>
+          <w:rPr>
+            <w:rStyle w:val="Hyperlink"/>
+            <w:noProof/>
+          </w:rPr>
+          <w:t>5.2 Hai mươi bốn truy vấn phân tích mới</w:t>
+        </w:r>
+        <w:r>
+          <w:rPr>
+            <w:noProof/>
+            <w:webHidden/>
+          </w:rPr>
+          <w:tab/>
+        </w:r>
+        <w:r>
+          <w:rPr>
+            <w:noProof/>
+            <w:webHidden/>
+          </w:rPr>
+          <w:fldChar w:fldCharType="begin"/>
+        </w:r>
+        <w:r>
+          <w:rPr>
+            <w:noProof/>
+            <w:webHidden/>
+          </w:rPr>
+          <w:instrText xml:space="preserve"> PAGEREF _Toc242876935 \h </w:instrText>
         </w:r>
         <w:r>
           <w:rPr>
@@ -3125,13 +2977,12 @@
     </w:p>
     <w:p>
       <w:pPr>
-        <w:pStyle w:val="TOC1"/>
+        <w:pStyle w:val="TOC2"/>
         <w:tabs>
           <w:tab w:val="right" w:leader="dot" w:pos="9926"/>
         </w:tabs>
         <w:rPr>
           <w:rFonts w:asciiTheme="minorHAnsi" w:eastAsiaTheme="minorEastAsia" w:hAnsiTheme="minorHAnsi" w:cstheme="minorBidi"/>
-          <w:b w:val="0"/>
           <w:noProof/>
           <w:color w:val="auto"/>
           <w:kern w:val="2"/>
@@ -3140,13 +2991,13 @@
           <w14:ligatures w14:val="standardContextual"/>
         </w:rPr>
       </w:pPr>
-      <w:hyperlink w:anchor="_Toc242874475" w:history="1">
+      <w:hyperlink w:anchor="_Toc242876936" w:history="1">
         <w:r>
           <w:rPr>
             <w:rStyle w:val="Hyperlink"/>
             <w:noProof/>
           </w:rPr>
-          <w:t>Chương 6 Tổng hợp kết quả Tuần 2</w:t>
+          <w:t>5.3 Lịch sử truy vấn và phạm vi lỗi</w:t>
         </w:r>
         <w:r>
           <w:rPr>
@@ -3167,7 +3018,7 @@
             <w:noProof/>
             <w:webHidden/>
           </w:rPr>
-          <w:instrText xml:space="preserve"> PAGEREF _Toc242874475 \h </w:instrText>
+          <w:instrText xml:space="preserve"> PAGEREF _Toc242876936 \h </w:instrText>
         </w:r>
         <w:r>
           <w:rPr>
@@ -3214,7 +3065,156 @@
           <w14:ligatures w14:val="standardContextual"/>
         </w:rPr>
       </w:pPr>
-      <w:hyperlink w:anchor="_Toc242874476" w:history="1">
+      <w:hyperlink w:anchor="_Toc242876937" w:history="1">
+        <w:r>
+          <w:rPr>
+            <w:rStyle w:val="Hyperlink"/>
+            <w:noProof/>
+          </w:rPr>
+          <w:t>5.4 Chi phí từ Cost Explorer</w:t>
+        </w:r>
+        <w:r>
+          <w:rPr>
+            <w:noProof/>
+            <w:webHidden/>
+          </w:rPr>
+          <w:tab/>
+        </w:r>
+        <w:r>
+          <w:rPr>
+            <w:noProof/>
+            <w:webHidden/>
+          </w:rPr>
+          <w:fldChar w:fldCharType="begin"/>
+        </w:r>
+        <w:r>
+          <w:rPr>
+            <w:noProof/>
+            <w:webHidden/>
+          </w:rPr>
+          <w:instrText xml:space="preserve"> PAGEREF _Toc242876937 \h </w:instrText>
+        </w:r>
+        <w:r>
+          <w:rPr>
+            <w:noProof/>
+            <w:webHidden/>
+          </w:rPr>
+        </w:r>
+        <w:r>
+          <w:rPr>
+            <w:noProof/>
+            <w:webHidden/>
+          </w:rPr>
+          <w:fldChar w:fldCharType="separate"/>
+        </w:r>
+        <w:r>
+          <w:rPr>
+            <w:noProof/>
+            <w:webHidden/>
+          </w:rPr>
+          <w:t>31</w:t>
+        </w:r>
+        <w:r>
+          <w:rPr>
+            <w:noProof/>
+            <w:webHidden/>
+          </w:rPr>
+          <w:fldChar w:fldCharType="end"/>
+        </w:r>
+      </w:hyperlink>
+    </w:p>
+    <w:p>
+      <w:pPr>
+        <w:pStyle w:val="TOC1"/>
+        <w:tabs>
+          <w:tab w:val="right" w:leader="dot" w:pos="9926"/>
+        </w:tabs>
+        <w:rPr>
+          <w:rFonts w:asciiTheme="minorHAnsi" w:eastAsiaTheme="minorEastAsia" w:hAnsiTheme="minorHAnsi" w:cstheme="minorBidi"/>
+          <w:b w:val="0"/>
+          <w:noProof/>
+          <w:color w:val="auto"/>
+          <w:kern w:val="2"/>
+          <w:szCs w:val="24"/>
+          <w:lang w:val="en-US" w:eastAsia="ja-JP"/>
+          <w14:ligatures w14:val="standardContextual"/>
+        </w:rPr>
+      </w:pPr>
+      <w:hyperlink w:anchor="_Toc242876938" w:history="1">
+        <w:r>
+          <w:rPr>
+            <w:rStyle w:val="Hyperlink"/>
+            <w:noProof/>
+          </w:rPr>
+          <w:t>Chương 6 Tổng hợp kết quả Tuần 2</w:t>
+        </w:r>
+        <w:r>
+          <w:rPr>
+            <w:noProof/>
+            <w:webHidden/>
+          </w:rPr>
+          <w:tab/>
+        </w:r>
+        <w:r>
+          <w:rPr>
+            <w:noProof/>
+            <w:webHidden/>
+          </w:rPr>
+          <w:fldChar w:fldCharType="begin"/>
+        </w:r>
+        <w:r>
+          <w:rPr>
+            <w:noProof/>
+            <w:webHidden/>
+          </w:rPr>
+          <w:instrText xml:space="preserve"> PAGEREF _Toc242876938 \h </w:instrText>
+        </w:r>
+        <w:r>
+          <w:rPr>
+            <w:noProof/>
+            <w:webHidden/>
+          </w:rPr>
+        </w:r>
+        <w:r>
+          <w:rPr>
+            <w:noProof/>
+            <w:webHidden/>
+          </w:rPr>
+          <w:fldChar w:fldCharType="separate"/>
+        </w:r>
+        <w:r>
+          <w:rPr>
+            <w:noProof/>
+            <w:webHidden/>
+          </w:rPr>
+          <w:t>32</w:t>
+        </w:r>
+        <w:r>
+          <w:rPr>
+            <w:noProof/>
+            <w:webHidden/>
+          </w:rPr>
+          <w:fldChar w:fldCharType="end"/>
+        </w:r>
+      </w:hyperlink>
+    </w:p>
+    <w:p>
+      <w:pPr>
+        <w:pStyle w:val="TOC2"/>
+        <w:tabs>
+          <w:tab w:val="right" w:leader="dot" w:pos="9926"/>
+        </w:tabs>
+        <w:rPr>
+          <w:rFonts w:asciiTheme="minorHAnsi" w:eastAsiaTheme="minorEastAsia" w:hAnsiTheme="minorHAnsi" w:cstheme="minorBidi"/>
+          <w:noProof/>
+          <w:color w:val="auto"/>
+          <w:kern w:val="2"/>
+          <w:szCs w:val="24"/>
+          <w:lang w:val="en-US" w:eastAsia="ja-JP"/>
+          <w14:ligatures w14:val="standardContextual"/>
+        </w:rPr>
+      </w:pPr>
+      <w:hyperlink w:anchor="_Toc242876939" w:history="1">
         <w:r>
           <w:rPr>
             <w:rStyle w:val="Hyperlink"/>
@@ -3241,7 +3241,7 @@
             <w:noProof/>
             <w:webHidden/>
           </w:rPr>
-          <w:instrText xml:space="preserve"> PAGEREF _Toc242874476 \h </w:instrText>
+          <w:instrText xml:space="preserve"> PAGEREF _Toc242876939 \h </w:instrText>
         </w:r>
         <w:r>
           <w:rPr>
@@ -3261,7 +3261,7 @@
             <w:noProof/>
             <w:webHidden/>
           </w:rPr>
-          <w:t>30</w:t>
+          <w:t>32</w:t>
         </w:r>
         <w:r>
           <w:rPr>
@@ -3288,7 +3288,7 @@
           <w14:ligatures w14:val="standardContextual"/>
         </w:rPr>
       </w:pPr>
-      <w:hyperlink w:anchor="_Toc242874477" w:history="1">
+      <w:hyperlink w:anchor="_Toc242876940" w:history="1">
         <w:r>
           <w:rPr>
             <w:rStyle w:val="Hyperlink"/>
@@ -3315,7 +3315,7 @@
             <w:noProof/>
             <w:webHidden/>
           </w:rPr>
-          <w:instrText xml:space="preserve"> PAGEREF _Toc242874477 \h </w:instrText>
+          <w:instrText xml:space="preserve"> PAGEREF _Toc242876940 \h </w:instrText>
         </w:r>
         <w:r>
           <w:rPr>
@@ -3335,7 +3335,7 @@
             <w:noProof/>
             <w:webHidden/>
           </w:rPr>
-          <w:t>30</w:t>
+          <w:t>32</w:t>
         </w:r>
         <w:r>
           <w:rPr>
@@ -3380,6 +3380,8 @@
       <w:bookmarkStart w:id="4" w:name="_Toc242871748"/>
       <w:bookmarkStart w:id="5" w:name="_Toc242872936"/>
       <w:bookmarkStart w:id="6" w:name="_Toc242874440"/>
+      <w:bookmarkStart w:id="7" w:name="_Toc242875938"/>
+      <w:bookmarkStart w:id="8" w:name="_Toc242876903"/>
       <w:r>
         <w:lastRenderedPageBreak/>
         <w:t>Chương 1 Phạm vi và hệ thống thực hành Tuần 2</w:t>
@@ -3391,28 +3393,34 @@
       <w:bookmarkEnd w:id="4"/>
       <w:bookmarkEnd w:id="5"/>
       <w:bookmarkEnd w:id="6"/>
+      <w:bookmarkEnd w:id="7"/>
+      <w:bookmarkEnd w:id="8"/>
     </w:p>
     <w:p>
       <w:pPr>
         <w:pStyle w:val="Heading2"/>
       </w:pPr>
-      <w:bookmarkStart w:id="7" w:name="_Toc242867453"/>
-      <w:bookmarkStart w:id="8" w:name="_Toc242869264"/>
-      <w:bookmarkStart w:id="9" w:name="_Toc242869424"/>
-      <w:bookmarkStart w:id="10" w:name="_Toc242871561"/>
-      <w:bookmarkStart w:id="11" w:name="_Toc242871749"/>
-      <w:bookmarkStart w:id="12" w:name="_Toc242872937"/>
-      <w:bookmarkStart w:id="13" w:name="_Toc242874441"/>
+      <w:bookmarkStart w:id="9" w:name="_Toc242867453"/>
+      <w:bookmarkStart w:id="10" w:name="_Toc242869264"/>
+      <w:bookmarkStart w:id="11" w:name="_Toc242869424"/>
+      <w:bookmarkStart w:id="12" w:name="_Toc242871561"/>
+      <w:bookmarkStart w:id="13" w:name="_Toc242871749"/>
+      <w:bookmarkStart w:id="14" w:name="_Toc242872937"/>
+      <w:bookmarkStart w:id="15" w:name="_Toc242874441"/>
+      <w:bookmarkStart w:id="16" w:name="_Toc242875939"/>
+      <w:bookmarkStart w:id="17" w:name="_Toc242876904"/>
       <w:r>
         <w:t>1.1 Mục tiêu và phạm vi số liệu</w:t>
       </w:r>
-      <w:bookmarkEnd w:id="7"/>
-      <w:bookmarkEnd w:id="8"/>
       <w:bookmarkEnd w:id="9"/>
       <w:bookmarkEnd w:id="10"/>
       <w:bookmarkEnd w:id="11"/>
       <w:bookmarkEnd w:id="12"/>
       <w:bookmarkEnd w:id="13"/>
+      <w:bookmarkEnd w:id="14"/>
+      <w:bookmarkEnd w:id="15"/>
+      <w:bookmarkEnd w:id="16"/>
+      <w:bookmarkEnd w:id="17"/>
     </w:p>
     <w:p>
       <w:pPr>
@@ -3436,23 +3444,27 @@
       <w:pPr>
         <w:pStyle w:val="Heading2"/>
       </w:pPr>
-      <w:bookmarkStart w:id="14" w:name="_Toc242867454"/>
-      <w:bookmarkStart w:id="15" w:name="_Toc242869265"/>
-      <w:bookmarkStart w:id="16" w:name="_Toc242869425"/>
-      <w:bookmarkStart w:id="17" w:name="_Toc242871562"/>
-      <w:bookmarkStart w:id="18" w:name="_Toc242871750"/>
-      <w:bookmarkStart w:id="19" w:name="_Toc242872938"/>
-      <w:bookmarkStart w:id="20" w:name="_Toc242874442"/>
+      <w:bookmarkStart w:id="18" w:name="_Toc242867454"/>
+      <w:bookmarkStart w:id="19" w:name="_Toc242869265"/>
+      <w:bookmarkStart w:id="20" w:name="_Toc242869425"/>
+      <w:bookmarkStart w:id="21" w:name="_Toc242871562"/>
+      <w:bookmarkStart w:id="22" w:name="_Toc242871750"/>
+      <w:bookmarkStart w:id="23" w:name="_Toc242872938"/>
+      <w:bookmarkStart w:id="24" w:name="_Toc242874442"/>
+      <w:bookmarkStart w:id="25" w:name="_Toc242875940"/>
+      <w:bookmarkStart w:id="26" w:name="_Toc242876905"/>
       <w:r>
         <w:t>1.2 Phân công và thời gian thực hiện</w:t>
       </w:r>
-      <w:bookmarkEnd w:id="14"/>
-      <w:bookmarkEnd w:id="15"/>
-      <w:bookmarkEnd w:id="16"/>
-      <w:bookmarkEnd w:id="17"/>
       <w:bookmarkEnd w:id="18"/>
       <w:bookmarkEnd w:id="19"/>
       <w:bookmarkEnd w:id="20"/>
+      <w:bookmarkEnd w:id="21"/>
+      <w:bookmarkEnd w:id="22"/>
+      <w:bookmarkEnd w:id="23"/>
+      <w:bookmarkEnd w:id="24"/>
+      <w:bookmarkEnd w:id="25"/>
+      <w:bookmarkEnd w:id="26"/>
     </w:p>
     <w:p>
       <w:pPr>
@@ -3760,24 +3772,28 @@
         <w:pStyle w:val="Heading2"/>
         <w:pageBreakBefore/>
       </w:pPr>
-      <w:bookmarkStart w:id="21" w:name="_Toc242867455"/>
-      <w:bookmarkStart w:id="22" w:name="_Toc242869266"/>
-      <w:bookmarkStart w:id="23" w:name="_Toc242869426"/>
-      <w:bookmarkStart w:id="24" w:name="_Toc242871563"/>
-      <w:bookmarkStart w:id="25" w:name="_Toc242871751"/>
-      <w:bookmarkStart w:id="26" w:name="_Toc242872939"/>
-      <w:bookmarkStart w:id="27" w:name="_Toc242874443"/>
+      <w:bookmarkStart w:id="27" w:name="_Toc242867455"/>
+      <w:bookmarkStart w:id="28" w:name="_Toc242869266"/>
+      <w:bookmarkStart w:id="29" w:name="_Toc242869426"/>
+      <w:bookmarkStart w:id="30" w:name="_Toc242871563"/>
+      <w:bookmarkStart w:id="31" w:name="_Toc242871751"/>
+      <w:bookmarkStart w:id="32" w:name="_Toc242872939"/>
+      <w:bookmarkStart w:id="33" w:name="_Toc242874443"/>
+      <w:bookmarkStart w:id="34" w:name="_Toc242875941"/>
+      <w:bookmarkStart w:id="35" w:name="_Toc242876906"/>
       <w:r>
         <w:lastRenderedPageBreak/>
         <w:t>1.3 Kiến trúc và luồng xử lý</w:t>
       </w:r>
-      <w:bookmarkEnd w:id="21"/>
-      <w:bookmarkEnd w:id="22"/>
-      <w:bookmarkEnd w:id="23"/>
-      <w:bookmarkEnd w:id="24"/>
-      <w:bookmarkEnd w:id="25"/>
-      <w:bookmarkEnd w:id="26"/>
       <w:bookmarkEnd w:id="27"/>
+      <w:bookmarkEnd w:id="28"/>
+      <w:bookmarkEnd w:id="29"/>
+      <w:bookmarkEnd w:id="30"/>
+      <w:bookmarkEnd w:id="31"/>
+      <w:bookmarkEnd w:id="32"/>
+      <w:bookmarkEnd w:id="33"/>
+      <w:bookmarkEnd w:id="34"/>
+      <w:bookmarkEnd w:id="35"/>
     </w:p>
     <w:p>
       <w:pPr>
@@ -3850,24 +3866,28 @@
         <w:pStyle w:val="Heading2"/>
         <w:pageBreakBefore/>
       </w:pPr>
-      <w:bookmarkStart w:id="28" w:name="_Toc242867456"/>
-      <w:bookmarkStart w:id="29" w:name="_Toc242869267"/>
-      <w:bookmarkStart w:id="30" w:name="_Toc242869427"/>
-      <w:bookmarkStart w:id="31" w:name="_Toc242871564"/>
-      <w:bookmarkStart w:id="32" w:name="_Toc242871752"/>
-      <w:bookmarkStart w:id="33" w:name="_Toc242872940"/>
-      <w:bookmarkStart w:id="34" w:name="_Toc242874444"/>
+      <w:bookmarkStart w:id="36" w:name="_Toc242867456"/>
+      <w:bookmarkStart w:id="37" w:name="_Toc242869267"/>
+      <w:bookmarkStart w:id="38" w:name="_Toc242869427"/>
+      <w:bookmarkStart w:id="39" w:name="_Toc242871564"/>
+      <w:bookmarkStart w:id="40" w:name="_Toc242871752"/>
+      <w:bookmarkStart w:id="41" w:name="_Toc242872940"/>
+      <w:bookmarkStart w:id="42" w:name="_Toc242874444"/>
+      <w:bookmarkStart w:id="43" w:name="_Toc242875942"/>
+      <w:bookmarkStart w:id="44" w:name="_Toc242876907"/>
       <w:r>
         <w:lastRenderedPageBreak/>
         <w:t>1.4 Trạng thái dịch vụ tại lần đọc hiện tại</w:t>
       </w:r>
-      <w:bookmarkEnd w:id="28"/>
-      <w:bookmarkEnd w:id="29"/>
-      <w:bookmarkEnd w:id="30"/>
-      <w:bookmarkEnd w:id="31"/>
-      <w:bookmarkEnd w:id="32"/>
-      <w:bookmarkEnd w:id="33"/>
-      <w:bookmarkEnd w:id="34"/>
+      <w:bookmarkEnd w:id="36"/>
+      <w:bookmarkEnd w:id="37"/>
+      <w:bookmarkEnd w:id="38"/>
+      <w:bookmarkEnd w:id="39"/>
+      <w:bookmarkEnd w:id="40"/>
+      <w:bookmarkEnd w:id="41"/>
+      <w:bookmarkEnd w:id="42"/>
+      <w:bookmarkEnd w:id="43"/>
+      <w:bookmarkEnd w:id="44"/>
     </w:p>
     <w:p>
       <w:pPr>
@@ -4364,46 +4384,54 @@
         <w:pageBreakBefore/>
         <w:jc w:val="left"/>
       </w:pPr>
-      <w:bookmarkStart w:id="35" w:name="_Toc242867457"/>
-      <w:bookmarkStart w:id="36" w:name="_Toc242869268"/>
-      <w:bookmarkStart w:id="37" w:name="_Toc242869428"/>
-      <w:bookmarkStart w:id="38" w:name="_Toc242871565"/>
-      <w:bookmarkStart w:id="39" w:name="_Toc242871753"/>
-      <w:bookmarkStart w:id="40" w:name="_Toc242872941"/>
-      <w:bookmarkStart w:id="41" w:name="_Toc242874445"/>
+      <w:bookmarkStart w:id="45" w:name="_Toc242867457"/>
+      <w:bookmarkStart w:id="46" w:name="_Toc242869268"/>
+      <w:bookmarkStart w:id="47" w:name="_Toc242869428"/>
+      <w:bookmarkStart w:id="48" w:name="_Toc242871565"/>
+      <w:bookmarkStart w:id="49" w:name="_Toc242871753"/>
+      <w:bookmarkStart w:id="50" w:name="_Toc242872941"/>
+      <w:bookmarkStart w:id="51" w:name="_Toc242874445"/>
+      <w:bookmarkStart w:id="52" w:name="_Toc242875943"/>
+      <w:bookmarkStart w:id="53" w:name="_Toc242876908"/>
       <w:r>
         <w:lastRenderedPageBreak/>
         <w:t>Chương 2 Nguồn dữ liệu và phương pháp phân tích</w:t>
       </w:r>
-      <w:bookmarkEnd w:id="35"/>
-      <w:bookmarkEnd w:id="36"/>
-      <w:bookmarkEnd w:id="37"/>
-      <w:bookmarkEnd w:id="38"/>
-      <w:bookmarkEnd w:id="39"/>
-      <w:bookmarkEnd w:id="40"/>
-      <w:bookmarkEnd w:id="41"/>
+      <w:bookmarkEnd w:id="45"/>
+      <w:bookmarkEnd w:id="46"/>
+      <w:bookmarkEnd w:id="47"/>
+      <w:bookmarkEnd w:id="48"/>
+      <w:bookmarkEnd w:id="49"/>
+      <w:bookmarkEnd w:id="50"/>
+      <w:bookmarkEnd w:id="51"/>
+      <w:bookmarkEnd w:id="52"/>
+      <w:bookmarkEnd w:id="53"/>
     </w:p>
     <w:p>
       <w:pPr>
         <w:pStyle w:val="Heading2"/>
       </w:pPr>
-      <w:bookmarkStart w:id="42" w:name="_Toc242867458"/>
-      <w:bookmarkStart w:id="43" w:name="_Toc242869269"/>
-      <w:bookmarkStart w:id="44" w:name="_Toc242869429"/>
-      <w:bookmarkStart w:id="45" w:name="_Toc242871566"/>
-      <w:bookmarkStart w:id="46" w:name="_Toc242871754"/>
-      <w:bookmarkStart w:id="47" w:name="_Toc242872942"/>
-      <w:bookmarkStart w:id="48" w:name="_Toc242874446"/>
+      <w:bookmarkStart w:id="54" w:name="_Toc242867458"/>
+      <w:bookmarkStart w:id="55" w:name="_Toc242869269"/>
+      <w:bookmarkStart w:id="56" w:name="_Toc242869429"/>
+      <w:bookmarkStart w:id="57" w:name="_Toc242871566"/>
+      <w:bookmarkStart w:id="58" w:name="_Toc242871754"/>
+      <w:bookmarkStart w:id="59" w:name="_Toc242872942"/>
+      <w:bookmarkStart w:id="60" w:name="_Toc242874446"/>
+      <w:bookmarkStart w:id="61" w:name="_Toc242875944"/>
+      <w:bookmarkStart w:id="62" w:name="_Toc242876909"/>
       <w:r>
         <w:t>2.1 Toàn bộ dữ liệu và mẫu thuộc Tuần 2</w:t>
       </w:r>
-      <w:bookmarkEnd w:id="42"/>
-      <w:bookmarkEnd w:id="43"/>
-      <w:bookmarkEnd w:id="44"/>
-      <w:bookmarkEnd w:id="45"/>
-      <w:bookmarkEnd w:id="46"/>
-      <w:bookmarkEnd w:id="47"/>
-      <w:bookmarkEnd w:id="48"/>
+      <w:bookmarkEnd w:id="54"/>
+      <w:bookmarkEnd w:id="55"/>
+      <w:bookmarkEnd w:id="56"/>
+      <w:bookmarkEnd w:id="57"/>
+      <w:bookmarkEnd w:id="58"/>
+      <w:bookmarkEnd w:id="59"/>
+      <w:bookmarkEnd w:id="60"/>
+      <w:bookmarkEnd w:id="61"/>
+      <w:bookmarkEnd w:id="62"/>
     </w:p>
     <w:p>
       <w:pPr>
@@ -4880,24 +4908,28 @@
         <w:pStyle w:val="Heading2"/>
         <w:pageBreakBefore/>
       </w:pPr>
-      <w:bookmarkStart w:id="49" w:name="_Toc242867459"/>
-      <w:bookmarkStart w:id="50" w:name="_Toc242869270"/>
-      <w:bookmarkStart w:id="51" w:name="_Toc242869430"/>
-      <w:bookmarkStart w:id="52" w:name="_Toc242871567"/>
-      <w:bookmarkStart w:id="53" w:name="_Toc242871755"/>
-      <w:bookmarkStart w:id="54" w:name="_Toc242872943"/>
-      <w:bookmarkStart w:id="55" w:name="_Toc242874447"/>
+      <w:bookmarkStart w:id="63" w:name="_Toc242867459"/>
+      <w:bookmarkStart w:id="64" w:name="_Toc242869270"/>
+      <w:bookmarkStart w:id="65" w:name="_Toc242869430"/>
+      <w:bookmarkStart w:id="66" w:name="_Toc242871567"/>
+      <w:bookmarkStart w:id="67" w:name="_Toc242871755"/>
+      <w:bookmarkStart w:id="68" w:name="_Toc242872943"/>
+      <w:bookmarkStart w:id="69" w:name="_Toc242874447"/>
+      <w:bookmarkStart w:id="70" w:name="_Toc242875945"/>
+      <w:bookmarkStart w:id="71" w:name="_Toc242876910"/>
       <w:r>
         <w:lastRenderedPageBreak/>
         <w:t>2.2 Cấu trúc và chất lượng bản ghi</w:t>
       </w:r>
-      <w:bookmarkEnd w:id="49"/>
-      <w:bookmarkEnd w:id="50"/>
-      <w:bookmarkEnd w:id="51"/>
-      <w:bookmarkEnd w:id="52"/>
-      <w:bookmarkEnd w:id="53"/>
-      <w:bookmarkEnd w:id="54"/>
-      <w:bookmarkEnd w:id="55"/>
+      <w:bookmarkEnd w:id="63"/>
+      <w:bookmarkEnd w:id="64"/>
+      <w:bookmarkEnd w:id="65"/>
+      <w:bookmarkEnd w:id="66"/>
+      <w:bookmarkEnd w:id="67"/>
+      <w:bookmarkEnd w:id="68"/>
+      <w:bookmarkEnd w:id="69"/>
+      <w:bookmarkEnd w:id="70"/>
+      <w:bookmarkEnd w:id="71"/>
     </w:p>
     <w:p>
       <w:pPr>
@@ -5258,13 +5290,17 @@
       <w:pPr>
         <w:pStyle w:val="Heading2"/>
       </w:pPr>
-      <w:bookmarkStart w:id="56" w:name="_Toc242872944"/>
-      <w:bookmarkStart w:id="57" w:name="_Toc242874448"/>
+      <w:bookmarkStart w:id="72" w:name="_Toc242872944"/>
+      <w:bookmarkStart w:id="73" w:name="_Toc242874448"/>
+      <w:bookmarkStart w:id="74" w:name="_Toc242875946"/>
+      <w:bookmarkStart w:id="75" w:name="_Toc242876911"/>
       <w:r>
         <w:t>2.3 Hai bộ báo cáo dữ liệu của nhóm</w:t>
       </w:r>
-      <w:bookmarkEnd w:id="56"/>
-      <w:bookmarkEnd w:id="57"/>
+      <w:bookmarkEnd w:id="72"/>
+      <w:bookmarkEnd w:id="73"/>
+      <w:bookmarkEnd w:id="74"/>
+      <w:bookmarkEnd w:id="75"/>
     </w:p>
     <w:p>
       <w:pPr>
@@ -5288,24 +5324,28 @@
       <w:pPr>
         <w:pStyle w:val="Heading2"/>
       </w:pPr>
-      <w:bookmarkStart w:id="58" w:name="_Toc242867461"/>
-      <w:bookmarkStart w:id="59" w:name="_Toc242869272"/>
-      <w:bookmarkStart w:id="60" w:name="_Toc242869432"/>
-      <w:bookmarkStart w:id="61" w:name="_Toc242871569"/>
-      <w:bookmarkStart w:id="62" w:name="_Toc242871757"/>
-      <w:bookmarkStart w:id="63" w:name="_Toc242872945"/>
-      <w:bookmarkStart w:id="64" w:name="_Toc242874449"/>
+      <w:bookmarkStart w:id="76" w:name="_Toc242867461"/>
+      <w:bookmarkStart w:id="77" w:name="_Toc242869272"/>
+      <w:bookmarkStart w:id="78" w:name="_Toc242869432"/>
+      <w:bookmarkStart w:id="79" w:name="_Toc242871569"/>
+      <w:bookmarkStart w:id="80" w:name="_Toc242871757"/>
+      <w:bookmarkStart w:id="81" w:name="_Toc242872945"/>
+      <w:bookmarkStart w:id="82" w:name="_Toc242874449"/>
+      <w:bookmarkStart w:id="83" w:name="_Toc242875947"/>
+      <w:bookmarkStart w:id="84" w:name="_Toc242876912"/>
       <w:r>
         <w:lastRenderedPageBreak/>
         <w:t>2.4 Các đại lượng và cách diễn giải</w:t>
       </w:r>
-      <w:bookmarkEnd w:id="58"/>
-      <w:bookmarkEnd w:id="59"/>
-      <w:bookmarkEnd w:id="60"/>
-      <w:bookmarkEnd w:id="61"/>
-      <w:bookmarkEnd w:id="62"/>
-      <w:bookmarkEnd w:id="63"/>
-      <w:bookmarkEnd w:id="64"/>
+      <w:bookmarkEnd w:id="76"/>
+      <w:bookmarkEnd w:id="77"/>
+      <w:bookmarkEnd w:id="78"/>
+      <w:bookmarkEnd w:id="79"/>
+      <w:bookmarkEnd w:id="80"/>
+      <w:bookmarkEnd w:id="81"/>
+      <w:bookmarkEnd w:id="82"/>
+      <w:bookmarkEnd w:id="83"/>
+      <w:bookmarkEnd w:id="84"/>
     </w:p>
     <w:p>
       <w:pPr>
@@ -5647,24 +5687,28 @@
         <w:pStyle w:val="Heading2"/>
         <w:pageBreakBefore/>
       </w:pPr>
-      <w:bookmarkStart w:id="65" w:name="_Toc242867462"/>
-      <w:bookmarkStart w:id="66" w:name="_Toc242869273"/>
-      <w:bookmarkStart w:id="67" w:name="_Toc242869433"/>
-      <w:bookmarkStart w:id="68" w:name="_Toc242871570"/>
-      <w:bookmarkStart w:id="69" w:name="_Toc242871758"/>
-      <w:bookmarkStart w:id="70" w:name="_Toc242872946"/>
-      <w:bookmarkStart w:id="71" w:name="_Toc242874450"/>
+      <w:bookmarkStart w:id="85" w:name="_Toc242867462"/>
+      <w:bookmarkStart w:id="86" w:name="_Toc242869273"/>
+      <w:bookmarkStart w:id="87" w:name="_Toc242869433"/>
+      <w:bookmarkStart w:id="88" w:name="_Toc242871570"/>
+      <w:bookmarkStart w:id="89" w:name="_Toc242871758"/>
+      <w:bookmarkStart w:id="90" w:name="_Toc242872946"/>
+      <w:bookmarkStart w:id="91" w:name="_Toc242874450"/>
+      <w:bookmarkStart w:id="92" w:name="_Toc242875948"/>
+      <w:bookmarkStart w:id="93" w:name="_Toc242876913"/>
       <w:r>
         <w:lastRenderedPageBreak/>
         <w:t>2.5 Thiết kế chức năng thu thập bằng Lambda</w:t>
       </w:r>
-      <w:bookmarkEnd w:id="65"/>
-      <w:bookmarkEnd w:id="66"/>
-      <w:bookmarkEnd w:id="67"/>
-      <w:bookmarkEnd w:id="68"/>
-      <w:bookmarkEnd w:id="69"/>
-      <w:bookmarkEnd w:id="70"/>
-      <w:bookmarkEnd w:id="71"/>
+      <w:bookmarkEnd w:id="85"/>
+      <w:bookmarkEnd w:id="86"/>
+      <w:bookmarkEnd w:id="87"/>
+      <w:bookmarkEnd w:id="88"/>
+      <w:bookmarkEnd w:id="89"/>
+      <w:bookmarkEnd w:id="90"/>
+      <w:bookmarkEnd w:id="91"/>
+      <w:bookmarkEnd w:id="92"/>
+      <w:bookmarkEnd w:id="93"/>
     </w:p>
     <w:p>
       <w:pPr>
@@ -6105,24 +6149,28 @@
         <w:pStyle w:val="Heading2"/>
         <w:pageBreakBefore/>
       </w:pPr>
-      <w:bookmarkStart w:id="72" w:name="_Toc242867463"/>
-      <w:bookmarkStart w:id="73" w:name="_Toc242869274"/>
-      <w:bookmarkStart w:id="74" w:name="_Toc242869434"/>
-      <w:bookmarkStart w:id="75" w:name="_Toc242871571"/>
-      <w:bookmarkStart w:id="76" w:name="_Toc242871759"/>
-      <w:bookmarkStart w:id="77" w:name="_Toc242872947"/>
-      <w:bookmarkStart w:id="78" w:name="_Toc242874451"/>
+      <w:bookmarkStart w:id="94" w:name="_Toc242867463"/>
+      <w:bookmarkStart w:id="95" w:name="_Toc242869274"/>
+      <w:bookmarkStart w:id="96" w:name="_Toc242869434"/>
+      <w:bookmarkStart w:id="97" w:name="_Toc242871571"/>
+      <w:bookmarkStart w:id="98" w:name="_Toc242871759"/>
+      <w:bookmarkStart w:id="99" w:name="_Toc242872947"/>
+      <w:bookmarkStart w:id="100" w:name="_Toc242874451"/>
+      <w:bookmarkStart w:id="101" w:name="_Toc242875949"/>
+      <w:bookmarkStart w:id="102" w:name="_Toc242876914"/>
       <w:r>
         <w:lastRenderedPageBreak/>
         <w:t>2.6 Lược đồ bản ghi và truy vấn dữ liệu</w:t>
       </w:r>
-      <w:bookmarkEnd w:id="72"/>
-      <w:bookmarkEnd w:id="73"/>
-      <w:bookmarkEnd w:id="74"/>
-      <w:bookmarkEnd w:id="75"/>
-      <w:bookmarkEnd w:id="76"/>
-      <w:bookmarkEnd w:id="77"/>
-      <w:bookmarkEnd w:id="78"/>
+      <w:bookmarkEnd w:id="94"/>
+      <w:bookmarkEnd w:id="95"/>
+      <w:bookmarkEnd w:id="96"/>
+      <w:bookmarkEnd w:id="97"/>
+      <w:bookmarkEnd w:id="98"/>
+      <w:bookmarkEnd w:id="99"/>
+      <w:bookmarkEnd w:id="100"/>
+      <w:bookmarkEnd w:id="101"/>
+      <w:bookmarkEnd w:id="102"/>
     </w:p>
     <w:p>
       <w:pPr>
@@ -8050,24 +8098,28 @@
         <w:pStyle w:val="Heading2"/>
         <w:pageBreakBefore/>
       </w:pPr>
-      <w:bookmarkStart w:id="79" w:name="_Toc242867464"/>
-      <w:bookmarkStart w:id="80" w:name="_Toc242869275"/>
-      <w:bookmarkStart w:id="81" w:name="_Toc242869435"/>
-      <w:bookmarkStart w:id="82" w:name="_Toc242871572"/>
-      <w:bookmarkStart w:id="83" w:name="_Toc242871760"/>
-      <w:bookmarkStart w:id="84" w:name="_Toc242872948"/>
-      <w:bookmarkStart w:id="85" w:name="_Toc242874452"/>
+      <w:bookmarkStart w:id="103" w:name="_Toc242867464"/>
+      <w:bookmarkStart w:id="104" w:name="_Toc242869275"/>
+      <w:bookmarkStart w:id="105" w:name="_Toc242869435"/>
+      <w:bookmarkStart w:id="106" w:name="_Toc242871572"/>
+      <w:bookmarkStart w:id="107" w:name="_Toc242871760"/>
+      <w:bookmarkStart w:id="108" w:name="_Toc242872948"/>
+      <w:bookmarkStart w:id="109" w:name="_Toc242874452"/>
+      <w:bookmarkStart w:id="110" w:name="_Toc242875950"/>
+      <w:bookmarkStart w:id="111" w:name="_Toc242876915"/>
       <w:r>
         <w:lastRenderedPageBreak/>
         <w:t>2.7 Quyền kích hoạt và điều kiện gửi thông báo</w:t>
       </w:r>
-      <w:bookmarkEnd w:id="79"/>
-      <w:bookmarkEnd w:id="80"/>
-      <w:bookmarkEnd w:id="81"/>
-      <w:bookmarkEnd w:id="82"/>
-      <w:bookmarkEnd w:id="83"/>
-      <w:bookmarkEnd w:id="84"/>
-      <w:bookmarkEnd w:id="85"/>
+      <w:bookmarkEnd w:id="103"/>
+      <w:bookmarkEnd w:id="104"/>
+      <w:bookmarkEnd w:id="105"/>
+      <w:bookmarkEnd w:id="106"/>
+      <w:bookmarkEnd w:id="107"/>
+      <w:bookmarkEnd w:id="108"/>
+      <w:bookmarkEnd w:id="109"/>
+      <w:bookmarkEnd w:id="110"/>
+      <w:bookmarkEnd w:id="111"/>
     </w:p>
     <w:p>
       <w:pPr>
@@ -8093,46 +8145,54 @@
         <w:pageBreakBefore/>
         <w:jc w:val="left"/>
       </w:pPr>
-      <w:bookmarkStart w:id="86" w:name="_Toc242867465"/>
-      <w:bookmarkStart w:id="87" w:name="_Toc242869276"/>
-      <w:bookmarkStart w:id="88" w:name="_Toc242869436"/>
-      <w:bookmarkStart w:id="89" w:name="_Toc242871573"/>
-      <w:bookmarkStart w:id="90" w:name="_Toc242871761"/>
-      <w:bookmarkStart w:id="91" w:name="_Toc242872949"/>
-      <w:bookmarkStart w:id="92" w:name="_Toc242874453"/>
+      <w:bookmarkStart w:id="112" w:name="_Toc242867465"/>
+      <w:bookmarkStart w:id="113" w:name="_Toc242869276"/>
+      <w:bookmarkStart w:id="114" w:name="_Toc242869436"/>
+      <w:bookmarkStart w:id="115" w:name="_Toc242871573"/>
+      <w:bookmarkStart w:id="116" w:name="_Toc242871761"/>
+      <w:bookmarkStart w:id="117" w:name="_Toc242872949"/>
+      <w:bookmarkStart w:id="118" w:name="_Toc242874453"/>
+      <w:bookmarkStart w:id="119" w:name="_Toc242875951"/>
+      <w:bookmarkStart w:id="120" w:name="_Toc242876916"/>
       <w:r>
         <w:lastRenderedPageBreak/>
         <w:t>Chương 3 Phân tích dữ liệu môi trường Tuần 2</w:t>
       </w:r>
-      <w:bookmarkEnd w:id="86"/>
-      <w:bookmarkEnd w:id="87"/>
-      <w:bookmarkEnd w:id="88"/>
-      <w:bookmarkEnd w:id="89"/>
-      <w:bookmarkEnd w:id="90"/>
-      <w:bookmarkEnd w:id="91"/>
-      <w:bookmarkEnd w:id="92"/>
+      <w:bookmarkEnd w:id="112"/>
+      <w:bookmarkEnd w:id="113"/>
+      <w:bookmarkEnd w:id="114"/>
+      <w:bookmarkEnd w:id="115"/>
+      <w:bookmarkEnd w:id="116"/>
+      <w:bookmarkEnd w:id="117"/>
+      <w:bookmarkEnd w:id="118"/>
+      <w:bookmarkEnd w:id="119"/>
+      <w:bookmarkEnd w:id="120"/>
     </w:p>
     <w:p>
       <w:pPr>
         <w:pStyle w:val="Heading2"/>
       </w:pPr>
-      <w:bookmarkStart w:id="93" w:name="_Toc242867466"/>
-      <w:bookmarkStart w:id="94" w:name="_Toc242869277"/>
-      <w:bookmarkStart w:id="95" w:name="_Toc242869437"/>
-      <w:bookmarkStart w:id="96" w:name="_Toc242871574"/>
-      <w:bookmarkStart w:id="97" w:name="_Toc242871762"/>
-      <w:bookmarkStart w:id="98" w:name="_Toc242872950"/>
-      <w:bookmarkStart w:id="99" w:name="_Toc242874454"/>
+      <w:bookmarkStart w:id="121" w:name="_Toc242867466"/>
+      <w:bookmarkStart w:id="122" w:name="_Toc242869277"/>
+      <w:bookmarkStart w:id="123" w:name="_Toc242869437"/>
+      <w:bookmarkStart w:id="124" w:name="_Toc242871574"/>
+      <w:bookmarkStart w:id="125" w:name="_Toc242871762"/>
+      <w:bookmarkStart w:id="126" w:name="_Toc242872950"/>
+      <w:bookmarkStart w:id="127" w:name="_Toc242874454"/>
+      <w:bookmarkStart w:id="128" w:name="_Toc242875952"/>
+      <w:bookmarkStart w:id="129" w:name="_Toc242876917"/>
       <w:r>
         <w:t>3.1 So sánh AQI theo đô thị</w:t>
       </w:r>
-      <w:bookmarkEnd w:id="93"/>
-      <w:bookmarkEnd w:id="94"/>
-      <w:bookmarkEnd w:id="95"/>
-      <w:bookmarkEnd w:id="96"/>
-      <w:bookmarkEnd w:id="97"/>
-      <w:bookmarkEnd w:id="98"/>
-      <w:bookmarkEnd w:id="99"/>
+      <w:bookmarkEnd w:id="121"/>
+      <w:bookmarkEnd w:id="122"/>
+      <w:bookmarkEnd w:id="123"/>
+      <w:bookmarkEnd w:id="124"/>
+      <w:bookmarkEnd w:id="125"/>
+      <w:bookmarkEnd w:id="126"/>
+      <w:bookmarkEnd w:id="127"/>
+      <w:bookmarkEnd w:id="128"/>
+      <w:bookmarkEnd w:id="129"/>
     </w:p>
     <w:p>
       <w:pPr>
@@ -9215,24 +9275,28 @@
         <w:pStyle w:val="Heading2"/>
         <w:pageBreakBefore/>
       </w:pPr>
-      <w:bookmarkStart w:id="100" w:name="_Toc242867467"/>
-      <w:bookmarkStart w:id="101" w:name="_Toc242869278"/>
-      <w:bookmarkStart w:id="102" w:name="_Toc242869438"/>
-      <w:bookmarkStart w:id="103" w:name="_Toc242871575"/>
-      <w:bookmarkStart w:id="104" w:name="_Toc242871763"/>
-      <w:bookmarkStart w:id="105" w:name="_Toc242872951"/>
-      <w:bookmarkStart w:id="106" w:name="_Toc242874455"/>
+      <w:bookmarkStart w:id="130" w:name="_Toc242867467"/>
+      <w:bookmarkStart w:id="131" w:name="_Toc242869278"/>
+      <w:bookmarkStart w:id="132" w:name="_Toc242869438"/>
+      <w:bookmarkStart w:id="133" w:name="_Toc242871575"/>
+      <w:bookmarkStart w:id="134" w:name="_Toc242871763"/>
+      <w:bookmarkStart w:id="135" w:name="_Toc242872951"/>
+      <w:bookmarkStart w:id="136" w:name="_Toc242874455"/>
+      <w:bookmarkStart w:id="137" w:name="_Toc242875953"/>
+      <w:bookmarkStart w:id="138" w:name="_Toc242876918"/>
       <w:r>
         <w:lastRenderedPageBreak/>
         <w:t>3.2 Nồng độ PM2.5 và PM10</w:t>
       </w:r>
-      <w:bookmarkEnd w:id="100"/>
-      <w:bookmarkEnd w:id="101"/>
-      <w:bookmarkEnd w:id="102"/>
-      <w:bookmarkEnd w:id="103"/>
-      <w:bookmarkEnd w:id="104"/>
-      <w:bookmarkEnd w:id="105"/>
-      <w:bookmarkEnd w:id="106"/>
+      <w:bookmarkEnd w:id="130"/>
+      <w:bookmarkEnd w:id="131"/>
+      <w:bookmarkEnd w:id="132"/>
+      <w:bookmarkEnd w:id="133"/>
+      <w:bookmarkEnd w:id="134"/>
+      <w:bookmarkEnd w:id="135"/>
+      <w:bookmarkEnd w:id="136"/>
+      <w:bookmarkEnd w:id="137"/>
+      <w:bookmarkEnd w:id="138"/>
     </w:p>
     <w:p>
       <w:pPr>
@@ -10180,24 +10244,28 @@
         <w:pStyle w:val="Heading2"/>
         <w:pageBreakBefore/>
       </w:pPr>
-      <w:bookmarkStart w:id="107" w:name="_Toc242867468"/>
-      <w:bookmarkStart w:id="108" w:name="_Toc242869279"/>
-      <w:bookmarkStart w:id="109" w:name="_Toc242869439"/>
-      <w:bookmarkStart w:id="110" w:name="_Toc242871576"/>
-      <w:bookmarkStart w:id="111" w:name="_Toc242871764"/>
-      <w:bookmarkStart w:id="112" w:name="_Toc242872952"/>
-      <w:bookmarkStart w:id="113" w:name="_Toc242874456"/>
+      <w:bookmarkStart w:id="139" w:name="_Toc242867468"/>
+      <w:bookmarkStart w:id="140" w:name="_Toc242869279"/>
+      <w:bookmarkStart w:id="141" w:name="_Toc242869439"/>
+      <w:bookmarkStart w:id="142" w:name="_Toc242871576"/>
+      <w:bookmarkStart w:id="143" w:name="_Toc242871764"/>
+      <w:bookmarkStart w:id="144" w:name="_Toc242872952"/>
+      <w:bookmarkStart w:id="145" w:name="_Toc242874456"/>
+      <w:bookmarkStart w:id="146" w:name="_Toc242875954"/>
+      <w:bookmarkStart w:id="147" w:name="_Toc242876919"/>
       <w:r>
         <w:lastRenderedPageBreak/>
         <w:t>3.3 Trung vị tứ phân vị và P95</w:t>
       </w:r>
-      <w:bookmarkEnd w:id="107"/>
-      <w:bookmarkEnd w:id="108"/>
-      <w:bookmarkEnd w:id="109"/>
-      <w:bookmarkEnd w:id="110"/>
-      <w:bookmarkEnd w:id="111"/>
-      <w:bookmarkEnd w:id="112"/>
-      <w:bookmarkEnd w:id="113"/>
+      <w:bookmarkEnd w:id="139"/>
+      <w:bookmarkEnd w:id="140"/>
+      <w:bookmarkEnd w:id="141"/>
+      <w:bookmarkEnd w:id="142"/>
+      <w:bookmarkEnd w:id="143"/>
+      <w:bookmarkEnd w:id="144"/>
+      <w:bookmarkEnd w:id="145"/>
+      <w:bookmarkEnd w:id="146"/>
+      <w:bookmarkEnd w:id="147"/>
     </w:p>
     <w:p>
       <w:pPr>
@@ -11280,24 +11348,28 @@
         <w:pStyle w:val="Heading2"/>
         <w:pageBreakBefore/>
       </w:pPr>
-      <w:bookmarkStart w:id="114" w:name="_Toc242867469"/>
-      <w:bookmarkStart w:id="115" w:name="_Toc242869280"/>
-      <w:bookmarkStart w:id="116" w:name="_Toc242869440"/>
-      <w:bookmarkStart w:id="117" w:name="_Toc242871577"/>
-      <w:bookmarkStart w:id="118" w:name="_Toc242871765"/>
-      <w:bookmarkStart w:id="119" w:name="_Toc242872953"/>
-      <w:bookmarkStart w:id="120" w:name="_Toc242874457"/>
+      <w:bookmarkStart w:id="148" w:name="_Toc242867469"/>
+      <w:bookmarkStart w:id="149" w:name="_Toc242869280"/>
+      <w:bookmarkStart w:id="150" w:name="_Toc242869440"/>
+      <w:bookmarkStart w:id="151" w:name="_Toc242871577"/>
+      <w:bookmarkStart w:id="152" w:name="_Toc242871765"/>
+      <w:bookmarkStart w:id="153" w:name="_Toc242872953"/>
+      <w:bookmarkStart w:id="154" w:name="_Toc242874457"/>
+      <w:bookmarkStart w:id="155" w:name="_Toc242875955"/>
+      <w:bookmarkStart w:id="156" w:name="_Toc242876920"/>
       <w:r>
         <w:lastRenderedPageBreak/>
         <w:t>3.4 Diễn biến tại các giờ có quan trắc</w:t>
       </w:r>
-      <w:bookmarkEnd w:id="114"/>
-      <w:bookmarkEnd w:id="115"/>
-      <w:bookmarkEnd w:id="116"/>
-      <w:bookmarkEnd w:id="117"/>
-      <w:bookmarkEnd w:id="118"/>
-      <w:bookmarkEnd w:id="119"/>
-      <w:bookmarkEnd w:id="120"/>
+      <w:bookmarkEnd w:id="148"/>
+      <w:bookmarkEnd w:id="149"/>
+      <w:bookmarkEnd w:id="150"/>
+      <w:bookmarkEnd w:id="151"/>
+      <w:bookmarkEnd w:id="152"/>
+      <w:bookmarkEnd w:id="153"/>
+      <w:bookmarkEnd w:id="154"/>
+      <w:bookmarkEnd w:id="155"/>
+      <w:bookmarkEnd w:id="156"/>
     </w:p>
     <w:p>
       <w:pPr>
@@ -12121,24 +12193,28 @@
         <w:pStyle w:val="Heading2"/>
         <w:pageBreakBefore/>
       </w:pPr>
-      <w:bookmarkStart w:id="121" w:name="_Toc242867470"/>
-      <w:bookmarkStart w:id="122" w:name="_Toc242869281"/>
-      <w:bookmarkStart w:id="123" w:name="_Toc242869441"/>
-      <w:bookmarkStart w:id="124" w:name="_Toc242871578"/>
-      <w:bookmarkStart w:id="125" w:name="_Toc242871766"/>
-      <w:bookmarkStart w:id="126" w:name="_Toc242872954"/>
-      <w:bookmarkStart w:id="127" w:name="_Toc242874458"/>
+      <w:bookmarkStart w:id="157" w:name="_Toc242867470"/>
+      <w:bookmarkStart w:id="158" w:name="_Toc242869281"/>
+      <w:bookmarkStart w:id="159" w:name="_Toc242869441"/>
+      <w:bookmarkStart w:id="160" w:name="_Toc242871578"/>
+      <w:bookmarkStart w:id="161" w:name="_Toc242871766"/>
+      <w:bookmarkStart w:id="162" w:name="_Toc242872954"/>
+      <w:bookmarkStart w:id="163" w:name="_Toc242874458"/>
+      <w:bookmarkStart w:id="164" w:name="_Toc242875956"/>
+      <w:bookmarkStart w:id="165" w:name="_Toc242876921"/>
       <w:r>
         <w:lastRenderedPageBreak/>
         <w:t>3.5 Độ phủ và mật độ lấy mẫu</w:t>
       </w:r>
-      <w:bookmarkEnd w:id="121"/>
-      <w:bookmarkEnd w:id="122"/>
-      <w:bookmarkEnd w:id="123"/>
-      <w:bookmarkEnd w:id="124"/>
-      <w:bookmarkEnd w:id="125"/>
-      <w:bookmarkEnd w:id="126"/>
-      <w:bookmarkEnd w:id="127"/>
+      <w:bookmarkEnd w:id="157"/>
+      <w:bookmarkEnd w:id="158"/>
+      <w:bookmarkEnd w:id="159"/>
+      <w:bookmarkEnd w:id="160"/>
+      <w:bookmarkEnd w:id="161"/>
+      <w:bookmarkEnd w:id="162"/>
+      <w:bookmarkEnd w:id="163"/>
+      <w:bookmarkEnd w:id="164"/>
+      <w:bookmarkEnd w:id="165"/>
     </w:p>
     <w:p>
       <w:pPr>
@@ -12220,24 +12296,28 @@
         <w:pStyle w:val="Heading2"/>
         <w:pageBreakBefore/>
       </w:pPr>
-      <w:bookmarkStart w:id="128" w:name="_Toc242867471"/>
-      <w:bookmarkStart w:id="129" w:name="_Toc242869282"/>
-      <w:bookmarkStart w:id="130" w:name="_Toc242869442"/>
-      <w:bookmarkStart w:id="131" w:name="_Toc242871579"/>
-      <w:bookmarkStart w:id="132" w:name="_Toc242871767"/>
-      <w:bookmarkStart w:id="133" w:name="_Toc242872955"/>
-      <w:bookmarkStart w:id="134" w:name="_Toc242874459"/>
+      <w:bookmarkStart w:id="166" w:name="_Toc242867471"/>
+      <w:bookmarkStart w:id="167" w:name="_Toc242869282"/>
+      <w:bookmarkStart w:id="168" w:name="_Toc242869442"/>
+      <w:bookmarkStart w:id="169" w:name="_Toc242871579"/>
+      <w:bookmarkStart w:id="170" w:name="_Toc242871767"/>
+      <w:bookmarkStart w:id="171" w:name="_Toc242872955"/>
+      <w:bookmarkStart w:id="172" w:name="_Toc242874459"/>
+      <w:bookmarkStart w:id="173" w:name="_Toc242875957"/>
+      <w:bookmarkStart w:id="174" w:name="_Toc242876922"/>
       <w:r>
         <w:lastRenderedPageBreak/>
         <w:t>3.6 Phân bố các cấp chất lượng không khí</w:t>
       </w:r>
-      <w:bookmarkEnd w:id="128"/>
-      <w:bookmarkEnd w:id="129"/>
-      <w:bookmarkEnd w:id="130"/>
-      <w:bookmarkEnd w:id="131"/>
-      <w:bookmarkEnd w:id="132"/>
-      <w:bookmarkEnd w:id="133"/>
-      <w:bookmarkEnd w:id="134"/>
+      <w:bookmarkEnd w:id="166"/>
+      <w:bookmarkEnd w:id="167"/>
+      <w:bookmarkEnd w:id="168"/>
+      <w:bookmarkEnd w:id="169"/>
+      <w:bookmarkEnd w:id="170"/>
+      <w:bookmarkEnd w:id="171"/>
+      <w:bookmarkEnd w:id="172"/>
+      <w:bookmarkEnd w:id="173"/>
+      <w:bookmarkEnd w:id="174"/>
     </w:p>
     <w:p>
       <w:pPr>
@@ -13050,24 +13130,28 @@
         <w:pStyle w:val="Heading2"/>
         <w:pageBreakBefore/>
       </w:pPr>
-      <w:bookmarkStart w:id="135" w:name="_Toc242867472"/>
-      <w:bookmarkStart w:id="136" w:name="_Toc242869283"/>
-      <w:bookmarkStart w:id="137" w:name="_Toc242869443"/>
-      <w:bookmarkStart w:id="138" w:name="_Toc242871580"/>
-      <w:bookmarkStart w:id="139" w:name="_Toc242871768"/>
-      <w:bookmarkStart w:id="140" w:name="_Toc242872956"/>
-      <w:bookmarkStart w:id="141" w:name="_Toc242874460"/>
+      <w:bookmarkStart w:id="175" w:name="_Toc242867472"/>
+      <w:bookmarkStart w:id="176" w:name="_Toc242869283"/>
+      <w:bookmarkStart w:id="177" w:name="_Toc242869443"/>
+      <w:bookmarkStart w:id="178" w:name="_Toc242871580"/>
+      <w:bookmarkStart w:id="179" w:name="_Toc242871768"/>
+      <w:bookmarkStart w:id="180" w:name="_Toc242872956"/>
+      <w:bookmarkStart w:id="181" w:name="_Toc242874460"/>
+      <w:bookmarkStart w:id="182" w:name="_Toc242875958"/>
+      <w:bookmarkStart w:id="183" w:name="_Toc242876923"/>
       <w:r>
         <w:lastRenderedPageBreak/>
         <w:t>3.7 Tần suất vượt ngưỡng cấu hình cảnh báo</w:t>
       </w:r>
-      <w:bookmarkEnd w:id="135"/>
-      <w:bookmarkEnd w:id="136"/>
-      <w:bookmarkEnd w:id="137"/>
-      <w:bookmarkEnd w:id="138"/>
-      <w:bookmarkEnd w:id="139"/>
-      <w:bookmarkEnd w:id="140"/>
-      <w:bookmarkEnd w:id="141"/>
+      <w:bookmarkEnd w:id="175"/>
+      <w:bookmarkEnd w:id="176"/>
+      <w:bookmarkEnd w:id="177"/>
+      <w:bookmarkEnd w:id="178"/>
+      <w:bookmarkEnd w:id="179"/>
+      <w:bookmarkEnd w:id="180"/>
+      <w:bookmarkEnd w:id="181"/>
+      <w:bookmarkEnd w:id="182"/>
+      <w:bookmarkEnd w:id="183"/>
     </w:p>
     <w:p>
       <w:pPr>
@@ -13890,14 +13974,18 @@
         <w:pStyle w:val="Heading2"/>
         <w:pageBreakBefore/>
       </w:pPr>
-      <w:bookmarkStart w:id="142" w:name="_Toc242872957"/>
-      <w:bookmarkStart w:id="143" w:name="_Toc242874461"/>
+      <w:bookmarkStart w:id="184" w:name="_Toc242872957"/>
+      <w:bookmarkStart w:id="185" w:name="_Toc242874461"/>
+      <w:bookmarkStart w:id="186" w:name="_Toc242875959"/>
+      <w:bookmarkStart w:id="187" w:name="_Toc242876924"/>
       <w:r>
         <w:lastRenderedPageBreak/>
         <w:t>3.8 Đối chiếu hai báo cáo dữ liệu theo đô thị và giờ</w:t>
       </w:r>
-      <w:bookmarkEnd w:id="142"/>
-      <w:bookmarkEnd w:id="143"/>
+      <w:bookmarkEnd w:id="184"/>
+      <w:bookmarkEnd w:id="185"/>
+      <w:bookmarkEnd w:id="186"/>
+      <w:bookmarkEnd w:id="187"/>
     </w:p>
     <w:p>
       <w:pPr>
@@ -14408,24 +14496,28 @@
         <w:pStyle w:val="Heading2"/>
         <w:pageBreakBefore/>
       </w:pPr>
-      <w:bookmarkStart w:id="144" w:name="_Toc242867474"/>
-      <w:bookmarkStart w:id="145" w:name="_Toc242869285"/>
-      <w:bookmarkStart w:id="146" w:name="_Toc242869445"/>
-      <w:bookmarkStart w:id="147" w:name="_Toc242871582"/>
-      <w:bookmarkStart w:id="148" w:name="_Toc242871770"/>
-      <w:bookmarkStart w:id="149" w:name="_Toc242872958"/>
-      <w:bookmarkStart w:id="150" w:name="_Toc242874462"/>
+      <w:bookmarkStart w:id="188" w:name="_Toc242867474"/>
+      <w:bookmarkStart w:id="189" w:name="_Toc242869285"/>
+      <w:bookmarkStart w:id="190" w:name="_Toc242869445"/>
+      <w:bookmarkStart w:id="191" w:name="_Toc242871582"/>
+      <w:bookmarkStart w:id="192" w:name="_Toc242871770"/>
+      <w:bookmarkStart w:id="193" w:name="_Toc242872958"/>
+      <w:bookmarkStart w:id="194" w:name="_Toc242874462"/>
+      <w:bookmarkStart w:id="195" w:name="_Toc242875960"/>
+      <w:bookmarkStart w:id="196" w:name="_Toc242876925"/>
       <w:r>
         <w:lastRenderedPageBreak/>
         <w:t>3.9 Tương quan Pearson và Spearman</w:t>
       </w:r>
-      <w:bookmarkEnd w:id="144"/>
-      <w:bookmarkEnd w:id="145"/>
-      <w:bookmarkEnd w:id="146"/>
-      <w:bookmarkEnd w:id="147"/>
-      <w:bookmarkEnd w:id="148"/>
-      <w:bookmarkEnd w:id="149"/>
-      <w:bookmarkEnd w:id="150"/>
+      <w:bookmarkEnd w:id="188"/>
+      <w:bookmarkEnd w:id="189"/>
+      <w:bookmarkEnd w:id="190"/>
+      <w:bookmarkEnd w:id="191"/>
+      <w:bookmarkEnd w:id="192"/>
+      <w:bookmarkEnd w:id="193"/>
+      <w:bookmarkEnd w:id="194"/>
+      <w:bookmarkEnd w:id="195"/>
+      <w:bookmarkEnd w:id="196"/>
     </w:p>
     <w:p>
       <w:pPr>
@@ -15382,24 +15474,28 @@
         <w:pStyle w:val="Heading2"/>
         <w:pageBreakBefore/>
       </w:pPr>
-      <w:bookmarkStart w:id="151" w:name="_Toc242867475"/>
-      <w:bookmarkStart w:id="152" w:name="_Toc242869286"/>
-      <w:bookmarkStart w:id="153" w:name="_Toc242869446"/>
-      <w:bookmarkStart w:id="154" w:name="_Toc242871583"/>
-      <w:bookmarkStart w:id="155" w:name="_Toc242871771"/>
-      <w:bookmarkStart w:id="156" w:name="_Toc242872959"/>
-      <w:bookmarkStart w:id="157" w:name="_Toc242874463"/>
+      <w:bookmarkStart w:id="197" w:name="_Toc242867475"/>
+      <w:bookmarkStart w:id="198" w:name="_Toc242869286"/>
+      <w:bookmarkStart w:id="199" w:name="_Toc242869446"/>
+      <w:bookmarkStart w:id="200" w:name="_Toc242871583"/>
+      <w:bookmarkStart w:id="201" w:name="_Toc242871771"/>
+      <w:bookmarkStart w:id="202" w:name="_Toc242872959"/>
+      <w:bookmarkStart w:id="203" w:name="_Toc242874463"/>
+      <w:bookmarkStart w:id="204" w:name="_Toc242875961"/>
+      <w:bookmarkStart w:id="205" w:name="_Toc242876926"/>
       <w:r>
         <w:lastRenderedPageBreak/>
         <w:t>3.10 Quan sát trực tiếp quan hệ nhiệt độ và PM2.5</w:t>
       </w:r>
-      <w:bookmarkEnd w:id="151"/>
-      <w:bookmarkEnd w:id="152"/>
-      <w:bookmarkEnd w:id="153"/>
-      <w:bookmarkEnd w:id="154"/>
-      <w:bookmarkEnd w:id="155"/>
-      <w:bookmarkEnd w:id="156"/>
-      <w:bookmarkEnd w:id="157"/>
+      <w:bookmarkEnd w:id="197"/>
+      <w:bookmarkEnd w:id="198"/>
+      <w:bookmarkEnd w:id="199"/>
+      <w:bookmarkEnd w:id="200"/>
+      <w:bookmarkEnd w:id="201"/>
+      <w:bookmarkEnd w:id="202"/>
+      <w:bookmarkEnd w:id="203"/>
+      <w:bookmarkEnd w:id="204"/>
+      <w:bookmarkEnd w:id="205"/>
     </w:p>
     <w:p>
       <w:pPr>
@@ -15481,24 +15577,28 @@
         <w:pStyle w:val="Heading2"/>
         <w:pageBreakBefore/>
       </w:pPr>
-      <w:bookmarkStart w:id="158" w:name="_Toc242867476"/>
-      <w:bookmarkStart w:id="159" w:name="_Toc242869287"/>
-      <w:bookmarkStart w:id="160" w:name="_Toc242869447"/>
-      <w:bookmarkStart w:id="161" w:name="_Toc242871584"/>
-      <w:bookmarkStart w:id="162" w:name="_Toc242871772"/>
-      <w:bookmarkStart w:id="163" w:name="_Toc242872960"/>
-      <w:bookmarkStart w:id="164" w:name="_Toc242874464"/>
+      <w:bookmarkStart w:id="206" w:name="_Toc242867476"/>
+      <w:bookmarkStart w:id="207" w:name="_Toc242869287"/>
+      <w:bookmarkStart w:id="208" w:name="_Toc242869447"/>
+      <w:bookmarkStart w:id="209" w:name="_Toc242871584"/>
+      <w:bookmarkStart w:id="210" w:name="_Toc242871772"/>
+      <w:bookmarkStart w:id="211" w:name="_Toc242872960"/>
+      <w:bookmarkStart w:id="212" w:name="_Toc242874464"/>
+      <w:bookmarkStart w:id="213" w:name="_Toc242875962"/>
+      <w:bookmarkStart w:id="214" w:name="_Toc242876927"/>
       <w:r>
         <w:lastRenderedPageBreak/>
         <w:t>3.11 Các khí ô nhiễm còn lại</w:t>
       </w:r>
-      <w:bookmarkEnd w:id="158"/>
-      <w:bookmarkEnd w:id="159"/>
-      <w:bookmarkEnd w:id="160"/>
-      <w:bookmarkEnd w:id="161"/>
-      <w:bookmarkEnd w:id="162"/>
-      <w:bookmarkEnd w:id="163"/>
-      <w:bookmarkEnd w:id="164"/>
+      <w:bookmarkEnd w:id="206"/>
+      <w:bookmarkEnd w:id="207"/>
+      <w:bookmarkEnd w:id="208"/>
+      <w:bookmarkEnd w:id="209"/>
+      <w:bookmarkEnd w:id="210"/>
+      <w:bookmarkEnd w:id="211"/>
+      <w:bookmarkEnd w:id="212"/>
+      <w:bookmarkEnd w:id="213"/>
+      <w:bookmarkEnd w:id="214"/>
     </w:p>
     <w:p>
       <w:pPr>
@@ -16446,18 +16546,22 @@
         <w:pStyle w:val="Heading2"/>
         <w:pageBreakBefore/>
       </w:pPr>
-      <w:bookmarkStart w:id="165" w:name="_Toc242871585"/>
-      <w:bookmarkStart w:id="166" w:name="_Toc242871773"/>
-      <w:bookmarkStart w:id="167" w:name="_Toc242872961"/>
-      <w:bookmarkStart w:id="168" w:name="_Toc242874465"/>
+      <w:bookmarkStart w:id="215" w:name="_Toc242871585"/>
+      <w:bookmarkStart w:id="216" w:name="_Toc242871773"/>
+      <w:bookmarkStart w:id="217" w:name="_Toc242872961"/>
+      <w:bookmarkStart w:id="218" w:name="_Toc242874465"/>
+      <w:bookmarkStart w:id="219" w:name="_Toc242875963"/>
+      <w:bookmarkStart w:id="220" w:name="_Toc242876928"/>
       <w:r>
         <w:lastRenderedPageBreak/>
         <w:t>3.12 Đối chiếu với báo cáo Tuần 1</w:t>
       </w:r>
-      <w:bookmarkEnd w:id="165"/>
-      <w:bookmarkEnd w:id="166"/>
-      <w:bookmarkEnd w:id="167"/>
-      <w:bookmarkEnd w:id="168"/>
+      <w:bookmarkEnd w:id="215"/>
+      <w:bookmarkEnd w:id="216"/>
+      <w:bookmarkEnd w:id="217"/>
+      <w:bookmarkEnd w:id="218"/>
+      <w:bookmarkEnd w:id="219"/>
+      <w:bookmarkEnd w:id="220"/>
     </w:p>
     <w:p>
       <w:pPr>
@@ -17539,915 +17643,21 @@
     </w:p>
     <w:p>
       <w:pPr>
-        <w:pStyle w:val="BodyText"/>
         <w:keepNext/>
-      </w:pPr>
-      <w:r>
-        <w:rPr>
-          <w:b/>
-        </w:rPr>
-        <w:t>b) Đối chiếu theo ranh giới tuần trong cùng lần xuất mới</w:t>
-      </w:r>
-    </w:p>
-    <w:p>
-      <w:pPr>
-        <w:pStyle w:val="BodyText"/>
-      </w:pPr>
-      <w:r>
-        <w:t>Phép đối chiếu tiếp theo lọc hai tuần từ cùng lần xuất mới trong bộ dữ liệu của từng sinh viên. Mẫu Tuần 1 có 42 dòng mỗi đô thị trong bộ của sinh viên Tiến Sơn và 41 trong bộ của sinh viên Ngọc Quyên. Phạm vi này khác mốc 52 mẫu trong hai bảng trên; Hình 3.12 minh họa riêng phép lọc này.</w:t>
-      </w:r>
-    </w:p>
-    <w:p>
-      <w:pPr>
-        <w:pStyle w:val="Caption"/>
-        <w:keepNext/>
-        <w:spacing w:before="80" w:after="160" w:line="252" w:lineRule="auto"/>
-        <w:jc w:val="center"/>
-      </w:pPr>
-      <w:r>
-        <w:lastRenderedPageBreak/>
-        <w:t>Bảng 3.12 AQI theo ranh giới tuần trong lần xuất mới</w:t>
-      </w:r>
-    </w:p>
-    <w:tbl>
-      <w:tblPr>
-        <w:tblStyle w:val="TableGrid"/>
-        <w:tblW w:w="0" w:type="auto"/>
-        <w:jc w:val="center"/>
-        <w:tblLayout w:type="fixed"/>
-        <w:tblLook w:val="04A0" w:firstRow="1" w:lastRow="0" w:firstColumn="1" w:lastColumn="0" w:noHBand="0" w:noVBand="1"/>
-      </w:tblPr>
-      <w:tblGrid>
-        <w:gridCol w:w="2232"/>
-        <w:gridCol w:w="1080"/>
-        <w:gridCol w:w="1440"/>
-        <w:gridCol w:w="1440"/>
-        <w:gridCol w:w="1872"/>
-        <w:gridCol w:w="1872"/>
-      </w:tblGrid>
-      <w:tr>
-        <w:trPr>
-          <w:cantSplit/>
-          <w:tblHeader/>
-          <w:jc w:val="center"/>
-        </w:trPr>
-        <w:tc>
-          <w:tcPr>
-            <w:tcW w:w="2232" w:type="dxa"/>
-            <w:shd w:val="clear" w:color="auto" w:fill="E7E7E7"/>
-            <w:vAlign w:val="center"/>
-          </w:tcPr>
-          <w:p>
-            <w:pPr>
-              <w:keepNext/>
-              <w:spacing w:before="60" w:after="60" w:line="264" w:lineRule="auto"/>
-              <w:jc w:val="center"/>
-            </w:pPr>
-            <w:r>
-              <w:rPr>
-                <w:b/>
-                <w:sz w:val="22"/>
-              </w:rPr>
-              <w:t>Đô thị</w:t>
-            </w:r>
-          </w:p>
-        </w:tc>
-        <w:tc>
-          <w:tcPr>
-            <w:tcW w:w="1080" w:type="dxa"/>
-            <w:shd w:val="clear" w:color="auto" w:fill="E7E7E7"/>
-            <w:vAlign w:val="center"/>
-          </w:tcPr>
-          <w:p>
-            <w:pPr>
-              <w:keepNext/>
-              <w:spacing w:before="60" w:after="60" w:line="264" w:lineRule="auto"/>
-              <w:jc w:val="center"/>
-            </w:pPr>
-            <w:r>
-              <w:rPr>
-                <w:b/>
-                <w:sz w:val="22"/>
-              </w:rPr>
-              <w:t>Sinh viên</w:t>
-            </w:r>
-          </w:p>
-        </w:tc>
-        <w:tc>
-          <w:tcPr>
-            <w:tcW w:w="1440" w:type="dxa"/>
-            <w:shd w:val="clear" w:color="auto" w:fill="E7E7E7"/>
-            <w:vAlign w:val="center"/>
-          </w:tcPr>
-          <w:p>
-            <w:pPr>
-              <w:keepNext/>
-              <w:spacing w:before="60" w:after="60" w:line="264" w:lineRule="auto"/>
-              <w:jc w:val="center"/>
-            </w:pPr>
-            <w:r>
-              <w:rPr>
-                <w:b/>
-                <w:sz w:val="22"/>
-              </w:rPr>
-              <w:t>n Tuần 1</w:t>
-            </w:r>
-          </w:p>
-        </w:tc>
-        <w:tc>
-          <w:tcPr>
-            <w:tcW w:w="1440" w:type="dxa"/>
-            <w:shd w:val="clear" w:color="auto" w:fill="E7E7E7"/>
-            <w:vAlign w:val="center"/>
-          </w:tcPr>
-          <w:p>
-            <w:pPr>
-              <w:keepNext/>
-              <w:spacing w:before="60" w:after="60" w:line="264" w:lineRule="auto"/>
-              <w:jc w:val="center"/>
-            </w:pPr>
-            <w:r>
-              <w:rPr>
-                <w:b/>
-                <w:sz w:val="22"/>
-              </w:rPr>
-              <w:t>n Tuần 2</w:t>
-            </w:r>
-          </w:p>
-        </w:tc>
-        <w:tc>
-          <w:tcPr>
-            <w:tcW w:w="1872" w:type="dxa"/>
-            <w:shd w:val="clear" w:color="auto" w:fill="E7E7E7"/>
-            <w:vAlign w:val="center"/>
-          </w:tcPr>
-          <w:p>
-            <w:pPr>
-              <w:keepNext/>
-              <w:spacing w:before="60" w:after="60" w:line="264" w:lineRule="auto"/>
-              <w:jc w:val="center"/>
-            </w:pPr>
-            <w:r>
-              <w:rPr>
-                <w:b/>
-                <w:sz w:val="22"/>
-              </w:rPr>
-              <w:t>AQI Tuần 1</w:t>
-            </w:r>
-          </w:p>
-        </w:tc>
-        <w:tc>
-          <w:tcPr>
-            <w:tcW w:w="1872" w:type="dxa"/>
-            <w:shd w:val="clear" w:color="auto" w:fill="E7E7E7"/>
-            <w:vAlign w:val="center"/>
-          </w:tcPr>
-          <w:p>
-            <w:pPr>
-              <w:keepNext/>
-              <w:spacing w:before="60" w:after="60" w:line="264" w:lineRule="auto"/>
-              <w:jc w:val="center"/>
-            </w:pPr>
-            <w:r>
-              <w:rPr>
-                <w:b/>
-                <w:sz w:val="22"/>
-              </w:rPr>
-              <w:t>AQI Tuần 2</w:t>
-            </w:r>
-          </w:p>
-        </w:tc>
-      </w:tr>
-      <w:tr>
-        <w:trPr>
-          <w:cantSplit/>
-          <w:jc w:val="center"/>
-        </w:trPr>
-        <w:tc>
-          <w:tcPr>
-            <w:tcW w:w="2232" w:type="dxa"/>
-            <w:shd w:val="clear" w:color="auto" w:fill="FFFFFF"/>
-            <w:vAlign w:val="center"/>
-          </w:tcPr>
-          <w:p>
-            <w:pPr>
-              <w:keepNext/>
-              <w:spacing w:before="60" w:after="60" w:line="264" w:lineRule="auto"/>
-            </w:pPr>
-            <w:r>
-              <w:rPr>
-                <w:sz w:val="22"/>
-              </w:rPr>
-              <w:t>Đà Nẵng</w:t>
-            </w:r>
-          </w:p>
-        </w:tc>
-        <w:tc>
-          <w:tcPr>
-            <w:tcW w:w="1080" w:type="dxa"/>
-            <w:shd w:val="clear" w:color="auto" w:fill="FFFFFF"/>
-            <w:vAlign w:val="center"/>
-          </w:tcPr>
-          <w:p>
-            <w:pPr>
-              <w:keepNext/>
-              <w:spacing w:before="60" w:after="60" w:line="264" w:lineRule="auto"/>
-            </w:pPr>
-            <w:r>
-              <w:rPr>
-                <w:sz w:val="22"/>
-              </w:rPr>
-              <w:t>Tiến Sơn</w:t>
-            </w:r>
-          </w:p>
-        </w:tc>
-        <w:tc>
-          <w:tcPr>
-            <w:tcW w:w="1440" w:type="dxa"/>
-            <w:shd w:val="clear" w:color="auto" w:fill="FFFFFF"/>
-            <w:vAlign w:val="center"/>
-          </w:tcPr>
-          <w:p>
-            <w:pPr>
-              <w:keepNext/>
-              <w:spacing w:before="60" w:after="60" w:line="264" w:lineRule="auto"/>
-            </w:pPr>
-            <w:r>
-              <w:rPr>
-                <w:sz w:val="22"/>
-              </w:rPr>
-              <w:t>42</w:t>
-            </w:r>
-          </w:p>
-        </w:tc>
-        <w:tc>
-          <w:tcPr>
-            <w:tcW w:w="1440" w:type="dxa"/>
-            <w:shd w:val="clear" w:color="auto" w:fill="FFFFFF"/>
-            <w:vAlign w:val="center"/>
-          </w:tcPr>
-          <w:p>
-            <w:pPr>
-              <w:keepNext/>
-              <w:spacing w:before="60" w:after="60" w:line="264" w:lineRule="auto"/>
-            </w:pPr>
-            <w:r>
-              <w:rPr>
-                <w:sz w:val="22"/>
-              </w:rPr>
-              <w:t>9</w:t>
-            </w:r>
-          </w:p>
-        </w:tc>
-        <w:tc>
-          <w:tcPr>
-            <w:tcW w:w="1872" w:type="dxa"/>
-            <w:shd w:val="clear" w:color="auto" w:fill="FFFFFF"/>
-            <w:vAlign w:val="center"/>
-          </w:tcPr>
-          <w:p>
-            <w:pPr>
-              <w:keepNext/>
-              <w:spacing w:before="60" w:after="60" w:line="264" w:lineRule="auto"/>
-            </w:pPr>
-            <w:r>
-              <w:rPr>
-                <w:sz w:val="22"/>
-              </w:rPr>
-              <w:t>65,60</w:t>
-            </w:r>
-          </w:p>
-        </w:tc>
-        <w:tc>
-          <w:tcPr>
-            <w:tcW w:w="1872" w:type="dxa"/>
-            <w:shd w:val="clear" w:color="auto" w:fill="FFFFFF"/>
-            <w:vAlign w:val="center"/>
-          </w:tcPr>
-          <w:p>
-            <w:pPr>
-              <w:keepNext/>
-              <w:spacing w:before="60" w:after="60" w:line="264" w:lineRule="auto"/>
-            </w:pPr>
-            <w:r>
-              <w:rPr>
-                <w:sz w:val="22"/>
-              </w:rPr>
-              <w:t>35,44</w:t>
-            </w:r>
-          </w:p>
-        </w:tc>
-      </w:tr>
-      <w:tr>
-        <w:trPr>
-          <w:cantSplit/>
-          <w:jc w:val="center"/>
-        </w:trPr>
-        <w:tc>
-          <w:tcPr>
-            <w:tcW w:w="2232" w:type="dxa"/>
-            <w:shd w:val="clear" w:color="auto" w:fill="FFFFFF"/>
-            <w:vAlign w:val="center"/>
-          </w:tcPr>
-          <w:p>
-            <w:pPr>
-              <w:keepNext/>
-              <w:spacing w:before="60" w:after="60" w:line="264" w:lineRule="auto"/>
-            </w:pPr>
-            <w:r>
-              <w:rPr>
-                <w:sz w:val="22"/>
-              </w:rPr>
-              <w:t>Hà Nội</w:t>
-            </w:r>
-          </w:p>
-        </w:tc>
-        <w:tc>
-          <w:tcPr>
-            <w:tcW w:w="1080" w:type="dxa"/>
-            <w:shd w:val="clear" w:color="auto" w:fill="FFFFFF"/>
-            <w:vAlign w:val="center"/>
-          </w:tcPr>
-          <w:p>
-            <w:pPr>
-              <w:keepNext/>
-              <w:spacing w:before="60" w:after="60" w:line="264" w:lineRule="auto"/>
-            </w:pPr>
-            <w:r>
-              <w:rPr>
-                <w:sz w:val="22"/>
-              </w:rPr>
-              <w:t>Tiến Sơn</w:t>
-            </w:r>
-          </w:p>
-        </w:tc>
-        <w:tc>
-          <w:tcPr>
-            <w:tcW w:w="1440" w:type="dxa"/>
-            <w:shd w:val="clear" w:color="auto" w:fill="FFFFFF"/>
-            <w:vAlign w:val="center"/>
-          </w:tcPr>
-          <w:p>
-            <w:pPr>
-              <w:keepNext/>
-              <w:spacing w:before="60" w:after="60" w:line="264" w:lineRule="auto"/>
-            </w:pPr>
-            <w:r>
-              <w:rPr>
-                <w:sz w:val="22"/>
-              </w:rPr>
-              <w:t>42</w:t>
-            </w:r>
-          </w:p>
-        </w:tc>
-        <w:tc>
-          <w:tcPr>
-            <w:tcW w:w="1440" w:type="dxa"/>
-            <w:shd w:val="clear" w:color="auto" w:fill="FFFFFF"/>
-            <w:vAlign w:val="center"/>
-          </w:tcPr>
-          <w:p>
-            <w:pPr>
-              <w:keepNext/>
-              <w:spacing w:before="60" w:after="60" w:line="264" w:lineRule="auto"/>
-            </w:pPr>
-            <w:r>
-              <w:rPr>
-                <w:sz w:val="22"/>
-              </w:rPr>
-              <w:t>9</w:t>
-            </w:r>
-          </w:p>
-        </w:tc>
-        <w:tc>
-          <w:tcPr>
-            <w:tcW w:w="1872" w:type="dxa"/>
-            <w:shd w:val="clear" w:color="auto" w:fill="FFFFFF"/>
-            <w:vAlign w:val="center"/>
-          </w:tcPr>
-          <w:p>
-            <w:pPr>
-              <w:keepNext/>
-              <w:spacing w:before="60" w:after="60" w:line="264" w:lineRule="auto"/>
-            </w:pPr>
-            <w:r>
-              <w:rPr>
-                <w:sz w:val="22"/>
-              </w:rPr>
-              <w:t>65,74</w:t>
-            </w:r>
-          </w:p>
-        </w:tc>
-        <w:tc>
-          <w:tcPr>
-            <w:tcW w:w="1872" w:type="dxa"/>
-            <w:shd w:val="clear" w:color="auto" w:fill="FFFFFF"/>
-            <w:vAlign w:val="center"/>
-          </w:tcPr>
-          <w:p>
-            <w:pPr>
-              <w:keepNext/>
-              <w:spacing w:before="60" w:after="60" w:line="264" w:lineRule="auto"/>
-            </w:pPr>
-            <w:r>
-              <w:rPr>
-                <w:sz w:val="22"/>
-              </w:rPr>
-              <w:t>163,56</w:t>
-            </w:r>
-          </w:p>
-        </w:tc>
-      </w:tr>
-      <w:tr>
-        <w:trPr>
-          <w:cantSplit/>
-          <w:jc w:val="center"/>
-        </w:trPr>
-        <w:tc>
-          <w:tcPr>
-            <w:tcW w:w="2232" w:type="dxa"/>
-            <w:shd w:val="clear" w:color="auto" w:fill="FFFFFF"/>
-            <w:vAlign w:val="center"/>
-          </w:tcPr>
-          <w:p>
-            <w:pPr>
-              <w:keepNext/>
-              <w:spacing w:before="60" w:after="60" w:line="264" w:lineRule="auto"/>
-            </w:pPr>
-            <w:r>
-              <w:rPr>
-                <w:sz w:val="22"/>
-              </w:rPr>
-              <w:t>TP. Hồ Chí Minh</w:t>
-            </w:r>
-          </w:p>
-        </w:tc>
-        <w:tc>
-          <w:tcPr>
-            <w:tcW w:w="1080" w:type="dxa"/>
-            <w:shd w:val="clear" w:color="auto" w:fill="FFFFFF"/>
-            <w:vAlign w:val="center"/>
-          </w:tcPr>
-          <w:p>
-            <w:pPr>
-              <w:keepNext/>
-              <w:spacing w:before="60" w:after="60" w:line="264" w:lineRule="auto"/>
-            </w:pPr>
-            <w:r>
-              <w:rPr>
-                <w:sz w:val="22"/>
-              </w:rPr>
-              <w:t>Tiến Sơn</w:t>
-            </w:r>
-          </w:p>
-        </w:tc>
-        <w:tc>
-          <w:tcPr>
-            <w:tcW w:w="1440" w:type="dxa"/>
-            <w:shd w:val="clear" w:color="auto" w:fill="FFFFFF"/>
-            <w:vAlign w:val="center"/>
-          </w:tcPr>
-          <w:p>
-            <w:pPr>
-              <w:keepNext/>
-              <w:spacing w:before="60" w:after="60" w:line="264" w:lineRule="auto"/>
-            </w:pPr>
-            <w:r>
-              <w:rPr>
-                <w:sz w:val="22"/>
-              </w:rPr>
-              <w:t>42</w:t>
-            </w:r>
-          </w:p>
-        </w:tc>
-        <w:tc>
-          <w:tcPr>
-            <w:tcW w:w="1440" w:type="dxa"/>
-            <w:shd w:val="clear" w:color="auto" w:fill="FFFFFF"/>
-            <w:vAlign w:val="center"/>
-          </w:tcPr>
-          <w:p>
-            <w:pPr>
-              <w:keepNext/>
-              <w:spacing w:before="60" w:after="60" w:line="264" w:lineRule="auto"/>
-            </w:pPr>
-            <w:r>
-              <w:rPr>
-                <w:sz w:val="22"/>
-              </w:rPr>
-              <w:t>9</w:t>
-            </w:r>
-          </w:p>
-        </w:tc>
-        <w:tc>
-          <w:tcPr>
-            <w:tcW w:w="1872" w:type="dxa"/>
-            <w:shd w:val="clear" w:color="auto" w:fill="FFFFFF"/>
-            <w:vAlign w:val="center"/>
-          </w:tcPr>
-          <w:p>
-            <w:pPr>
-              <w:keepNext/>
-              <w:spacing w:before="60" w:after="60" w:line="264" w:lineRule="auto"/>
-            </w:pPr>
-            <w:r>
-              <w:rPr>
-                <w:sz w:val="22"/>
-              </w:rPr>
-              <w:t>111,17</w:t>
-            </w:r>
-          </w:p>
-        </w:tc>
-        <w:tc>
-          <w:tcPr>
-            <w:tcW w:w="1872" w:type="dxa"/>
-            <w:shd w:val="clear" w:color="auto" w:fill="FFFFFF"/>
-            <w:vAlign w:val="center"/>
-          </w:tcPr>
-          <w:p>
-            <w:pPr>
-              <w:keepNext/>
-              <w:spacing w:before="60" w:after="60" w:line="264" w:lineRule="auto"/>
-            </w:pPr>
-            <w:r>
-              <w:rPr>
-                <w:sz w:val="22"/>
-              </w:rPr>
-              <w:t>78,00</w:t>
-            </w:r>
-          </w:p>
-        </w:tc>
-      </w:tr>
-      <w:tr>
-        <w:trPr>
-          <w:cantSplit/>
-          <w:jc w:val="center"/>
-        </w:trPr>
-        <w:tc>
-          <w:tcPr>
-            <w:tcW w:w="2232" w:type="dxa"/>
-            <w:shd w:val="clear" w:color="auto" w:fill="FFFFFF"/>
-            <w:vAlign w:val="center"/>
-          </w:tcPr>
-          <w:p>
-            <w:pPr>
-              <w:keepNext/>
-              <w:spacing w:before="60" w:after="60" w:line="264" w:lineRule="auto"/>
-            </w:pPr>
-            <w:r>
-              <w:rPr>
-                <w:sz w:val="22"/>
-              </w:rPr>
-              <w:t>Đà Nẵng</w:t>
-            </w:r>
-          </w:p>
-        </w:tc>
-        <w:tc>
-          <w:tcPr>
-            <w:tcW w:w="1080" w:type="dxa"/>
-            <w:shd w:val="clear" w:color="auto" w:fill="FFFFFF"/>
-            <w:vAlign w:val="center"/>
-          </w:tcPr>
-          <w:p>
-            <w:pPr>
-              <w:keepNext/>
-              <w:spacing w:before="60" w:after="60" w:line="264" w:lineRule="auto"/>
-            </w:pPr>
-            <w:r>
-              <w:rPr>
-                <w:sz w:val="22"/>
-              </w:rPr>
-              <w:t>Ngọc Quyên</w:t>
-            </w:r>
-          </w:p>
-        </w:tc>
-        <w:tc>
-          <w:tcPr>
-            <w:tcW w:w="1440" w:type="dxa"/>
-            <w:shd w:val="clear" w:color="auto" w:fill="FFFFFF"/>
-            <w:vAlign w:val="center"/>
-          </w:tcPr>
-          <w:p>
-            <w:pPr>
-              <w:keepNext/>
-              <w:spacing w:before="60" w:after="60" w:line="264" w:lineRule="auto"/>
-            </w:pPr>
-            <w:r>
-              <w:rPr>
-                <w:sz w:val="22"/>
-              </w:rPr>
-              <w:t>41</w:t>
-            </w:r>
-          </w:p>
-        </w:tc>
-        <w:tc>
-          <w:tcPr>
-            <w:tcW w:w="1440" w:type="dxa"/>
-            <w:shd w:val="clear" w:color="auto" w:fill="FFFFFF"/>
-            <w:vAlign w:val="center"/>
-          </w:tcPr>
-          <w:p>
-            <w:pPr>
-              <w:keepNext/>
-              <w:spacing w:before="60" w:after="60" w:line="264" w:lineRule="auto"/>
-            </w:pPr>
-            <w:r>
-              <w:rPr>
-                <w:sz w:val="22"/>
-              </w:rPr>
-              <w:t>19</w:t>
-            </w:r>
-          </w:p>
-        </w:tc>
-        <w:tc>
-          <w:tcPr>
-            <w:tcW w:w="1872" w:type="dxa"/>
-            <w:shd w:val="clear" w:color="auto" w:fill="FFFFFF"/>
-            <w:vAlign w:val="center"/>
-          </w:tcPr>
-          <w:p>
-            <w:pPr>
-              <w:keepNext/>
-              <w:spacing w:before="60" w:after="60" w:line="264" w:lineRule="auto"/>
-            </w:pPr>
-            <w:r>
-              <w:rPr>
-                <w:sz w:val="22"/>
-              </w:rPr>
-              <w:t>63,95</w:t>
-            </w:r>
-          </w:p>
-        </w:tc>
-        <w:tc>
-          <w:tcPr>
-            <w:tcW w:w="1872" w:type="dxa"/>
-            <w:shd w:val="clear" w:color="auto" w:fill="FFFFFF"/>
-            <w:vAlign w:val="center"/>
-          </w:tcPr>
-          <w:p>
-            <w:pPr>
-              <w:keepNext/>
-              <w:spacing w:before="60" w:after="60" w:line="264" w:lineRule="auto"/>
-            </w:pPr>
-            <w:r>
-              <w:rPr>
-                <w:sz w:val="22"/>
-              </w:rPr>
-              <w:t>35,37</w:t>
-            </w:r>
-          </w:p>
-        </w:tc>
-      </w:tr>
-      <w:tr>
-        <w:trPr>
-          <w:cantSplit/>
-          <w:jc w:val="center"/>
-        </w:trPr>
-        <w:tc>
-          <w:tcPr>
-            <w:tcW w:w="2232" w:type="dxa"/>
-            <w:shd w:val="clear" w:color="auto" w:fill="FFFFFF"/>
-            <w:vAlign w:val="center"/>
-          </w:tcPr>
-          <w:p>
-            <w:pPr>
-              <w:keepNext/>
-              <w:spacing w:before="60" w:after="60" w:line="264" w:lineRule="auto"/>
-            </w:pPr>
-            <w:r>
-              <w:rPr>
-                <w:sz w:val="22"/>
-              </w:rPr>
-              <w:t>Hà Nội</w:t>
-            </w:r>
-          </w:p>
-        </w:tc>
-        <w:tc>
-          <w:tcPr>
-            <w:tcW w:w="1080" w:type="dxa"/>
-            <w:shd w:val="clear" w:color="auto" w:fill="FFFFFF"/>
-            <w:vAlign w:val="center"/>
-          </w:tcPr>
-          <w:p>
-            <w:pPr>
-              <w:keepNext/>
-              <w:spacing w:before="60" w:after="60" w:line="264" w:lineRule="auto"/>
-            </w:pPr>
-            <w:r>
-              <w:rPr>
-                <w:sz w:val="22"/>
-              </w:rPr>
-              <w:t>Ngọc Quyên</w:t>
-            </w:r>
-          </w:p>
-        </w:tc>
-        <w:tc>
-          <w:tcPr>
-            <w:tcW w:w="1440" w:type="dxa"/>
-            <w:shd w:val="clear" w:color="auto" w:fill="FFFFFF"/>
-            <w:vAlign w:val="center"/>
-          </w:tcPr>
-          <w:p>
-            <w:pPr>
-              <w:keepNext/>
-              <w:spacing w:before="60" w:after="60" w:line="264" w:lineRule="auto"/>
-            </w:pPr>
-            <w:r>
-              <w:rPr>
-                <w:sz w:val="22"/>
-              </w:rPr>
-              <w:t>41</w:t>
-            </w:r>
-          </w:p>
-        </w:tc>
-        <w:tc>
-          <w:tcPr>
-            <w:tcW w:w="1440" w:type="dxa"/>
-            <w:shd w:val="clear" w:color="auto" w:fill="FFFFFF"/>
-            <w:vAlign w:val="center"/>
-          </w:tcPr>
-          <w:p>
-            <w:pPr>
-              <w:keepNext/>
-              <w:spacing w:before="60" w:after="60" w:line="264" w:lineRule="auto"/>
-            </w:pPr>
-            <w:r>
-              <w:rPr>
-                <w:sz w:val="22"/>
-              </w:rPr>
-              <w:t>19</w:t>
-            </w:r>
-          </w:p>
-        </w:tc>
-        <w:tc>
-          <w:tcPr>
-            <w:tcW w:w="1872" w:type="dxa"/>
-            <w:shd w:val="clear" w:color="auto" w:fill="FFFFFF"/>
-            <w:vAlign w:val="center"/>
-          </w:tcPr>
-          <w:p>
-            <w:pPr>
-              <w:keepNext/>
-              <w:spacing w:before="60" w:after="60" w:line="264" w:lineRule="auto"/>
-            </w:pPr>
-            <w:r>
-              <w:rPr>
-                <w:sz w:val="22"/>
-              </w:rPr>
-              <w:t>69,10</w:t>
-            </w:r>
-          </w:p>
-        </w:tc>
-        <w:tc>
-          <w:tcPr>
-            <w:tcW w:w="1872" w:type="dxa"/>
-            <w:shd w:val="clear" w:color="auto" w:fill="FFFFFF"/>
-            <w:vAlign w:val="center"/>
-          </w:tcPr>
-          <w:p>
-            <w:pPr>
-              <w:keepNext/>
-              <w:spacing w:before="60" w:after="60" w:line="264" w:lineRule="auto"/>
-            </w:pPr>
-            <w:r>
-              <w:rPr>
-                <w:sz w:val="22"/>
-              </w:rPr>
-              <w:t>163,05</w:t>
-            </w:r>
-          </w:p>
-        </w:tc>
-      </w:tr>
-      <w:tr>
-        <w:trPr>
-          <w:cantSplit/>
-          <w:jc w:val="center"/>
-        </w:trPr>
-        <w:tc>
-          <w:tcPr>
-            <w:tcW w:w="2232" w:type="dxa"/>
-            <w:shd w:val="clear" w:color="auto" w:fill="FFFFFF"/>
-            <w:vAlign w:val="center"/>
-          </w:tcPr>
-          <w:p>
-            <w:pPr>
-              <w:spacing w:before="60" w:after="60" w:line="264" w:lineRule="auto"/>
-            </w:pPr>
-            <w:r>
-              <w:rPr>
-                <w:sz w:val="22"/>
-              </w:rPr>
-              <w:t>TP. Hồ Chí Minh</w:t>
-            </w:r>
-          </w:p>
-        </w:tc>
-        <w:tc>
-          <w:tcPr>
-            <w:tcW w:w="1080" w:type="dxa"/>
-            <w:shd w:val="clear" w:color="auto" w:fill="FFFFFF"/>
-            <w:vAlign w:val="center"/>
-          </w:tcPr>
-          <w:p>
-            <w:pPr>
-              <w:spacing w:before="60" w:after="60" w:line="264" w:lineRule="auto"/>
-            </w:pPr>
-            <w:r>
-              <w:rPr>
-                <w:sz w:val="22"/>
-              </w:rPr>
-              <w:t>Ngọc Quyên</w:t>
-            </w:r>
-          </w:p>
-        </w:tc>
-        <w:tc>
-          <w:tcPr>
-            <w:tcW w:w="1440" w:type="dxa"/>
-            <w:shd w:val="clear" w:color="auto" w:fill="FFFFFF"/>
-            <w:vAlign w:val="center"/>
-          </w:tcPr>
-          <w:p>
-            <w:pPr>
-              <w:spacing w:before="60" w:after="60" w:line="264" w:lineRule="auto"/>
-            </w:pPr>
-            <w:r>
-              <w:rPr>
-                <w:sz w:val="22"/>
-              </w:rPr>
-              <w:t>41</w:t>
-            </w:r>
-          </w:p>
-        </w:tc>
-        <w:tc>
-          <w:tcPr>
-            <w:tcW w:w="1440" w:type="dxa"/>
-            <w:shd w:val="clear" w:color="auto" w:fill="FFFFFF"/>
-            <w:vAlign w:val="center"/>
-          </w:tcPr>
-          <w:p>
-            <w:pPr>
-              <w:spacing w:before="60" w:after="60" w:line="264" w:lineRule="auto"/>
-            </w:pPr>
-            <w:r>
-              <w:rPr>
-                <w:sz w:val="22"/>
-              </w:rPr>
-              <w:t>19</w:t>
-            </w:r>
-          </w:p>
-        </w:tc>
-        <w:tc>
-          <w:tcPr>
-            <w:tcW w:w="1872" w:type="dxa"/>
-            <w:shd w:val="clear" w:color="auto" w:fill="FFFFFF"/>
-            <w:vAlign w:val="center"/>
-          </w:tcPr>
-          <w:p>
-            <w:pPr>
-              <w:spacing w:before="60" w:after="60" w:line="264" w:lineRule="auto"/>
-            </w:pPr>
-            <w:r>
-              <w:rPr>
-                <w:sz w:val="22"/>
-              </w:rPr>
-              <w:t>112,27</w:t>
-            </w:r>
-          </w:p>
-        </w:tc>
-        <w:tc>
-          <w:tcPr>
-            <w:tcW w:w="1872" w:type="dxa"/>
-            <w:shd w:val="clear" w:color="auto" w:fill="FFFFFF"/>
-            <w:vAlign w:val="center"/>
-          </w:tcPr>
-          <w:p>
-            <w:pPr>
-              <w:spacing w:before="60" w:after="60" w:line="264" w:lineRule="auto"/>
-            </w:pPr>
-            <w:r>
-              <w:rPr>
-                <w:sz w:val="22"/>
-              </w:rPr>
-              <w:t>79,05</w:t>
-            </w:r>
-          </w:p>
-        </w:tc>
-      </w:tr>
-    </w:tbl>
-    <w:p>
-      <w:pPr>
-        <w:keepNext/>
-        <w:spacing w:after="60"/>
+        <w:pageBreakBefore/>
+        <w:spacing w:after="100"/>
         <w:jc w:val="center"/>
       </w:pPr>
       <w:r>
         <w:rPr>
           <w:noProof/>
         </w:rPr>
+        <w:lastRenderedPageBreak/>
         <w:drawing>
-          <wp:inline distT="0" distB="0" distL="0" distR="0" wp14:anchorId="72CDC515" wp14:editId="5B0E9A22">
+          <wp:inline distT="0" distB="0" distL="0" distR="0" wp14:anchorId="2F17AF56" wp14:editId="3AAE503B">
             <wp:extent cx="6126480" cy="3039158"/>
             <wp:effectExtent l="0" t="0" r="0" b="0"/>
-            <wp:docPr id="15" name="Picture 15"/>
+            <wp:docPr id="19" name="Picture 19"/>
             <wp:cNvGraphicFramePr>
               <a:graphicFrameLocks xmlns:a="http://schemas.openxmlformats.org/drawingml/2006/main" noChangeAspect="1"/>
             </wp:cNvGraphicFramePr>
@@ -18455,7 +17665,7 @@
               <a:graphicData uri="http://schemas.openxmlformats.org/drawingml/2006/picture">
                 <pic:pic xmlns:pic="http://schemas.openxmlformats.org/drawingml/2006/picture">
                   <pic:nvPicPr>
-                    <pic:cNvPr id="0" name="image.png"/>
+                    <pic:cNvPr id="0" name="17_submitted_week1_aqi.png"/>
                     <pic:cNvPicPr/>
                   </pic:nvPicPr>
                   <pic:blipFill>
@@ -18483,11 +17693,1032 @@
     <w:p>
       <w:pPr>
         <w:pStyle w:val="Caption"/>
+        <w:spacing w:before="60" w:after="160"/>
+        <w:jc w:val="center"/>
+      </w:pPr>
+      <w:r>
+        <w:t>Hình 3.12 AQI trung bình: bộ báo cáo Tuần 1 và mẫu Tuần 2</w:t>
+      </w:r>
+    </w:p>
+    <w:p>
+      <w:pPr>
+        <w:keepNext/>
+        <w:spacing w:after="100"/>
+        <w:jc w:val="center"/>
+      </w:pPr>
+      <w:r>
+        <w:rPr>
+          <w:noProof/>
+        </w:rPr>
+        <w:drawing>
+          <wp:inline distT="0" distB="0" distL="0" distR="0" wp14:anchorId="4C48C70B" wp14:editId="1F08C225">
+            <wp:extent cx="6126480" cy="3037964"/>
+            <wp:effectExtent l="0" t="0" r="0" b="0"/>
+            <wp:docPr id="20" name="Picture 20"/>
+            <wp:cNvGraphicFramePr>
+              <a:graphicFrameLocks xmlns:a="http://schemas.openxmlformats.org/drawingml/2006/main" noChangeAspect="1"/>
+            </wp:cNvGraphicFramePr>
+            <a:graphic xmlns:a="http://schemas.openxmlformats.org/drawingml/2006/main">
+              <a:graphicData uri="http://schemas.openxmlformats.org/drawingml/2006/picture">
+                <pic:pic xmlns:pic="http://schemas.openxmlformats.org/drawingml/2006/picture">
+                  <pic:nvPicPr>
+                    <pic:cNvPr id="0" name="18_submitted_week1_pm25.png"/>
+                    <pic:cNvPicPr/>
+                  </pic:nvPicPr>
+                  <pic:blipFill>
+                    <a:blip r:embed="rId27"/>
+                    <a:stretch>
+                      <a:fillRect/>
+                    </a:stretch>
+                  </pic:blipFill>
+                  <pic:spPr>
+                    <a:xfrm>
+                      <a:off x="0" y="0"/>
+                      <a:ext cx="6126480" cy="3037964"/>
+                    </a:xfrm>
+                    <a:prstGeom prst="rect">
+                      <a:avLst/>
+                    </a:prstGeom>
+                  </pic:spPr>
+                </pic:pic>
+              </a:graphicData>
+            </a:graphic>
+          </wp:inline>
+        </w:drawing>
+      </w:r>
+    </w:p>
+    <w:p>
+      <w:pPr>
+        <w:pStyle w:val="Caption"/>
+        <w:spacing w:before="60" w:after="160"/>
+        <w:jc w:val="center"/>
+      </w:pPr>
+      <w:r>
+        <w:t>Hình 3.13 PM2.5 trung bình: bộ báo cáo Tuần 1 và mẫu Tuần 2</w:t>
+      </w:r>
+    </w:p>
+    <w:p>
+      <w:pPr>
+        <w:pStyle w:val="BodyText"/>
+      </w:pPr>
+      <w:r>
+        <w:t>Hình 3.12 và Hình 3.13 sử dụng bộ 156 bản ghi của báo cáo Tuần 1 (52 mẫu mỗi đô thị) làm mốc chung. Mẫu Tuần 2 có 9 mẫu của sinh viên Tiến Sơn và 19 mẫu của sinh viên Ngọc Quyên cho mỗi đô thị. Hai nguồn được trình bày riêng; chênh lệch giữa các tập mẫu không đại diện cho xu hướng toàn bộ tuần.</w:t>
+      </w:r>
+    </w:p>
+    <w:p>
+      <w:pPr>
+        <w:pStyle w:val="BodyText"/>
+        <w:keepNext/>
+        <w:pageBreakBefore/>
+      </w:pPr>
+      <w:r>
+        <w:rPr>
+          <w:b/>
+        </w:rPr>
+        <w:lastRenderedPageBreak/>
+        <w:t>b) Đối chiếu theo ranh giới tuần trong cùng lần xuất mới</w:t>
+      </w:r>
+    </w:p>
+    <w:p>
+      <w:pPr>
+        <w:pStyle w:val="BodyText"/>
+      </w:pPr>
+      <w:r>
+        <w:t>Phép đối chiếu tiếp theo lọc hai tuần từ cùng lần xuất mới trong bộ dữ liệu của từng sinh viên. Mẫu Tuần 1 có 42 dòng mỗi đô thị trong bộ của sinh viên Tiến Sơn và 41 trong bộ của sinh viên Ngọc Quyên. Phạm vi này khác mốc 52 mẫu trong hai bảng trên; Hình 3.14 minh họa riêng phép lọc này.</w:t>
+      </w:r>
+    </w:p>
+    <w:p>
+      <w:pPr>
+        <w:pStyle w:val="Caption"/>
+        <w:keepNext/>
         <w:spacing w:before="80" w:after="160" w:line="252" w:lineRule="auto"/>
         <w:jc w:val="center"/>
       </w:pPr>
       <w:r>
-        <w:t>Hình 3.12 So sánh các mẫu thuộc Tuần 1 và Tuần 2 trong dữ liệu vừa tải</w:t>
+        <w:t>Bảng 3.12 AQI theo ranh giới tuần trong lần xuất mới</w:t>
+      </w:r>
+    </w:p>
+    <w:tbl>
+      <w:tblPr>
+        <w:tblStyle w:val="TableGrid"/>
+        <w:tblW w:w="0" w:type="auto"/>
+        <w:jc w:val="center"/>
+        <w:tblLayout w:type="fixed"/>
+        <w:tblLook w:val="04A0" w:firstRow="1" w:lastRow="0" w:firstColumn="1" w:lastColumn="0" w:noHBand="0" w:noVBand="1"/>
+      </w:tblPr>
+      <w:tblGrid>
+        <w:gridCol w:w="2232"/>
+        <w:gridCol w:w="1080"/>
+        <w:gridCol w:w="1440"/>
+        <w:gridCol w:w="1440"/>
+        <w:gridCol w:w="1872"/>
+        <w:gridCol w:w="1872"/>
+      </w:tblGrid>
+      <w:tr>
+        <w:trPr>
+          <w:cantSplit/>
+          <w:tblHeader/>
+          <w:jc w:val="center"/>
+        </w:trPr>
+        <w:tc>
+          <w:tcPr>
+            <w:tcW w:w="2232" w:type="dxa"/>
+            <w:shd w:val="clear" w:color="auto" w:fill="E7E7E7"/>
+            <w:vAlign w:val="center"/>
+          </w:tcPr>
+          <w:p>
+            <w:pPr>
+              <w:keepNext/>
+              <w:spacing w:before="60" w:after="60" w:line="264" w:lineRule="auto"/>
+              <w:jc w:val="center"/>
+            </w:pPr>
+            <w:r>
+              <w:rPr>
+                <w:b/>
+                <w:sz w:val="22"/>
+              </w:rPr>
+              <w:t>Đô thị</w:t>
+            </w:r>
+          </w:p>
+        </w:tc>
+        <w:tc>
+          <w:tcPr>
+            <w:tcW w:w="1080" w:type="dxa"/>
+            <w:shd w:val="clear" w:color="auto" w:fill="E7E7E7"/>
+            <w:vAlign w:val="center"/>
+          </w:tcPr>
+          <w:p>
+            <w:pPr>
+              <w:keepNext/>
+              <w:spacing w:before="60" w:after="60" w:line="264" w:lineRule="auto"/>
+              <w:jc w:val="center"/>
+            </w:pPr>
+            <w:r>
+              <w:rPr>
+                <w:b/>
+                <w:sz w:val="22"/>
+              </w:rPr>
+              <w:t>Sinh viên</w:t>
+            </w:r>
+          </w:p>
+        </w:tc>
+        <w:tc>
+          <w:tcPr>
+            <w:tcW w:w="1440" w:type="dxa"/>
+            <w:shd w:val="clear" w:color="auto" w:fill="E7E7E7"/>
+            <w:vAlign w:val="center"/>
+          </w:tcPr>
+          <w:p>
+            <w:pPr>
+              <w:keepNext/>
+              <w:spacing w:before="60" w:after="60" w:line="264" w:lineRule="auto"/>
+              <w:jc w:val="center"/>
+            </w:pPr>
+            <w:r>
+              <w:rPr>
+                <w:b/>
+                <w:sz w:val="22"/>
+              </w:rPr>
+              <w:t>n Tuần 1</w:t>
+            </w:r>
+          </w:p>
+        </w:tc>
+        <w:tc>
+          <w:tcPr>
+            <w:tcW w:w="1440" w:type="dxa"/>
+            <w:shd w:val="clear" w:color="auto" w:fill="E7E7E7"/>
+            <w:vAlign w:val="center"/>
+          </w:tcPr>
+          <w:p>
+            <w:pPr>
+              <w:keepNext/>
+              <w:spacing w:before="60" w:after="60" w:line="264" w:lineRule="auto"/>
+              <w:jc w:val="center"/>
+            </w:pPr>
+            <w:r>
+              <w:rPr>
+                <w:b/>
+                <w:sz w:val="22"/>
+              </w:rPr>
+              <w:t>n Tuần 2</w:t>
+            </w:r>
+          </w:p>
+        </w:tc>
+        <w:tc>
+          <w:tcPr>
+            <w:tcW w:w="1872" w:type="dxa"/>
+            <w:shd w:val="clear" w:color="auto" w:fill="E7E7E7"/>
+            <w:vAlign w:val="center"/>
+          </w:tcPr>
+          <w:p>
+            <w:pPr>
+              <w:keepNext/>
+              <w:spacing w:before="60" w:after="60" w:line="264" w:lineRule="auto"/>
+              <w:jc w:val="center"/>
+            </w:pPr>
+            <w:r>
+              <w:rPr>
+                <w:b/>
+                <w:sz w:val="22"/>
+              </w:rPr>
+              <w:t>AQI Tuần 1</w:t>
+            </w:r>
+          </w:p>
+        </w:tc>
+        <w:tc>
+          <w:tcPr>
+            <w:tcW w:w="1872" w:type="dxa"/>
+            <w:shd w:val="clear" w:color="auto" w:fill="E7E7E7"/>
+            <w:vAlign w:val="center"/>
+          </w:tcPr>
+          <w:p>
+            <w:pPr>
+              <w:keepNext/>
+              <w:spacing w:before="60" w:after="60" w:line="264" w:lineRule="auto"/>
+              <w:jc w:val="center"/>
+            </w:pPr>
+            <w:r>
+              <w:rPr>
+                <w:b/>
+                <w:sz w:val="22"/>
+              </w:rPr>
+              <w:t>AQI Tuần 2</w:t>
+            </w:r>
+          </w:p>
+        </w:tc>
+      </w:tr>
+      <w:tr>
+        <w:trPr>
+          <w:cantSplit/>
+          <w:jc w:val="center"/>
+        </w:trPr>
+        <w:tc>
+          <w:tcPr>
+            <w:tcW w:w="2232" w:type="dxa"/>
+            <w:shd w:val="clear" w:color="auto" w:fill="FFFFFF"/>
+            <w:vAlign w:val="center"/>
+          </w:tcPr>
+          <w:p>
+            <w:pPr>
+              <w:keepNext/>
+              <w:spacing w:before="60" w:after="60" w:line="264" w:lineRule="auto"/>
+            </w:pPr>
+            <w:r>
+              <w:rPr>
+                <w:sz w:val="22"/>
+              </w:rPr>
+              <w:t>Đà Nẵng</w:t>
+            </w:r>
+          </w:p>
+        </w:tc>
+        <w:tc>
+          <w:tcPr>
+            <w:tcW w:w="1080" w:type="dxa"/>
+            <w:shd w:val="clear" w:color="auto" w:fill="FFFFFF"/>
+            <w:vAlign w:val="center"/>
+          </w:tcPr>
+          <w:p>
+            <w:pPr>
+              <w:keepNext/>
+              <w:spacing w:before="60" w:after="60" w:line="264" w:lineRule="auto"/>
+            </w:pPr>
+            <w:r>
+              <w:rPr>
+                <w:sz w:val="22"/>
+              </w:rPr>
+              <w:t>Tiến Sơn</w:t>
+            </w:r>
+          </w:p>
+        </w:tc>
+        <w:tc>
+          <w:tcPr>
+            <w:tcW w:w="1440" w:type="dxa"/>
+            <w:shd w:val="clear" w:color="auto" w:fill="FFFFFF"/>
+            <w:vAlign w:val="center"/>
+          </w:tcPr>
+          <w:p>
+            <w:pPr>
+              <w:keepNext/>
+              <w:spacing w:before="60" w:after="60" w:line="264" w:lineRule="auto"/>
+            </w:pPr>
+            <w:r>
+              <w:rPr>
+                <w:sz w:val="22"/>
+              </w:rPr>
+              <w:t>42</w:t>
+            </w:r>
+          </w:p>
+        </w:tc>
+        <w:tc>
+          <w:tcPr>
+            <w:tcW w:w="1440" w:type="dxa"/>
+            <w:shd w:val="clear" w:color="auto" w:fill="FFFFFF"/>
+            <w:vAlign w:val="center"/>
+          </w:tcPr>
+          <w:p>
+            <w:pPr>
+              <w:keepNext/>
+              <w:spacing w:before="60" w:after="60" w:line="264" w:lineRule="auto"/>
+            </w:pPr>
+            <w:r>
+              <w:rPr>
+                <w:sz w:val="22"/>
+              </w:rPr>
+              <w:t>9</w:t>
+            </w:r>
+          </w:p>
+        </w:tc>
+        <w:tc>
+          <w:tcPr>
+            <w:tcW w:w="1872" w:type="dxa"/>
+            <w:shd w:val="clear" w:color="auto" w:fill="FFFFFF"/>
+            <w:vAlign w:val="center"/>
+          </w:tcPr>
+          <w:p>
+            <w:pPr>
+              <w:keepNext/>
+              <w:spacing w:before="60" w:after="60" w:line="264" w:lineRule="auto"/>
+            </w:pPr>
+            <w:r>
+              <w:rPr>
+                <w:sz w:val="22"/>
+              </w:rPr>
+              <w:t>65,60</w:t>
+            </w:r>
+          </w:p>
+        </w:tc>
+        <w:tc>
+          <w:tcPr>
+            <w:tcW w:w="1872" w:type="dxa"/>
+            <w:shd w:val="clear" w:color="auto" w:fill="FFFFFF"/>
+            <w:vAlign w:val="center"/>
+          </w:tcPr>
+          <w:p>
+            <w:pPr>
+              <w:keepNext/>
+              <w:spacing w:before="60" w:after="60" w:line="264" w:lineRule="auto"/>
+            </w:pPr>
+            <w:r>
+              <w:rPr>
+                <w:sz w:val="22"/>
+              </w:rPr>
+              <w:t>35,44</w:t>
+            </w:r>
+          </w:p>
+        </w:tc>
+      </w:tr>
+      <w:tr>
+        <w:trPr>
+          <w:cantSplit/>
+          <w:jc w:val="center"/>
+        </w:trPr>
+        <w:tc>
+          <w:tcPr>
+            <w:tcW w:w="2232" w:type="dxa"/>
+            <w:shd w:val="clear" w:color="auto" w:fill="FFFFFF"/>
+            <w:vAlign w:val="center"/>
+          </w:tcPr>
+          <w:p>
+            <w:pPr>
+              <w:keepNext/>
+              <w:spacing w:before="60" w:after="60" w:line="264" w:lineRule="auto"/>
+            </w:pPr>
+            <w:r>
+              <w:rPr>
+                <w:sz w:val="22"/>
+              </w:rPr>
+              <w:t>Hà Nội</w:t>
+            </w:r>
+          </w:p>
+        </w:tc>
+        <w:tc>
+          <w:tcPr>
+            <w:tcW w:w="1080" w:type="dxa"/>
+            <w:shd w:val="clear" w:color="auto" w:fill="FFFFFF"/>
+            <w:vAlign w:val="center"/>
+          </w:tcPr>
+          <w:p>
+            <w:pPr>
+              <w:keepNext/>
+              <w:spacing w:before="60" w:after="60" w:line="264" w:lineRule="auto"/>
+            </w:pPr>
+            <w:r>
+              <w:rPr>
+                <w:sz w:val="22"/>
+              </w:rPr>
+              <w:t>Tiến Sơn</w:t>
+            </w:r>
+          </w:p>
+        </w:tc>
+        <w:tc>
+          <w:tcPr>
+            <w:tcW w:w="1440" w:type="dxa"/>
+            <w:shd w:val="clear" w:color="auto" w:fill="FFFFFF"/>
+            <w:vAlign w:val="center"/>
+          </w:tcPr>
+          <w:p>
+            <w:pPr>
+              <w:keepNext/>
+              <w:spacing w:before="60" w:after="60" w:line="264" w:lineRule="auto"/>
+            </w:pPr>
+            <w:r>
+              <w:rPr>
+                <w:sz w:val="22"/>
+              </w:rPr>
+              <w:t>42</w:t>
+            </w:r>
+          </w:p>
+        </w:tc>
+        <w:tc>
+          <w:tcPr>
+            <w:tcW w:w="1440" w:type="dxa"/>
+            <w:shd w:val="clear" w:color="auto" w:fill="FFFFFF"/>
+            <w:vAlign w:val="center"/>
+          </w:tcPr>
+          <w:p>
+            <w:pPr>
+              <w:keepNext/>
+              <w:spacing w:before="60" w:after="60" w:line="264" w:lineRule="auto"/>
+            </w:pPr>
+            <w:r>
+              <w:rPr>
+                <w:sz w:val="22"/>
+              </w:rPr>
+              <w:t>9</w:t>
+            </w:r>
+          </w:p>
+        </w:tc>
+        <w:tc>
+          <w:tcPr>
+            <w:tcW w:w="1872" w:type="dxa"/>
+            <w:shd w:val="clear" w:color="auto" w:fill="FFFFFF"/>
+            <w:vAlign w:val="center"/>
+          </w:tcPr>
+          <w:p>
+            <w:pPr>
+              <w:keepNext/>
+              <w:spacing w:before="60" w:after="60" w:line="264" w:lineRule="auto"/>
+            </w:pPr>
+            <w:r>
+              <w:rPr>
+                <w:sz w:val="22"/>
+              </w:rPr>
+              <w:t>65,74</w:t>
+            </w:r>
+          </w:p>
+        </w:tc>
+        <w:tc>
+          <w:tcPr>
+            <w:tcW w:w="1872" w:type="dxa"/>
+            <w:shd w:val="clear" w:color="auto" w:fill="FFFFFF"/>
+            <w:vAlign w:val="center"/>
+          </w:tcPr>
+          <w:p>
+            <w:pPr>
+              <w:keepNext/>
+              <w:spacing w:before="60" w:after="60" w:line="264" w:lineRule="auto"/>
+            </w:pPr>
+            <w:r>
+              <w:rPr>
+                <w:sz w:val="22"/>
+              </w:rPr>
+              <w:t>163,56</w:t>
+            </w:r>
+          </w:p>
+        </w:tc>
+      </w:tr>
+      <w:tr>
+        <w:trPr>
+          <w:cantSplit/>
+          <w:jc w:val="center"/>
+        </w:trPr>
+        <w:tc>
+          <w:tcPr>
+            <w:tcW w:w="2232" w:type="dxa"/>
+            <w:shd w:val="clear" w:color="auto" w:fill="FFFFFF"/>
+            <w:vAlign w:val="center"/>
+          </w:tcPr>
+          <w:p>
+            <w:pPr>
+              <w:keepNext/>
+              <w:spacing w:before="60" w:after="60" w:line="264" w:lineRule="auto"/>
+            </w:pPr>
+            <w:r>
+              <w:rPr>
+                <w:sz w:val="22"/>
+              </w:rPr>
+              <w:t>TP. Hồ Chí Minh</w:t>
+            </w:r>
+          </w:p>
+        </w:tc>
+        <w:tc>
+          <w:tcPr>
+            <w:tcW w:w="1080" w:type="dxa"/>
+            <w:shd w:val="clear" w:color="auto" w:fill="FFFFFF"/>
+            <w:vAlign w:val="center"/>
+          </w:tcPr>
+          <w:p>
+            <w:pPr>
+              <w:keepNext/>
+              <w:spacing w:before="60" w:after="60" w:line="264" w:lineRule="auto"/>
+            </w:pPr>
+            <w:r>
+              <w:rPr>
+                <w:sz w:val="22"/>
+              </w:rPr>
+              <w:t>Tiến Sơn</w:t>
+            </w:r>
+          </w:p>
+        </w:tc>
+        <w:tc>
+          <w:tcPr>
+            <w:tcW w:w="1440" w:type="dxa"/>
+            <w:shd w:val="clear" w:color="auto" w:fill="FFFFFF"/>
+            <w:vAlign w:val="center"/>
+          </w:tcPr>
+          <w:p>
+            <w:pPr>
+              <w:keepNext/>
+              <w:spacing w:before="60" w:after="60" w:line="264" w:lineRule="auto"/>
+            </w:pPr>
+            <w:r>
+              <w:rPr>
+                <w:sz w:val="22"/>
+              </w:rPr>
+              <w:t>42</w:t>
+            </w:r>
+          </w:p>
+        </w:tc>
+        <w:tc>
+          <w:tcPr>
+            <w:tcW w:w="1440" w:type="dxa"/>
+            <w:shd w:val="clear" w:color="auto" w:fill="FFFFFF"/>
+            <w:vAlign w:val="center"/>
+          </w:tcPr>
+          <w:p>
+            <w:pPr>
+              <w:keepNext/>
+              <w:spacing w:before="60" w:after="60" w:line="264" w:lineRule="auto"/>
+            </w:pPr>
+            <w:r>
+              <w:rPr>
+                <w:sz w:val="22"/>
+              </w:rPr>
+              <w:t>9</w:t>
+            </w:r>
+          </w:p>
+        </w:tc>
+        <w:tc>
+          <w:tcPr>
+            <w:tcW w:w="1872" w:type="dxa"/>
+            <w:shd w:val="clear" w:color="auto" w:fill="FFFFFF"/>
+            <w:vAlign w:val="center"/>
+          </w:tcPr>
+          <w:p>
+            <w:pPr>
+              <w:keepNext/>
+              <w:spacing w:before="60" w:after="60" w:line="264" w:lineRule="auto"/>
+            </w:pPr>
+            <w:r>
+              <w:rPr>
+                <w:sz w:val="22"/>
+              </w:rPr>
+              <w:t>111,17</w:t>
+            </w:r>
+          </w:p>
+        </w:tc>
+        <w:tc>
+          <w:tcPr>
+            <w:tcW w:w="1872" w:type="dxa"/>
+            <w:shd w:val="clear" w:color="auto" w:fill="FFFFFF"/>
+            <w:vAlign w:val="center"/>
+          </w:tcPr>
+          <w:p>
+            <w:pPr>
+              <w:keepNext/>
+              <w:spacing w:before="60" w:after="60" w:line="264" w:lineRule="auto"/>
+            </w:pPr>
+            <w:r>
+              <w:rPr>
+                <w:sz w:val="22"/>
+              </w:rPr>
+              <w:t>78,00</w:t>
+            </w:r>
+          </w:p>
+        </w:tc>
+      </w:tr>
+      <w:tr>
+        <w:trPr>
+          <w:cantSplit/>
+          <w:jc w:val="center"/>
+        </w:trPr>
+        <w:tc>
+          <w:tcPr>
+            <w:tcW w:w="2232" w:type="dxa"/>
+            <w:shd w:val="clear" w:color="auto" w:fill="FFFFFF"/>
+            <w:vAlign w:val="center"/>
+          </w:tcPr>
+          <w:p>
+            <w:pPr>
+              <w:keepNext/>
+              <w:spacing w:before="60" w:after="60" w:line="264" w:lineRule="auto"/>
+            </w:pPr>
+            <w:r>
+              <w:rPr>
+                <w:sz w:val="22"/>
+              </w:rPr>
+              <w:t>Đà Nẵng</w:t>
+            </w:r>
+          </w:p>
+        </w:tc>
+        <w:tc>
+          <w:tcPr>
+            <w:tcW w:w="1080" w:type="dxa"/>
+            <w:shd w:val="clear" w:color="auto" w:fill="FFFFFF"/>
+            <w:vAlign w:val="center"/>
+          </w:tcPr>
+          <w:p>
+            <w:pPr>
+              <w:keepNext/>
+              <w:spacing w:before="60" w:after="60" w:line="264" w:lineRule="auto"/>
+            </w:pPr>
+            <w:r>
+              <w:rPr>
+                <w:sz w:val="22"/>
+              </w:rPr>
+              <w:t>Ngọc Quyên</w:t>
+            </w:r>
+          </w:p>
+        </w:tc>
+        <w:tc>
+          <w:tcPr>
+            <w:tcW w:w="1440" w:type="dxa"/>
+            <w:shd w:val="clear" w:color="auto" w:fill="FFFFFF"/>
+            <w:vAlign w:val="center"/>
+          </w:tcPr>
+          <w:p>
+            <w:pPr>
+              <w:keepNext/>
+              <w:spacing w:before="60" w:after="60" w:line="264" w:lineRule="auto"/>
+            </w:pPr>
+            <w:r>
+              <w:rPr>
+                <w:sz w:val="22"/>
+              </w:rPr>
+              <w:t>41</w:t>
+            </w:r>
+          </w:p>
+        </w:tc>
+        <w:tc>
+          <w:tcPr>
+            <w:tcW w:w="1440" w:type="dxa"/>
+            <w:shd w:val="clear" w:color="auto" w:fill="FFFFFF"/>
+            <w:vAlign w:val="center"/>
+          </w:tcPr>
+          <w:p>
+            <w:pPr>
+              <w:keepNext/>
+              <w:spacing w:before="60" w:after="60" w:line="264" w:lineRule="auto"/>
+            </w:pPr>
+            <w:r>
+              <w:rPr>
+                <w:sz w:val="22"/>
+              </w:rPr>
+              <w:t>19</w:t>
+            </w:r>
+          </w:p>
+        </w:tc>
+        <w:tc>
+          <w:tcPr>
+            <w:tcW w:w="1872" w:type="dxa"/>
+            <w:shd w:val="clear" w:color="auto" w:fill="FFFFFF"/>
+            <w:vAlign w:val="center"/>
+          </w:tcPr>
+          <w:p>
+            <w:pPr>
+              <w:keepNext/>
+              <w:spacing w:before="60" w:after="60" w:line="264" w:lineRule="auto"/>
+            </w:pPr>
+            <w:r>
+              <w:rPr>
+                <w:sz w:val="22"/>
+              </w:rPr>
+              <w:t>63,95</w:t>
+            </w:r>
+          </w:p>
+        </w:tc>
+        <w:tc>
+          <w:tcPr>
+            <w:tcW w:w="1872" w:type="dxa"/>
+            <w:shd w:val="clear" w:color="auto" w:fill="FFFFFF"/>
+            <w:vAlign w:val="center"/>
+          </w:tcPr>
+          <w:p>
+            <w:pPr>
+              <w:keepNext/>
+              <w:spacing w:before="60" w:after="60" w:line="264" w:lineRule="auto"/>
+            </w:pPr>
+            <w:r>
+              <w:rPr>
+                <w:sz w:val="22"/>
+              </w:rPr>
+              <w:t>35,37</w:t>
+            </w:r>
+          </w:p>
+        </w:tc>
+      </w:tr>
+      <w:tr>
+        <w:trPr>
+          <w:cantSplit/>
+          <w:jc w:val="center"/>
+        </w:trPr>
+        <w:tc>
+          <w:tcPr>
+            <w:tcW w:w="2232" w:type="dxa"/>
+            <w:shd w:val="clear" w:color="auto" w:fill="FFFFFF"/>
+            <w:vAlign w:val="center"/>
+          </w:tcPr>
+          <w:p>
+            <w:pPr>
+              <w:keepNext/>
+              <w:spacing w:before="60" w:after="60" w:line="264" w:lineRule="auto"/>
+            </w:pPr>
+            <w:r>
+              <w:rPr>
+                <w:sz w:val="22"/>
+              </w:rPr>
+              <w:t>Hà Nội</w:t>
+            </w:r>
+          </w:p>
+        </w:tc>
+        <w:tc>
+          <w:tcPr>
+            <w:tcW w:w="1080" w:type="dxa"/>
+            <w:shd w:val="clear" w:color="auto" w:fill="FFFFFF"/>
+            <w:vAlign w:val="center"/>
+          </w:tcPr>
+          <w:p>
+            <w:pPr>
+              <w:keepNext/>
+              <w:spacing w:before="60" w:after="60" w:line="264" w:lineRule="auto"/>
+            </w:pPr>
+            <w:r>
+              <w:rPr>
+                <w:sz w:val="22"/>
+              </w:rPr>
+              <w:t>Ngọc Quyên</w:t>
+            </w:r>
+          </w:p>
+        </w:tc>
+        <w:tc>
+          <w:tcPr>
+            <w:tcW w:w="1440" w:type="dxa"/>
+            <w:shd w:val="clear" w:color="auto" w:fill="FFFFFF"/>
+            <w:vAlign w:val="center"/>
+          </w:tcPr>
+          <w:p>
+            <w:pPr>
+              <w:keepNext/>
+              <w:spacing w:before="60" w:after="60" w:line="264" w:lineRule="auto"/>
+            </w:pPr>
+            <w:r>
+              <w:rPr>
+                <w:sz w:val="22"/>
+              </w:rPr>
+              <w:t>41</w:t>
+            </w:r>
+          </w:p>
+        </w:tc>
+        <w:tc>
+          <w:tcPr>
+            <w:tcW w:w="1440" w:type="dxa"/>
+            <w:shd w:val="clear" w:color="auto" w:fill="FFFFFF"/>
+            <w:vAlign w:val="center"/>
+          </w:tcPr>
+          <w:p>
+            <w:pPr>
+              <w:keepNext/>
+              <w:spacing w:before="60" w:after="60" w:line="264" w:lineRule="auto"/>
+            </w:pPr>
+            <w:r>
+              <w:rPr>
+                <w:sz w:val="22"/>
+              </w:rPr>
+              <w:t>19</w:t>
+            </w:r>
+          </w:p>
+        </w:tc>
+        <w:tc>
+          <w:tcPr>
+            <w:tcW w:w="1872" w:type="dxa"/>
+            <w:shd w:val="clear" w:color="auto" w:fill="FFFFFF"/>
+            <w:vAlign w:val="center"/>
+          </w:tcPr>
+          <w:p>
+            <w:pPr>
+              <w:keepNext/>
+              <w:spacing w:before="60" w:after="60" w:line="264" w:lineRule="auto"/>
+            </w:pPr>
+            <w:r>
+              <w:rPr>
+                <w:sz w:val="22"/>
+              </w:rPr>
+              <w:t>69,10</w:t>
+            </w:r>
+          </w:p>
+        </w:tc>
+        <w:tc>
+          <w:tcPr>
+            <w:tcW w:w="1872" w:type="dxa"/>
+            <w:shd w:val="clear" w:color="auto" w:fill="FFFFFF"/>
+            <w:vAlign w:val="center"/>
+          </w:tcPr>
+          <w:p>
+            <w:pPr>
+              <w:keepNext/>
+              <w:spacing w:before="60" w:after="60" w:line="264" w:lineRule="auto"/>
+            </w:pPr>
+            <w:r>
+              <w:rPr>
+                <w:sz w:val="22"/>
+              </w:rPr>
+              <w:t>163,05</w:t>
+            </w:r>
+          </w:p>
+        </w:tc>
+      </w:tr>
+      <w:tr>
+        <w:trPr>
+          <w:cantSplit/>
+          <w:jc w:val="center"/>
+        </w:trPr>
+        <w:tc>
+          <w:tcPr>
+            <w:tcW w:w="2232" w:type="dxa"/>
+            <w:shd w:val="clear" w:color="auto" w:fill="FFFFFF"/>
+            <w:vAlign w:val="center"/>
+          </w:tcPr>
+          <w:p>
+            <w:pPr>
+              <w:spacing w:before="60" w:after="60" w:line="264" w:lineRule="auto"/>
+            </w:pPr>
+            <w:r>
+              <w:rPr>
+                <w:sz w:val="22"/>
+              </w:rPr>
+              <w:t>TP. Hồ Chí Minh</w:t>
+            </w:r>
+          </w:p>
+        </w:tc>
+        <w:tc>
+          <w:tcPr>
+            <w:tcW w:w="1080" w:type="dxa"/>
+            <w:shd w:val="clear" w:color="auto" w:fill="FFFFFF"/>
+            <w:vAlign w:val="center"/>
+          </w:tcPr>
+          <w:p>
+            <w:pPr>
+              <w:spacing w:before="60" w:after="60" w:line="264" w:lineRule="auto"/>
+            </w:pPr>
+            <w:r>
+              <w:rPr>
+                <w:sz w:val="22"/>
+              </w:rPr>
+              <w:t>Ngọc Quyên</w:t>
+            </w:r>
+          </w:p>
+        </w:tc>
+        <w:tc>
+          <w:tcPr>
+            <w:tcW w:w="1440" w:type="dxa"/>
+            <w:shd w:val="clear" w:color="auto" w:fill="FFFFFF"/>
+            <w:vAlign w:val="center"/>
+          </w:tcPr>
+          <w:p>
+            <w:pPr>
+              <w:spacing w:before="60" w:after="60" w:line="264" w:lineRule="auto"/>
+            </w:pPr>
+            <w:r>
+              <w:rPr>
+                <w:sz w:val="22"/>
+              </w:rPr>
+              <w:t>41</w:t>
+            </w:r>
+          </w:p>
+        </w:tc>
+        <w:tc>
+          <w:tcPr>
+            <w:tcW w:w="1440" w:type="dxa"/>
+            <w:shd w:val="clear" w:color="auto" w:fill="FFFFFF"/>
+            <w:vAlign w:val="center"/>
+          </w:tcPr>
+          <w:p>
+            <w:pPr>
+              <w:spacing w:before="60" w:after="60" w:line="264" w:lineRule="auto"/>
+            </w:pPr>
+            <w:r>
+              <w:rPr>
+                <w:sz w:val="22"/>
+              </w:rPr>
+              <w:t>19</w:t>
+            </w:r>
+          </w:p>
+        </w:tc>
+        <w:tc>
+          <w:tcPr>
+            <w:tcW w:w="1872" w:type="dxa"/>
+            <w:shd w:val="clear" w:color="auto" w:fill="FFFFFF"/>
+            <w:vAlign w:val="center"/>
+          </w:tcPr>
+          <w:p>
+            <w:pPr>
+              <w:spacing w:before="60" w:after="60" w:line="264" w:lineRule="auto"/>
+            </w:pPr>
+            <w:r>
+              <w:rPr>
+                <w:sz w:val="22"/>
+              </w:rPr>
+              <w:t>112,27</w:t>
+            </w:r>
+          </w:p>
+        </w:tc>
+        <w:tc>
+          <w:tcPr>
+            <w:tcW w:w="1872" w:type="dxa"/>
+            <w:shd w:val="clear" w:color="auto" w:fill="FFFFFF"/>
+            <w:vAlign w:val="center"/>
+          </w:tcPr>
+          <w:p>
+            <w:pPr>
+              <w:spacing w:before="60" w:after="60" w:line="264" w:lineRule="auto"/>
+            </w:pPr>
+            <w:r>
+              <w:rPr>
+                <w:sz w:val="22"/>
+              </w:rPr>
+              <w:t>79,05</w:t>
+            </w:r>
+          </w:p>
+        </w:tc>
+      </w:tr>
+    </w:tbl>
+    <w:p>
+      <w:pPr>
+        <w:keepNext/>
+        <w:pageBreakBefore/>
+        <w:spacing w:after="60"/>
+        <w:jc w:val="center"/>
+      </w:pPr>
+      <w:r>
+        <w:rPr>
+          <w:noProof/>
+        </w:rPr>
+        <w:lastRenderedPageBreak/>
+        <w:drawing>
+          <wp:inline distT="0" distB="0" distL="0" distR="0" wp14:anchorId="72CDC515" wp14:editId="5B0E9A22">
+            <wp:extent cx="6126480" cy="3039158"/>
+            <wp:effectExtent l="0" t="0" r="0" b="0"/>
+            <wp:docPr id="15" name="Picture 15"/>
+            <wp:cNvGraphicFramePr>
+              <a:graphicFrameLocks xmlns:a="http://schemas.openxmlformats.org/drawingml/2006/main" noChangeAspect="1"/>
+            </wp:cNvGraphicFramePr>
+            <a:graphic xmlns:a="http://schemas.openxmlformats.org/drawingml/2006/main">
+              <a:graphicData uri="http://schemas.openxmlformats.org/drawingml/2006/picture">
+                <pic:pic xmlns:pic="http://schemas.openxmlformats.org/drawingml/2006/picture">
+                  <pic:nvPicPr>
+                    <pic:cNvPr id="0" name="image.png"/>
+                    <pic:cNvPicPr/>
+                  </pic:nvPicPr>
+                  <pic:blipFill>
+                    <a:blip r:embed="rId28"/>
+                    <a:stretch>
+                      <a:fillRect/>
+                    </a:stretch>
+                  </pic:blipFill>
+                  <pic:spPr>
+                    <a:xfrm>
+                      <a:off x="0" y="0"/>
+                      <a:ext cx="6126480" cy="3039158"/>
+                    </a:xfrm>
+                    <a:prstGeom prst="rect">
+                      <a:avLst/>
+                    </a:prstGeom>
+                  </pic:spPr>
+                </pic:pic>
+              </a:graphicData>
+            </a:graphic>
+          </wp:inline>
+        </w:drawing>
+      </w:r>
+    </w:p>
+    <w:p>
+      <w:pPr>
+        <w:pStyle w:val="Caption"/>
+        <w:spacing w:before="80" w:after="160" w:line="252" w:lineRule="auto"/>
+        <w:jc w:val="center"/>
+      </w:pPr>
+      <w:r>
+        <w:t>Hình 3.14 So sánh các mẫu thuộc Tuần 1 và Tuần 2 trong dữ liệu vừa tải</w:t>
       </w:r>
     </w:p>
     <w:p>
@@ -18505,7 +18736,7 @@
         <w:ind w:firstLine="504"/>
       </w:pPr>
       <w:r>
-        <w:t>Bảng 3.12 và Hình 3.12 dùng mẫu lọc theo ranh giới tuần trong lần xuất mới. Bảng 3.10 và Bảng 3.11 dùng bộ báo cáo Tuần 1 đã lưu, bao gồm phần lịch sử nạp bổ sung. Hai phạm vi được giữ riêng để giải thích rõ sự khác biệt về số mẫu và giá trị trung bình.</w:t>
+        <w:t>Bảng 3.12 và Hình 3.14 dùng mẫu lọc theo ranh giới tuần trong lần xuất mới. Bảng 3.10 và Bảng 3.11 dùng bộ báo cáo Tuần 1 đã lưu, bao gồm phần lịch sử nạp bổ sung. Hai phạm vi được giữ riêng để giải thích rõ sự khác biệt về số mẫu và giá trị trung bình.</w:t>
       </w:r>
     </w:p>
     <w:p>
@@ -18514,46 +18745,54 @@
         <w:pageBreakBefore/>
         <w:jc w:val="left"/>
       </w:pPr>
-      <w:bookmarkStart w:id="169" w:name="_Toc242867478"/>
-      <w:bookmarkStart w:id="170" w:name="_Toc242869289"/>
-      <w:bookmarkStart w:id="171" w:name="_Toc242869449"/>
-      <w:bookmarkStart w:id="172" w:name="_Toc242871586"/>
-      <w:bookmarkStart w:id="173" w:name="_Toc242871774"/>
-      <w:bookmarkStart w:id="174" w:name="_Toc242872962"/>
-      <w:bookmarkStart w:id="175" w:name="_Toc242874466"/>
+      <w:bookmarkStart w:id="221" w:name="_Toc242867478"/>
+      <w:bookmarkStart w:id="222" w:name="_Toc242869289"/>
+      <w:bookmarkStart w:id="223" w:name="_Toc242869449"/>
+      <w:bookmarkStart w:id="224" w:name="_Toc242871586"/>
+      <w:bookmarkStart w:id="225" w:name="_Toc242871774"/>
+      <w:bookmarkStart w:id="226" w:name="_Toc242872962"/>
+      <w:bookmarkStart w:id="227" w:name="_Toc242874466"/>
+      <w:bookmarkStart w:id="228" w:name="_Toc242875964"/>
+      <w:bookmarkStart w:id="229" w:name="_Toc242876929"/>
       <w:r>
         <w:lastRenderedPageBreak/>
         <w:t>Chương 4 Phân tích vận hành Lambda và SNS</w:t>
       </w:r>
-      <w:bookmarkEnd w:id="169"/>
-      <w:bookmarkEnd w:id="170"/>
-      <w:bookmarkEnd w:id="171"/>
-      <w:bookmarkEnd w:id="172"/>
-      <w:bookmarkEnd w:id="173"/>
-      <w:bookmarkEnd w:id="174"/>
-      <w:bookmarkEnd w:id="175"/>
+      <w:bookmarkEnd w:id="221"/>
+      <w:bookmarkEnd w:id="222"/>
+      <w:bookmarkEnd w:id="223"/>
+      <w:bookmarkEnd w:id="224"/>
+      <w:bookmarkEnd w:id="225"/>
+      <w:bookmarkEnd w:id="226"/>
+      <w:bookmarkEnd w:id="227"/>
+      <w:bookmarkEnd w:id="228"/>
+      <w:bookmarkEnd w:id="229"/>
     </w:p>
     <w:p>
       <w:pPr>
         <w:pStyle w:val="Heading2"/>
       </w:pPr>
-      <w:bookmarkStart w:id="176" w:name="_Toc242867479"/>
-      <w:bookmarkStart w:id="177" w:name="_Toc242869290"/>
-      <w:bookmarkStart w:id="178" w:name="_Toc242869450"/>
-      <w:bookmarkStart w:id="179" w:name="_Toc242871587"/>
-      <w:bookmarkStart w:id="180" w:name="_Toc242871775"/>
-      <w:bookmarkStart w:id="181" w:name="_Toc242872963"/>
-      <w:bookmarkStart w:id="182" w:name="_Toc242874467"/>
+      <w:bookmarkStart w:id="230" w:name="_Toc242867479"/>
+      <w:bookmarkStart w:id="231" w:name="_Toc242869290"/>
+      <w:bookmarkStart w:id="232" w:name="_Toc242869450"/>
+      <w:bookmarkStart w:id="233" w:name="_Toc242871587"/>
+      <w:bookmarkStart w:id="234" w:name="_Toc242871775"/>
+      <w:bookmarkStart w:id="235" w:name="_Toc242872963"/>
+      <w:bookmarkStart w:id="236" w:name="_Toc242874467"/>
+      <w:bookmarkStart w:id="237" w:name="_Toc242875965"/>
+      <w:bookmarkStart w:id="238" w:name="_Toc242876930"/>
       <w:r>
         <w:t>4.1 Thời gian thực thi và bộ nhớ Lambda</w:t>
       </w:r>
-      <w:bookmarkEnd w:id="176"/>
-      <w:bookmarkEnd w:id="177"/>
-      <w:bookmarkEnd w:id="178"/>
-      <w:bookmarkEnd w:id="179"/>
-      <w:bookmarkEnd w:id="180"/>
-      <w:bookmarkEnd w:id="181"/>
-      <w:bookmarkEnd w:id="182"/>
+      <w:bookmarkEnd w:id="230"/>
+      <w:bookmarkEnd w:id="231"/>
+      <w:bookmarkEnd w:id="232"/>
+      <w:bookmarkEnd w:id="233"/>
+      <w:bookmarkEnd w:id="234"/>
+      <w:bookmarkEnd w:id="235"/>
+      <w:bookmarkEnd w:id="236"/>
+      <w:bookmarkEnd w:id="237"/>
+      <w:bookmarkEnd w:id="238"/>
     </w:p>
     <w:p>
       <w:pPr>
@@ -18976,7 +19215,7 @@
                     <pic:cNvPicPr/>
                   </pic:nvPicPr>
                   <pic:blipFill>
-                    <a:blip r:embed="rId27"/>
+                    <a:blip r:embed="rId29"/>
                     <a:stretch>
                       <a:fillRect/>
                     </a:stretch>
@@ -19030,24 +19269,28 @@
         <w:pStyle w:val="Heading2"/>
         <w:pageBreakBefore/>
       </w:pPr>
-      <w:bookmarkStart w:id="183" w:name="_Toc242867480"/>
-      <w:bookmarkStart w:id="184" w:name="_Toc242869291"/>
-      <w:bookmarkStart w:id="185" w:name="_Toc242869451"/>
-      <w:bookmarkStart w:id="186" w:name="_Toc242871588"/>
-      <w:bookmarkStart w:id="187" w:name="_Toc242871776"/>
-      <w:bookmarkStart w:id="188" w:name="_Toc242872964"/>
-      <w:bookmarkStart w:id="189" w:name="_Toc242874468"/>
+      <w:bookmarkStart w:id="239" w:name="_Toc242867480"/>
+      <w:bookmarkStart w:id="240" w:name="_Toc242869291"/>
+      <w:bookmarkStart w:id="241" w:name="_Toc242869451"/>
+      <w:bookmarkStart w:id="242" w:name="_Toc242871588"/>
+      <w:bookmarkStart w:id="243" w:name="_Toc242871776"/>
+      <w:bookmarkStart w:id="244" w:name="_Toc242872964"/>
+      <w:bookmarkStart w:id="245" w:name="_Toc242874468"/>
+      <w:bookmarkStart w:id="246" w:name="_Toc242875966"/>
+      <w:bookmarkStart w:id="247" w:name="_Toc242876931"/>
       <w:r>
         <w:lastRenderedPageBreak/>
         <w:t>4.2 Lịch thu thập và thông báo SNS</w:t>
       </w:r>
-      <w:bookmarkEnd w:id="183"/>
-      <w:bookmarkEnd w:id="184"/>
-      <w:bookmarkEnd w:id="185"/>
-      <w:bookmarkEnd w:id="186"/>
-      <w:bookmarkEnd w:id="187"/>
-      <w:bookmarkEnd w:id="188"/>
-      <w:bookmarkEnd w:id="189"/>
+      <w:bookmarkEnd w:id="239"/>
+      <w:bookmarkEnd w:id="240"/>
+      <w:bookmarkEnd w:id="241"/>
+      <w:bookmarkEnd w:id="242"/>
+      <w:bookmarkEnd w:id="243"/>
+      <w:bookmarkEnd w:id="244"/>
+      <w:bookmarkEnd w:id="245"/>
+      <w:bookmarkEnd w:id="246"/>
+      <w:bookmarkEnd w:id="247"/>
     </w:p>
     <w:p>
       <w:pPr>
@@ -19408,23 +19651,27 @@
       <w:pPr>
         <w:pStyle w:val="Heading2"/>
       </w:pPr>
-      <w:bookmarkStart w:id="190" w:name="_Toc242867481"/>
-      <w:bookmarkStart w:id="191" w:name="_Toc242869292"/>
-      <w:bookmarkStart w:id="192" w:name="_Toc242869452"/>
-      <w:bookmarkStart w:id="193" w:name="_Toc242871589"/>
-      <w:bookmarkStart w:id="194" w:name="_Toc242871777"/>
-      <w:bookmarkStart w:id="195" w:name="_Toc242872965"/>
-      <w:bookmarkStart w:id="196" w:name="_Toc242874469"/>
+      <w:bookmarkStart w:id="248" w:name="_Toc242867481"/>
+      <w:bookmarkStart w:id="249" w:name="_Toc242869292"/>
+      <w:bookmarkStart w:id="250" w:name="_Toc242869452"/>
+      <w:bookmarkStart w:id="251" w:name="_Toc242871589"/>
+      <w:bookmarkStart w:id="252" w:name="_Toc242871777"/>
+      <w:bookmarkStart w:id="253" w:name="_Toc242872965"/>
+      <w:bookmarkStart w:id="254" w:name="_Toc242874469"/>
+      <w:bookmarkStart w:id="255" w:name="_Toc242875967"/>
+      <w:bookmarkStart w:id="256" w:name="_Toc242876932"/>
       <w:r>
         <w:t>4.3 Đối chiếu sự nhất quán của chỉ số vận hành</w:t>
       </w:r>
-      <w:bookmarkEnd w:id="190"/>
-      <w:bookmarkEnd w:id="191"/>
-      <w:bookmarkEnd w:id="192"/>
-      <w:bookmarkEnd w:id="193"/>
-      <w:bookmarkEnd w:id="194"/>
-      <w:bookmarkEnd w:id="195"/>
-      <w:bookmarkEnd w:id="196"/>
+      <w:bookmarkEnd w:id="248"/>
+      <w:bookmarkEnd w:id="249"/>
+      <w:bookmarkEnd w:id="250"/>
+      <w:bookmarkEnd w:id="251"/>
+      <w:bookmarkEnd w:id="252"/>
+      <w:bookmarkEnd w:id="253"/>
+      <w:bookmarkEnd w:id="254"/>
+      <w:bookmarkEnd w:id="255"/>
+      <w:bookmarkEnd w:id="256"/>
     </w:p>
     <w:p>
       <w:pPr>
@@ -19787,46 +20034,54 @@
         <w:pageBreakBefore/>
         <w:jc w:val="left"/>
       </w:pPr>
-      <w:bookmarkStart w:id="197" w:name="_Toc242867482"/>
-      <w:bookmarkStart w:id="198" w:name="_Toc242869293"/>
-      <w:bookmarkStart w:id="199" w:name="_Toc242869453"/>
-      <w:bookmarkStart w:id="200" w:name="_Toc242871590"/>
-      <w:bookmarkStart w:id="201" w:name="_Toc242871778"/>
-      <w:bookmarkStart w:id="202" w:name="_Toc242872966"/>
-      <w:bookmarkStart w:id="203" w:name="_Toc242874470"/>
+      <w:bookmarkStart w:id="257" w:name="_Toc242867482"/>
+      <w:bookmarkStart w:id="258" w:name="_Toc242869293"/>
+      <w:bookmarkStart w:id="259" w:name="_Toc242869453"/>
+      <w:bookmarkStart w:id="260" w:name="_Toc242871590"/>
+      <w:bookmarkStart w:id="261" w:name="_Toc242871778"/>
+      <w:bookmarkStart w:id="262" w:name="_Toc242872966"/>
+      <w:bookmarkStart w:id="263" w:name="_Toc242874470"/>
+      <w:bookmarkStart w:id="264" w:name="_Toc242875968"/>
+      <w:bookmarkStart w:id="265" w:name="_Toc242876933"/>
       <w:r>
         <w:lastRenderedPageBreak/>
         <w:t>Chương 5 Phân tích truy vấn và sử dụng tài nguyên</w:t>
       </w:r>
-      <w:bookmarkEnd w:id="197"/>
-      <w:bookmarkEnd w:id="198"/>
-      <w:bookmarkEnd w:id="199"/>
-      <w:bookmarkEnd w:id="200"/>
-      <w:bookmarkEnd w:id="201"/>
-      <w:bookmarkEnd w:id="202"/>
-      <w:bookmarkEnd w:id="203"/>
+      <w:bookmarkEnd w:id="257"/>
+      <w:bookmarkEnd w:id="258"/>
+      <w:bookmarkEnd w:id="259"/>
+      <w:bookmarkEnd w:id="260"/>
+      <w:bookmarkEnd w:id="261"/>
+      <w:bookmarkEnd w:id="262"/>
+      <w:bookmarkEnd w:id="263"/>
+      <w:bookmarkEnd w:id="264"/>
+      <w:bookmarkEnd w:id="265"/>
     </w:p>
     <w:p>
       <w:pPr>
         <w:pStyle w:val="Heading2"/>
       </w:pPr>
-      <w:bookmarkStart w:id="204" w:name="_Toc242867483"/>
-      <w:bookmarkStart w:id="205" w:name="_Toc242869294"/>
-      <w:bookmarkStart w:id="206" w:name="_Toc242869454"/>
-      <w:bookmarkStart w:id="207" w:name="_Toc242871591"/>
-      <w:bookmarkStart w:id="208" w:name="_Toc242871779"/>
-      <w:bookmarkStart w:id="209" w:name="_Toc242872967"/>
-      <w:bookmarkStart w:id="210" w:name="_Toc242874471"/>
+      <w:bookmarkStart w:id="266" w:name="_Toc242867483"/>
+      <w:bookmarkStart w:id="267" w:name="_Toc242869294"/>
+      <w:bookmarkStart w:id="268" w:name="_Toc242869454"/>
+      <w:bookmarkStart w:id="269" w:name="_Toc242871591"/>
+      <w:bookmarkStart w:id="270" w:name="_Toc242871779"/>
+      <w:bookmarkStart w:id="271" w:name="_Toc242872967"/>
+      <w:bookmarkStart w:id="272" w:name="_Toc242874471"/>
+      <w:bookmarkStart w:id="273" w:name="_Toc242875969"/>
+      <w:bookmarkStart w:id="274" w:name="_Toc242876934"/>
       <w:r>
         <w:t>5.1 Đối chứng hiệu quả lọc phân vùng</w:t>
       </w:r>
-      <w:bookmarkEnd w:id="204"/>
-      <w:bookmarkEnd w:id="205"/>
-      <w:bookmarkEnd w:id="206"/>
-      <w:bookmarkEnd w:id="207"/>
-      <w:bookmarkEnd w:id="208"/>
-      <w:bookmarkEnd w:id="209"/>
-      <w:bookmarkEnd w:id="210"/>
+      <w:bookmarkEnd w:id="266"/>
+      <w:bookmarkEnd w:id="267"/>
+      <w:bookmarkEnd w:id="268"/>
+      <w:bookmarkEnd w:id="269"/>
+      <w:bookmarkEnd w:id="270"/>
+      <w:bookmarkEnd w:id="271"/>
+      <w:bookmarkEnd w:id="272"/>
+      <w:bookmarkEnd w:id="273"/>
+      <w:bookmarkEnd w:id="274"/>
     </w:p>
     <w:p>
       <w:pPr>
@@ -20190,7 +20445,7 @@
                     <pic:cNvPicPr/>
                   </pic:nvPicPr>
                   <pic:blipFill>
-                    <a:blip r:embed="rId28"/>
+                    <a:blip r:embed="rId30"/>
                     <a:stretch>
                       <a:fillRect/>
                     </a:stretch>
@@ -20244,24 +20499,28 @@
         <w:pStyle w:val="Heading2"/>
         <w:pageBreakBefore/>
       </w:pPr>
-      <w:bookmarkStart w:id="211" w:name="_Toc242867484"/>
-      <w:bookmarkStart w:id="212" w:name="_Toc242869295"/>
-      <w:bookmarkStart w:id="213" w:name="_Toc242869455"/>
-      <w:bookmarkStart w:id="214" w:name="_Toc242871592"/>
-      <w:bookmarkStart w:id="215" w:name="_Toc242871780"/>
-      <w:bookmarkStart w:id="216" w:name="_Toc242872968"/>
-      <w:bookmarkStart w:id="217" w:name="_Toc242874472"/>
+      <w:bookmarkStart w:id="275" w:name="_Toc242867484"/>
+      <w:bookmarkStart w:id="276" w:name="_Toc242869295"/>
+      <w:bookmarkStart w:id="277" w:name="_Toc242869455"/>
+      <w:bookmarkStart w:id="278" w:name="_Toc242871592"/>
+      <w:bookmarkStart w:id="279" w:name="_Toc242871780"/>
+      <w:bookmarkStart w:id="280" w:name="_Toc242872968"/>
+      <w:bookmarkStart w:id="281" w:name="_Toc242874472"/>
+      <w:bookmarkStart w:id="282" w:name="_Toc242875970"/>
+      <w:bookmarkStart w:id="283" w:name="_Toc242876935"/>
       <w:r>
         <w:lastRenderedPageBreak/>
         <w:t>5.2 Hai mươi bốn truy vấn phân tích mới</w:t>
       </w:r>
-      <w:bookmarkEnd w:id="211"/>
-      <w:bookmarkEnd w:id="212"/>
-      <w:bookmarkEnd w:id="213"/>
-      <w:bookmarkEnd w:id="214"/>
-      <w:bookmarkEnd w:id="215"/>
-      <w:bookmarkEnd w:id="216"/>
-      <w:bookmarkEnd w:id="217"/>
+      <w:bookmarkEnd w:id="275"/>
+      <w:bookmarkEnd w:id="276"/>
+      <w:bookmarkEnd w:id="277"/>
+      <w:bookmarkEnd w:id="278"/>
+      <w:bookmarkEnd w:id="279"/>
+      <w:bookmarkEnd w:id="280"/>
+      <w:bookmarkEnd w:id="281"/>
+      <w:bookmarkEnd w:id="282"/>
+      <w:bookmarkEnd w:id="283"/>
     </w:p>
     <w:p>
       <w:pPr>
@@ -21580,7 +21839,7 @@
                     <pic:cNvPicPr/>
                   </pic:nvPicPr>
                   <pic:blipFill>
-                    <a:blip r:embed="rId29"/>
+                    <a:blip r:embed="rId31"/>
                     <a:stretch>
                       <a:fillRect/>
                     </a:stretch>
@@ -21625,23 +21884,27 @@
       <w:pPr>
         <w:pStyle w:val="Heading2"/>
       </w:pPr>
-      <w:bookmarkStart w:id="218" w:name="_Toc242867485"/>
-      <w:bookmarkStart w:id="219" w:name="_Toc242869296"/>
-      <w:bookmarkStart w:id="220" w:name="_Toc242869456"/>
-      <w:bookmarkStart w:id="221" w:name="_Toc242871593"/>
-      <w:bookmarkStart w:id="222" w:name="_Toc242871781"/>
-      <w:bookmarkStart w:id="223" w:name="_Toc242872969"/>
-      <w:bookmarkStart w:id="224" w:name="_Toc242874473"/>
+      <w:bookmarkStart w:id="284" w:name="_Toc242867485"/>
+      <w:bookmarkStart w:id="285" w:name="_Toc242869296"/>
+      <w:bookmarkStart w:id="286" w:name="_Toc242869456"/>
+      <w:bookmarkStart w:id="287" w:name="_Toc242871593"/>
+      <w:bookmarkStart w:id="288" w:name="_Toc242871781"/>
+      <w:bookmarkStart w:id="289" w:name="_Toc242872969"/>
+      <w:bookmarkStart w:id="290" w:name="_Toc242874473"/>
+      <w:bookmarkStart w:id="291" w:name="_Toc242875971"/>
+      <w:bookmarkStart w:id="292" w:name="_Toc242876936"/>
       <w:r>
         <w:t>5.3 Lịch sử truy vấn và phạm vi lỗi</w:t>
       </w:r>
-      <w:bookmarkEnd w:id="218"/>
-      <w:bookmarkEnd w:id="219"/>
-      <w:bookmarkEnd w:id="220"/>
-      <w:bookmarkEnd w:id="221"/>
-      <w:bookmarkEnd w:id="222"/>
-      <w:bookmarkEnd w:id="223"/>
-      <w:bookmarkEnd w:id="224"/>
+      <w:bookmarkEnd w:id="284"/>
+      <w:bookmarkEnd w:id="285"/>
+      <w:bookmarkEnd w:id="286"/>
+      <w:bookmarkEnd w:id="287"/>
+      <w:bookmarkEnd w:id="288"/>
+      <w:bookmarkEnd w:id="289"/>
+      <w:bookmarkEnd w:id="290"/>
+      <w:bookmarkEnd w:id="291"/>
+      <w:bookmarkEnd w:id="292"/>
     </w:p>
     <w:p>
       <w:pPr>
@@ -21935,24 +22198,28 @@
         <w:pStyle w:val="Heading2"/>
         <w:pageBreakBefore/>
       </w:pPr>
-      <w:bookmarkStart w:id="225" w:name="_Toc242867486"/>
-      <w:bookmarkStart w:id="226" w:name="_Toc242869297"/>
-      <w:bookmarkStart w:id="227" w:name="_Toc242869457"/>
-      <w:bookmarkStart w:id="228" w:name="_Toc242871594"/>
-      <w:bookmarkStart w:id="229" w:name="_Toc242871782"/>
-      <w:bookmarkStart w:id="230" w:name="_Toc242872970"/>
-      <w:bookmarkStart w:id="231" w:name="_Toc242874474"/>
+      <w:bookmarkStart w:id="293" w:name="_Toc242867486"/>
+      <w:bookmarkStart w:id="294" w:name="_Toc242869297"/>
+      <w:bookmarkStart w:id="295" w:name="_Toc242869457"/>
+      <w:bookmarkStart w:id="296" w:name="_Toc242871594"/>
+      <w:bookmarkStart w:id="297" w:name="_Toc242871782"/>
+      <w:bookmarkStart w:id="298" w:name="_Toc242872970"/>
+      <w:bookmarkStart w:id="299" w:name="_Toc242874474"/>
+      <w:bookmarkStart w:id="300" w:name="_Toc242875972"/>
+      <w:bookmarkStart w:id="301" w:name="_Toc242876937"/>
       <w:r>
         <w:lastRenderedPageBreak/>
         <w:t>5.4 Chi phí từ Cost Explorer</w:t>
       </w:r>
-      <w:bookmarkEnd w:id="225"/>
-      <w:bookmarkEnd w:id="226"/>
-      <w:bookmarkEnd w:id="227"/>
-      <w:bookmarkEnd w:id="228"/>
-      <w:bookmarkEnd w:id="229"/>
-      <w:bookmarkEnd w:id="230"/>
-      <w:bookmarkEnd w:id="231"/>
+      <w:bookmarkEnd w:id="293"/>
+      <w:bookmarkEnd w:id="294"/>
+      <w:bookmarkEnd w:id="295"/>
+      <w:bookmarkEnd w:id="296"/>
+      <w:bookmarkEnd w:id="297"/>
+      <w:bookmarkEnd w:id="298"/>
+      <w:bookmarkEnd w:id="299"/>
+      <w:bookmarkEnd w:id="300"/>
+      <w:bookmarkEnd w:id="301"/>
     </w:p>
     <w:p>
       <w:pPr>
@@ -22256,46 +22523,54 @@
         <w:pageBreakBefore/>
         <w:jc w:val="left"/>
       </w:pPr>
-      <w:bookmarkStart w:id="232" w:name="_Toc242867487"/>
-      <w:bookmarkStart w:id="233" w:name="_Toc242869298"/>
-      <w:bookmarkStart w:id="234" w:name="_Toc242869458"/>
-      <w:bookmarkStart w:id="235" w:name="_Toc242871595"/>
-      <w:bookmarkStart w:id="236" w:name="_Toc242871783"/>
-      <w:bookmarkStart w:id="237" w:name="_Toc242872971"/>
-      <w:bookmarkStart w:id="238" w:name="_Toc242874475"/>
+      <w:bookmarkStart w:id="302" w:name="_Toc242867487"/>
+      <w:bookmarkStart w:id="303" w:name="_Toc242869298"/>
+      <w:bookmarkStart w:id="304" w:name="_Toc242869458"/>
+      <w:bookmarkStart w:id="305" w:name="_Toc242871595"/>
+      <w:bookmarkStart w:id="306" w:name="_Toc242871783"/>
+      <w:bookmarkStart w:id="307" w:name="_Toc242872971"/>
+      <w:bookmarkStart w:id="308" w:name="_Toc242874475"/>
+      <w:bookmarkStart w:id="309" w:name="_Toc242875973"/>
+      <w:bookmarkStart w:id="310" w:name="_Toc242876938"/>
       <w:r>
         <w:lastRenderedPageBreak/>
         <w:t>Chương 6 Tổng hợp kết quả Tuần 2</w:t>
       </w:r>
-      <w:bookmarkEnd w:id="232"/>
-      <w:bookmarkEnd w:id="233"/>
-      <w:bookmarkEnd w:id="234"/>
-      <w:bookmarkEnd w:id="235"/>
-      <w:bookmarkEnd w:id="236"/>
-      <w:bookmarkEnd w:id="237"/>
-      <w:bookmarkEnd w:id="238"/>
+      <w:bookmarkEnd w:id="302"/>
+      <w:bookmarkEnd w:id="303"/>
+      <w:bookmarkEnd w:id="304"/>
+      <w:bookmarkEnd w:id="305"/>
+      <w:bookmarkEnd w:id="306"/>
+      <w:bookmarkEnd w:id="307"/>
+      <w:bookmarkEnd w:id="308"/>
+      <w:bookmarkEnd w:id="309"/>
+      <w:bookmarkEnd w:id="310"/>
     </w:p>
     <w:p>
       <w:pPr>
         <w:pStyle w:val="Heading2"/>
       </w:pPr>
-      <w:bookmarkStart w:id="239" w:name="_Toc242867488"/>
-      <w:bookmarkStart w:id="240" w:name="_Toc242869299"/>
-      <w:bookmarkStart w:id="241" w:name="_Toc242869459"/>
-      <w:bookmarkStart w:id="242" w:name="_Toc242871596"/>
-      <w:bookmarkStart w:id="243" w:name="_Toc242871784"/>
-      <w:bookmarkStart w:id="244" w:name="_Toc242872972"/>
-      <w:bookmarkStart w:id="245" w:name="_Toc242874476"/>
+      <w:bookmarkStart w:id="311" w:name="_Toc242867488"/>
+      <w:bookmarkStart w:id="312" w:name="_Toc242869299"/>
+      <w:bookmarkStart w:id="313" w:name="_Toc242869459"/>
+      <w:bookmarkStart w:id="314" w:name="_Toc242871596"/>
+      <w:bookmarkStart w:id="315" w:name="_Toc242871784"/>
+      <w:bookmarkStart w:id="316" w:name="_Toc242872972"/>
+      <w:bookmarkStart w:id="317" w:name="_Toc242874476"/>
+      <w:bookmarkStart w:id="318" w:name="_Toc242875974"/>
+      <w:bookmarkStart w:id="319" w:name="_Toc242876939"/>
       <w:r>
         <w:t>6.1 Sản phẩm dữ liệu và phân tích</w:t>
       </w:r>
-      <w:bookmarkEnd w:id="239"/>
-      <w:bookmarkEnd w:id="240"/>
-      <w:bookmarkEnd w:id="241"/>
-      <w:bookmarkEnd w:id="242"/>
-      <w:bookmarkEnd w:id="243"/>
-      <w:bookmarkEnd w:id="244"/>
-      <w:bookmarkEnd w:id="245"/>
+      <w:bookmarkEnd w:id="311"/>
+      <w:bookmarkEnd w:id="312"/>
+      <w:bookmarkEnd w:id="313"/>
+      <w:bookmarkEnd w:id="314"/>
+      <w:bookmarkEnd w:id="315"/>
+      <w:bookmarkEnd w:id="316"/>
+      <w:bookmarkEnd w:id="317"/>
+      <w:bookmarkEnd w:id="318"/>
+      <w:bookmarkEnd w:id="319"/>
     </w:p>
     <w:p>
       <w:pPr>
@@ -22583,7 +22858,7 @@
               <w:rPr>
                 <w:sz w:val="22"/>
               </w:rPr>
-              <w:t>16 biểu đồ được dựng từ các CSV tương ứng; cùng dữ liệu trong Excel và báo cáo.</w:t>
+              <w:t>18 biểu đồ được dựng từ các CSV tương ứng; cùng dữ liệu trong Excel và báo cáo.</w:t>
             </w:r>
           </w:p>
         </w:tc>
@@ -22635,23 +22910,27 @@
       <w:pPr>
         <w:pStyle w:val="Heading2"/>
       </w:pPr>
-      <w:bookmarkStart w:id="246" w:name="_Toc242867489"/>
-      <w:bookmarkStart w:id="247" w:name="_Toc242869300"/>
-      <w:bookmarkStart w:id="248" w:name="_Toc242869460"/>
-      <w:bookmarkStart w:id="249" w:name="_Toc242871597"/>
-      <w:bookmarkStart w:id="250" w:name="_Toc242871785"/>
-      <w:bookmarkStart w:id="251" w:name="_Toc242872973"/>
-      <w:bookmarkStart w:id="252" w:name="_Toc242874477"/>
+      <w:bookmarkStart w:id="320" w:name="_Toc242867489"/>
+      <w:bookmarkStart w:id="321" w:name="_Toc242869300"/>
+      <w:bookmarkStart w:id="322" w:name="_Toc242869460"/>
+      <w:bookmarkStart w:id="323" w:name="_Toc242871597"/>
+      <w:bookmarkStart w:id="324" w:name="_Toc242871785"/>
+      <w:bookmarkStart w:id="325" w:name="_Toc242872973"/>
+      <w:bookmarkStart w:id="326" w:name="_Toc242874477"/>
+      <w:bookmarkStart w:id="327" w:name="_Toc242875975"/>
+      <w:bookmarkStart w:id="328" w:name="_Toc242876940"/>
       <w:r>
         <w:t>6.2 Kết luận trong phạm vi mẫu đã thu thập</w:t>
       </w:r>
-      <w:bookmarkEnd w:id="246"/>
-      <w:bookmarkEnd w:id="247"/>
-      <w:bookmarkEnd w:id="248"/>
-      <w:bookmarkEnd w:id="249"/>
-      <w:bookmarkEnd w:id="250"/>
-      <w:bookmarkEnd w:id="251"/>
-      <w:bookmarkEnd w:id="252"/>
+      <w:bookmarkEnd w:id="320"/>
+      <w:bookmarkEnd w:id="321"/>
+      <w:bookmarkEnd w:id="322"/>
+      <w:bookmarkEnd w:id="323"/>
+      <w:bookmarkEnd w:id="324"/>
+      <w:bookmarkEnd w:id="325"/>
+      <w:bookmarkEnd w:id="326"/>
+      <w:bookmarkEnd w:id="327"/>
+      <w:bookmarkEnd w:id="328"/>
     </w:p>
     <w:p>
       <w:pPr>
@@ -22681,7 +22960,7 @@
       </w:r>
     </w:p>
     <w:sectPr>
-      <w:footerReference w:type="default" r:id="rId30"/>
+      <w:footerReference w:type="default" r:id="rId32"/>
       <w:pgSz w:w="12240" w:h="15840"/>
       <w:pgMar w:top="1224" w:right="1080" w:bottom="1080" w:left="1224" w:header="432" w:footer="576" w:gutter="0"/>
       <w:pgNumType w:start="1"/>

</xml_diff>